<commit_message>
HA submission: fix Figure 2 color collision, p_tost rounding, citation superscript, scope framing
Co-Authored-By: Tatsuki Onishi <bougtoir@gmail.com>
</commit_message>
<xml_diff>
--- a/medical_accident_its_analysis/manuscript/ha_manuscript_en.docx
+++ b/medical_accident_its_analysis/manuscript/ha_manuscript_en.docx
@@ -37,7 +37,7 @@
           <w:rFonts w:ascii="Times New Roman" w:hAnsi="Times New Roman"/>
           <w:sz w:val="24"/>
         </w:rPr>
-        <w:t>Specialty maldistribution in Japan has raised concern that malpractice litigation drives physicians from high-risk specialties. We examined whether specialty-level litigation risk predicts later physician or hospital decline. Using national primary data for 12 specialties (2008–2024), we measured exposure as closed malpractice claims per 1,000 physicians (rate, not count) and regressed biennial log-change in physicians and hospitals on the lagged litigation rate in a panel with specialty and wave fixed effects, cluster-robust standard errors, small-cluster t(G-1) inference, and two one-sided equivalence (TOST) tests. The workforce grew in 11 of 12 specialties; general surgery, which changed by -2.3%, was the exception. Litigation rate was not associated with physician growth (coefficient -0.0009; 95% CI -0.0043 to +0.0025; p=0.56) or hospital growth (p=0.90). A one-SD higher rate changed physician growth by less than ±1% (TOST p=0.023) and less than ±2% (p=0.000); hospital growth was within ±2% (p=0.002) but not the stricter ±1% margin (p=0.059). Sensitivity analyses were unchanged and per-specialty rank correlations were mostly positive (10/12) and none significant. Specialty-level litigation risk in Japan is not associated with workforce decline and is statistically equivalent to a null effect for physicians. These findings, drawn from one health system, suggest that structural workforce incentives, rather than litigation-avoidance messaging, warrant analytical attention.</w:t>
+        <w:t>Specialty maldistribution in Japan has raised concern that malpractice litigation drives physicians from high-risk specialties. We examined whether specialty-level litigation risk predicts later physician or hospital decline. Using national primary data for 12 specialties (2008–2024), we measured exposure as closed malpractice claims per 1,000 physicians (rate, not count) and regressed biennial log-change in physicians and hospitals on the lagged litigation rate in a panel with specialty and wave fixed effects, cluster-robust standard errors, small-cluster t(G-1) inference, and two one-sided equivalence (TOST) tests. The workforce grew in 11 of 12 specialties; general surgery, which changed by -2.3%, was the exception. Litigation rate was not associated with physician growth (coefficient -0.0009; 95% CI -0.0043 to +0.0025; p=0.56) or hospital growth (p=0.90). A one-SD higher rate changed physician growth by less than ±1% (TOST p=0.023; less than ±2%, p=&lt;0.001; hospital growth was within ±2% (p=0.002) but not the stricter ±1% margin (p=0.059). Sensitivity analyses were unchanged and per-specialty rank correlations were mostly positive (10/12) and none significant. Specialty-level litigation risk in Japan is not associated with workforce decline and is statistically equivalent to a null effect for physicians. These findings, drawn from one health system, suggest that structural workforce incentives, rather than litigation-avoidance messaging, warrant analytical attention.</w:t>
       </w:r>
     </w:p>
     <w:p>
@@ -89,7 +89,7 @@
       <w:r>
         <w:rPr>
           <w:rFonts w:ascii="Times New Roman" w:hAnsi="Times New Roman"/>
-          <w:sz w:val="22"/>
+          <w:vertAlign w:val="superscript"/>
         </w:rPr>
         <w:t>[1]</w:t>
       </w:r>
@@ -105,7 +105,7 @@
       <w:r>
         <w:rPr>
           <w:rFonts w:ascii="Times New Roman" w:hAnsi="Times New Roman"/>
-          <w:sz w:val="22"/>
+          <w:vertAlign w:val="superscript"/>
         </w:rPr>
         <w:t>[2-3]</w:t>
       </w:r>
@@ -130,7 +130,7 @@
           <w:i w:val="0"/>
           <w:sz w:val="24"/>
         </w:rPr>
-        <w:t>Prior work in this area often related raw annual counts of incidents or lawsuits to raw counts of physicians or facilities. Two features make such designs prone to spurious association. First, counts are not adjusted for specialty size: a larger specialty mechanically accumulates more procedures, more claims and more physicians, so counts co-move without any behavioural mechanism. Second, the physician census is collected only biennially; interpolating it to an annual series and analysing it as if each year were an independent observation inflates the degrees of freedom of any lag-based method.</w:t>
+        <w:t>Prior work in this area often related raw annual counts of incidents or lawsuits to raw counts of physicians or facilities. Two features make such designs prone to spurious association. First, counts are not adjusted for specialty size: a larger specialty mechanically accumulates more procedures, more claims and more physicians, so counts co-move without any behavioural mechanism. Second, the physician census is collected only biennially; interpolating it to an annual series and analysing it as if each year were an independent observation inflates the degrees of freedom of any lag-based method. These pitfalls are not unique to malpractice research; they arise whenever administrative counts are used to infer behavioural responses in healthcare organisations. The litigation-workforce question is therefore also a test case for a transparent, reproducible health-analytics workflow.</w:t>
       </w:r>
     </w:p>
     <w:p>
@@ -149,7 +149,7 @@
       <w:r>
         <w:rPr>
           <w:rFonts w:ascii="Times New Roman" w:hAnsi="Times New Roman"/>
-          <w:sz w:val="22"/>
+          <w:vertAlign w:val="superscript"/>
         </w:rPr>
         <w:t>[4-5]</w:t>
       </w:r>
@@ -165,7 +165,7 @@
       <w:r>
         <w:rPr>
           <w:rFonts w:ascii="Times New Roman" w:hAnsi="Times New Roman"/>
-          <w:sz w:val="22"/>
+          <w:vertAlign w:val="superscript"/>
         </w:rPr>
         <w:t>[6]</w:t>
       </w:r>
@@ -210,7 +210,7 @@
       <w:r>
         <w:rPr>
           <w:rFonts w:ascii="Times New Roman" w:hAnsi="Times New Roman"/>
-          <w:sz w:val="22"/>
+          <w:vertAlign w:val="superscript"/>
         </w:rPr>
         <w:t>[7]</w:t>
       </w:r>
@@ -226,7 +226,7 @@
       <w:r>
         <w:rPr>
           <w:rFonts w:ascii="Times New Roman" w:hAnsi="Times New Roman"/>
-          <w:sz w:val="22"/>
+          <w:vertAlign w:val="superscript"/>
         </w:rPr>
         <w:t>[8]</w:t>
       </w:r>
@@ -242,7 +242,7 @@
       <w:r>
         <w:rPr>
           <w:rFonts w:ascii="Times New Roman" w:hAnsi="Times New Roman"/>
-          <w:sz w:val="22"/>
+          <w:vertAlign w:val="superscript"/>
         </w:rPr>
         <w:t>[9]</w:t>
       </w:r>
@@ -258,7 +258,7 @@
       <w:r>
         <w:rPr>
           <w:rFonts w:ascii="Times New Roman" w:hAnsi="Times New Roman"/>
-          <w:sz w:val="22"/>
+          <w:vertAlign w:val="superscript"/>
         </w:rPr>
         <w:t>[10]</w:t>
       </w:r>
@@ -274,7 +274,7 @@
       <w:r>
         <w:rPr>
           <w:rFonts w:ascii="Times New Roman" w:hAnsi="Times New Roman"/>
-          <w:sz w:val="22"/>
+          <w:vertAlign w:val="superscript"/>
         </w:rPr>
         <w:t>[11]</w:t>
       </w:r>
@@ -290,7 +290,7 @@
       <w:r>
         <w:rPr>
           <w:rFonts w:ascii="Times New Roman" w:hAnsi="Times New Roman"/>
-          <w:sz w:val="22"/>
+          <w:vertAlign w:val="superscript"/>
         </w:rPr>
         <w:t>[12]</w:t>
       </w:r>
@@ -320,7 +320,7 @@
       <w:r>
         <w:rPr>
           <w:rFonts w:ascii="Times New Roman" w:hAnsi="Times New Roman"/>
-          <w:sz w:val="22"/>
+          <w:vertAlign w:val="superscript"/>
         </w:rPr>
         <w:t>[9]</w:t>
       </w:r>
@@ -336,7 +336,7 @@
       <w:r>
         <w:rPr>
           <w:rFonts w:ascii="Times New Roman" w:hAnsi="Times New Roman"/>
-          <w:sz w:val="22"/>
+          <w:vertAlign w:val="superscript"/>
         </w:rPr>
         <w:t>[13]</w:t>
       </w:r>
@@ -378,7 +378,7 @@
       <w:r>
         <w:rPr>
           <w:rFonts w:ascii="Times New Roman" w:hAnsi="Times New Roman"/>
-          <w:sz w:val="22"/>
+          <w:vertAlign w:val="superscript"/>
         </w:rPr>
         <w:t>[14]</w:t>
       </w:r>
@@ -408,7 +408,7 @@
       <w:r>
         <w:rPr>
           <w:rFonts w:ascii="Times New Roman" w:hAnsi="Times New Roman"/>
-          <w:sz w:val="22"/>
+          <w:vertAlign w:val="superscript"/>
         </w:rPr>
         <w:t>[15]</w:t>
       </w:r>
@@ -424,7 +424,7 @@
       <w:r>
         <w:rPr>
           <w:rFonts w:ascii="Times New Roman" w:hAnsi="Times New Roman"/>
-          <w:sz w:val="22"/>
+          <w:vertAlign w:val="superscript"/>
         </w:rPr>
         <w:t>[4-5]</w:t>
       </w:r>
@@ -440,7 +440,7 @@
       <w:r>
         <w:rPr>
           <w:rFonts w:ascii="Times New Roman" w:hAnsi="Times New Roman"/>
-          <w:sz w:val="22"/>
+          <w:vertAlign w:val="superscript"/>
         </w:rPr>
         <w:t>[6]</w:t>
       </w:r>
@@ -451,7 +451,7 @@
           <w:i w:val="0"/>
           <w:sz w:val="24"/>
         </w:rPr>
-        <w:t xml:space="preserve"> Sensitivity analyses repeated the models on (i) the annual hospital series, (ii) a linearly interpolated annual physician series (with degrees of freedom governed by the measured waves, not the interpolated n), (iii) raw counts instead of rates, (iv) the annual hospital series 2016-2024 additionally controlling for the JMSR report rate (reports per 1,000 physicians), and (v) the annual hospital series 2009–2018 additionally controlling for total Nikkei Telecom article counts. Because the article-count series is a national yearly variable, it is collinear with full wave fixed effects; this sensitivity therefore uses specialty fixed effects plus a linear time trend rather than wave dummies. The JOCS-CP indicator and all sensitivity models are exploratory; we report raw p-values and Holm step-down adjusted p-values for this family in Supplementary Table 5. Analyses used Python (statsmodels); code and data are openly available at https://github.com/bougtoir/medical-accident-its-analysis.</w:t>
+        <w:t xml:space="preserve"> Sensitivity analyses repeated the models on (i) the annual hospital series, (ii) a linearly interpolated annual physician series (with degrees of freedom governed by the measured waves, not the interpolated n), (iii) raw counts instead of rates, (iv) the annual hospital series 2016-2024 additionally controlling for the JMSR report rate (reports per 1,000 physicians), and (v) the annual hospital series 2009–2018 additionally controlling for total Nikkei Telecom article counts. Because the article-count series is a national yearly variable, it is collinear with full wave fixed effects; this sensitivity therefore uses specialty fixed effects plus a linear time trend rather than wave dummies. The JOCS-CP indicator and all sensitivity models are exploratory; we report raw p-values and Holm step-down adjusted p-values for this family. Analyses used Python (statsmodels); code and data are openly available at https://github.com/bougtoir/medical-accident-its-analysis.</w:t>
       </w:r>
     </w:p>
     <w:p>
@@ -2892,7 +2892,7 @@
       <w:r>
         <w:rPr>
           <w:rFonts w:ascii="Times New Roman" w:hAnsi="Times New Roman"/>
-          <w:sz w:val="22"/>
+          <w:vertAlign w:val="superscript"/>
         </w:rPr>
         <w:t>[13]</w:t>
       </w:r>
@@ -2922,7 +2922,7 @@
       <w:r>
         <w:rPr>
           <w:rFonts w:ascii="Times New Roman" w:hAnsi="Times New Roman"/>
-          <w:sz w:val="22"/>
+          <w:vertAlign w:val="superscript"/>
         </w:rPr>
         <w:t>[12]</w:t>
       </w:r>
@@ -2933,7 +2933,7 @@
           <w:i w:val="0"/>
           <w:sz w:val="24"/>
         </w:rPr>
-        <w:t xml:space="preserve"> Total annual article counts (keywords: 医療事故 + 医療過誤) and total litigation counts were correlated (Pearson r=0.81), consistent with the public salience of high-litigation years; however, within the annual hospital panel the lagged litigation rate and the media-count series were only weakly correlated. A model of annual hospital growth for 2009-2018 that included both the lagged litigation rate and the lagged article count (per 1,000 articles) left the litigation coefficient essentially unchanged and the media term was not associated with hospital growth (p=0.21; Supplementary Table 4). Media coverage therefore does not account for the null litigation effect either.</w:t>
+        <w:t xml:space="preserve"> Total annual article counts (keywords: 医療事故 + 医療過誤) and total litigation counts were correlated (Pearson r=0.81), consistent with the public salience of high-litigation years; however, within the annual hospital panel the lagged litigation rate and the media-count series were only weakly correlated. A model of annual hospital growth for 2009-2018 that included both the lagged litigation rate and the lagged article count (per 1,000 articles) left the litigation coefficient essentially unchanged and the media term was not associated with hospital growth (p=0.21; Supplementary Table 4). Media coverage therefore does not account for the null litigation effect either. Holm step-down adjusted p-values for the exploratory sensitivity family are reported in Supplementary Table 5.</w:t>
       </w:r>
     </w:p>
     <w:p>
@@ -3006,7 +3006,7 @@
       <w:r>
         <w:rPr>
           <w:rFonts w:ascii="Times New Roman" w:hAnsi="Times New Roman"/>
-          <w:sz w:val="22"/>
+          <w:vertAlign w:val="superscript"/>
         </w:rPr>
         <w:t>[16]</w:t>
       </w:r>
@@ -3022,7 +3022,7 @@
       <w:r>
         <w:rPr>
           <w:rFonts w:ascii="Times New Roman" w:hAnsi="Times New Roman"/>
-          <w:sz w:val="22"/>
+          <w:vertAlign w:val="superscript"/>
         </w:rPr>
         <w:t>[17]</w:t>
       </w:r>
@@ -3038,7 +3038,7 @@
       <w:r>
         <w:rPr>
           <w:rFonts w:ascii="Times New Roman" w:hAnsi="Times New Roman"/>
-          <w:sz w:val="22"/>
+          <w:vertAlign w:val="superscript"/>
         </w:rPr>
         <w:t>[18]</w:t>
       </w:r>
@@ -3068,7 +3068,7 @@
       <w:r>
         <w:rPr>
           <w:rFonts w:ascii="Times New Roman" w:hAnsi="Times New Roman"/>
-          <w:sz w:val="22"/>
+          <w:vertAlign w:val="superscript"/>
         </w:rPr>
         <w:t>[19]</w:t>
       </w:r>
@@ -3084,7 +3084,7 @@
       <w:r>
         <w:rPr>
           <w:rFonts w:ascii="Times New Roman" w:hAnsi="Times New Roman"/>
-          <w:sz w:val="22"/>
+          <w:vertAlign w:val="superscript"/>
         </w:rPr>
         <w:t>[20]</w:t>
       </w:r>
@@ -3114,7 +3114,7 @@
       <w:r>
         <w:rPr>
           <w:rFonts w:ascii="Times New Roman" w:hAnsi="Times New Roman"/>
-          <w:sz w:val="22"/>
+          <w:vertAlign w:val="superscript"/>
         </w:rPr>
         <w:t>[21]</w:t>
       </w:r>
@@ -3144,7 +3144,7 @@
       <w:r>
         <w:rPr>
           <w:rFonts w:ascii="Times New Roman" w:hAnsi="Times New Roman"/>
-          <w:sz w:val="22"/>
+          <w:vertAlign w:val="superscript"/>
         </w:rPr>
         <w:t>[22]</w:t>
       </w:r>
@@ -3160,7 +3160,7 @@
       <w:r>
         <w:rPr>
           <w:rFonts w:ascii="Times New Roman" w:hAnsi="Times New Roman"/>
-          <w:sz w:val="22"/>
+          <w:vertAlign w:val="superscript"/>
         </w:rPr>
         <w:t>[23]</w:t>
       </w:r>
@@ -3190,7 +3190,7 @@
       <w:r>
         <w:rPr>
           <w:rFonts w:ascii="Times New Roman" w:hAnsi="Times New Roman"/>
-          <w:sz w:val="22"/>
+          <w:vertAlign w:val="superscript"/>
         </w:rPr>
         <w:t>[24]</w:t>
       </w:r>
@@ -3206,7 +3206,7 @@
       <w:r>
         <w:rPr>
           <w:rFonts w:ascii="Times New Roman" w:hAnsi="Times New Roman"/>
-          <w:sz w:val="22"/>
+          <w:vertAlign w:val="superscript"/>
         </w:rPr>
         <w:t>[25]</w:t>
       </w:r>
@@ -3250,7 +3250,7 @@
       <w:r>
         <w:rPr>
           <w:rFonts w:ascii="Times New Roman" w:hAnsi="Times New Roman"/>
-          <w:sz w:val="22"/>
+          <w:vertAlign w:val="superscript"/>
         </w:rPr>
         <w:t>[26]</w:t>
       </w:r>
@@ -3266,7 +3266,7 @@
       <w:r>
         <w:rPr>
           <w:rFonts w:ascii="Times New Roman" w:hAnsi="Times New Roman"/>
-          <w:sz w:val="22"/>
+          <w:vertAlign w:val="superscript"/>
         </w:rPr>
         <w:t>[27]</w:t>
       </w:r>
@@ -3296,7 +3296,7 @@
       <w:r>
         <w:rPr>
           <w:rFonts w:ascii="Times New Roman" w:hAnsi="Times New Roman"/>
-          <w:sz w:val="22"/>
+          <w:vertAlign w:val="superscript"/>
         </w:rPr>
         <w:t>[28]</w:t>
       </w:r>
@@ -3307,7 +3307,7 @@
           <w:i w:val="0"/>
           <w:sz w:val="24"/>
         </w:rPr>
-        <w:t xml:space="preserve"> Applying similar logic in Japan would require individual-level or prefecture-level career data linked to local litigation, media, and reimbursement environments. Until then, the present specialty-level rate analysis provides the most systematic evidence available on the central policy question: whether malpractice litigation risk drives physicians away from high-risk specialties. The answer is that it does not, at least not in a way that is detectable or policy-relevant in 16 years of national data.</w:t>
+        <w:t xml:space="preserve"> Applying similar logic in Japan would require individual-level or prefecture-level career data linked to local litigation, media, and reimbursement environments. Until then, the present specialty-level rate analysis provides the most systematic evidence available on the central policy question: whether malpractice litigation risk drives physicians away from high-risk specialties. The answer, in these data, is no—or at least not in a way that is detectable or policy-relevant across 9 measured waves (2008–2024).</w:t>
       </w:r>
     </w:p>
     <w:p>
@@ -3338,7 +3338,7 @@
       <w:r>
         <w:rPr>
           <w:rFonts w:ascii="Times New Roman" w:hAnsi="Times New Roman"/>
-          <w:sz w:val="22"/>
+          <w:vertAlign w:val="superscript"/>
         </w:rPr>
         <w:t>[9]</w:t>
       </w:r>

</xml_diff>

<commit_message>
HA: reframe as workforce allocation + sensitivity framework, fix colors/BW, small-cluster caveat
Co-Authored-By: Tatsuki Onishi <bougtoir@gmail.com>
</commit_message>
<xml_diff>
--- a/medical_accident_its_analysis/manuscript/ha_manuscript_en.docx
+++ b/medical_accident_its_analysis/manuscript/ha_manuscript_en.docx
@@ -37,7 +37,7 @@
           <w:rFonts w:ascii="Times New Roman" w:hAnsi="Times New Roman"/>
           <w:sz w:val="24"/>
         </w:rPr>
-        <w:t>Specialty maldistribution in Japan has raised concern that malpractice litigation drives physicians from high-risk specialties. We examined whether specialty-level litigation risk predicts later physician or hospital decline. Using national primary data for 12 specialties (2008–2024), we measured exposure as closed malpractice claims per 1,000 physicians (rate, not count) and regressed biennial log-change in physicians and hospitals on the lagged litigation rate in a panel with specialty and wave fixed effects, cluster-robust standard errors, small-cluster t(G-1) inference, and two one-sided equivalence (TOST) tests. The workforce grew in 11 of 12 specialties; general surgery, which changed by -2.3%, was the exception. Litigation rate was not associated with physician growth (coefficient -0.0009; 95% CI -0.0043 to +0.0025; p=0.56) or hospital growth (p=0.90). A one-SD higher rate changed physician growth by less than ±1% (TOST p=0.023; less than ±2%, p=&lt;0.001; hospital growth was within ±2% (p=0.002) but not the stricter ±1% margin (p=0.059). Sensitivity analyses were unchanged and per-specialty rank correlations were mostly positive (10/12) and none significant. Specialty-level litigation risk in Japan is not associated with workforce decline and is statistically equivalent to a null effect for physicians. These findings, drawn from one health system, suggest that structural workforce incentives, rather than litigation-avoidance messaging, warrant analytical attention.</w:t>
+        <w:t>Specialty maldistribution is a healthcare workforce allocation problem in Japan, where policy discussions often assume that malpractice-litigation risk pushes physicians away from high-risk specialties. We used this question as a test case for a transparent, reproducible sensitivity-analysis framework that evaluates a proposed policy lever while avoiding size confounding and interpolation of sparse panels. Using national primary data for 12 specialties (2008–2024), we measured exposure as closed malpractice claims per 1,000 physicians (rate, not count) and regressed biennial log-change in physicians and hospitals on the lagged litigation rate in a panel with specialty and wave fixed effects, cluster-robust standard errors, small-cluster t(G-1) inference, and two one-sided equivalence (TOST) tests. The workforce grew in 11 of 12 specialties; general surgery, which changed by -2.3%, was the exception. Litigation rate was not associated with physician growth (coefficient -0.0009; 95% CI -0.0043 to +0.0025; p=0.56) or hospital growth (p=0.90). A one-SD higher rate changed physician growth by less than ±1% (TOST p=0.023; less than ±2% was p=&lt;0.001); hospital growth was within ±2% (p=0.002) but not the stricter ±1% margin (p=0.059). Sensitivity analyses were unchanged and per-specialty rank correlations were mostly positive (10/12) and none significant. Specialty-level litigation risk is not associated with workforce decline and is statistically equivalent to a null effect for physicians. The framework is exportable to other policy levers in healthcare workforce allocation.</w:t>
       </w:r>
     </w:p>
     <w:p>
@@ -130,7 +130,7 @@
           <w:i w:val="0"/>
           <w:sz w:val="24"/>
         </w:rPr>
-        <w:t>Prior work in this area often related raw annual counts of incidents or lawsuits to raw counts of physicians or facilities. Two features make such designs prone to spurious association. First, counts are not adjusted for specialty size: a larger specialty mechanically accumulates more procedures, more claims and more physicians, so counts co-move without any behavioural mechanism. Second, the physician census is collected only biennially; interpolating it to an annual series and analysing it as if each year were an independent observation inflates the degrees of freedom of any lag-based method. These pitfalls are not unique to malpractice research; they arise whenever administrative counts are used to infer behavioural responses in healthcare organisations. The litigation-workforce question is therefore also a test case for a transparent, reproducible health-analytics workflow.</w:t>
+        <w:t>Prior work in this area often related raw annual counts of incidents or lawsuits to raw counts of physicians or facilities. Two features make such designs prone to spurious association. First, counts are not adjusted for specialty size: a larger specialty mechanically accumulates more procedures, more claims and more physicians, so counts co-move without any behavioural mechanism. Second, the physician census is collected only biennially; interpolating it to an annual series and analysing it as if each year were an independent observation inflates the degrees of freedom of any lag-based method. These pitfalls are not unique to malpractice research; they arise whenever administrative counts are used to infer behavioural responses in healthcare organisations. We therefore treat the litigation-workforce question as a test case for a transparent, reproducible sensitivity-analysis framework for healthcare workforce allocation decisions.</w:t>
       </w:r>
     </w:p>
     <w:p>
@@ -373,7 +373,7 @@
           <w:i w:val="0"/>
           <w:sz w:val="24"/>
         </w:rPr>
-        <w:t>The exposure was the litigation rate, defined as closed claims per 1,000 physicians in each specialty-year, which removes specialty-size confounding because large specialties generate more claims for reasons unrelated to per-physician risk. The primary analysis used the 9 measured biennial physician waves (2008–2024). For each specialty we computed the biennial log-change in physicians (and, separately, in hospitals) and regressed it on the litigation rate at the start of the interval, in a panel with specialty and wave fixed effects and standard errors clustered by specialty.</w:t>
+        <w:t>We formalised the evaluation as a sensitivity-analysis framework that varies the exposure definition (counts versus rates), panel frequency (measured biennial waves versus interpolated annual values), and potential confounders (JMSR reports, media coverage, JOCS-CP period) while holding the specialty-level panel structure constant. The exposure was the litigation rate, defined as closed claims per 1,000 physicians in each specialty-year, which removes specialty-size confounding because large specialties generate more claims for reasons unrelated to per-physician risk. The primary analysis used the 9 measured biennial physician waves (2008–2024). For each specialty we computed the biennial log-change in physicians (and, separately, in hospitals) and regressed it on the litigation rate at the start of the interval, in a panel with specialty and wave fixed effects and standard errors clustered by specialty.</w:t>
       </w:r>
       <w:r>
         <w:rPr>
@@ -389,7 +389,7 @@
           <w:i w:val="0"/>
           <w:sz w:val="24"/>
         </w:rPr>
-        <w:t xml:space="preserve"> Fixed effects absorb time-invariant specialty characteristics and common shocks, so identification comes from within-specialty deviations in litigation rate over time.</w:t>
+        <w:t xml:space="preserve"> Clusters are defined by specialty, so G=12 and the small-cluster correction uses a t-distribution with G-1 degrees of freedom for all cluster-robust inference.</w:t>
       </w:r>
     </w:p>
     <w:p>
@@ -403,7 +403,7 @@
           <w:i w:val="0"/>
           <w:sz w:val="24"/>
         </w:rPr>
-        <w:t>We standardised the litigation-rate exposure for the equivalence analysis so the coefficient gives the expected biennial log-change per one-SD increase in the exposure. Because only 12 specialties provide clusters, all reported confidence intervals and two-sided p-values use a t-distribution with G-1 = 11 degrees of freedom, the small-cluster correction recommended by Cameron and Miller.</w:t>
+        <w:t>We standardised the litigation-rate exposure for the equivalence analysis so the coefficient gives the expected biennial log-change per one-SD increase in the exposure. All reported confidence intervals and two-sided p-values use a t-distribution with G-1 = 11 degrees of freedom, the small-cluster correction recommended by Cameron and Miller.</w:t>
       </w:r>
       <w:r>
         <w:rPr>
@@ -2973,7 +2973,7 @@
           <w:i w:val="0"/>
           <w:sz w:val="24"/>
         </w:rPr>
-        <w:t>A null result is not merely a failure to detect an effect. The narrow confidence intervals and pre-specified equivalence margins allow us to say that, if litigation risk does influence specialty-level workforce growth, the magnitude is too small to matter for workforce planning. This is an important distinction for policy debates that treat malpractice pressure as a major driver of physician distribution.</w:t>
+        <w:t>A null result is not merely a failure to detect an effect. The narrow confidence intervals and pre-specified equivalence margins allow us to say that, if litigation risk does influence specialty-level workforce growth, the magnitude is too small to matter for workforce planning. Across the sensitivity analyses, neither alternative exposure definitions, interpolation, nor potential confounders changed this conclusion, which is the main value of the framework for healthcare workforce allocation decisions.</w:t>
       </w:r>
     </w:p>
     <w:p>
@@ -3333,7 +3333,7 @@
           <w:i w:val="0"/>
           <w:sz w:val="24"/>
         </w:rPr>
-        <w:t>This is an ecological, specialty-level analysis and cannot speak to individual career decisions. The physician census is biennial, giving 9 measured waves; we addressed the limited power directly through equivalence testing and by pooling across specialties, but residual power constraints remain and the equivalence margins are a judgement. Specialty-specific litigation counts could be recovered only from 2008; pre-2008 specialty tables were not retrievable from primary sources. Clinic counts by specialty are published only every 3 years and were used descriptively. JMSR report counts are available only from 2015 and were used in a 2016-2024 sensitivity. Media article counts are available only for 2009-2018 and are a national total, so they cannot be decomposed by specialty and are collinear with full wave fixed effects. Litigation counts are assigned to a principal specialty and, by the Court's own note, do not measure intrinsic specialty risk.</w:t>
+        <w:t>This is an ecological, specialty-level analysis and cannot speak to individual career decisions. The physician census is biennial, giving 9 measured waves; we addressed the limited power directly through equivalence testing and by pooling across specialties, but residual power constraints remain and the equivalence margins are a judgement. Because clusters are defined by the 12 specialties, the small-cluster correction uses G-1=11 degrees of freedom; this is the minimum at which cluster-robust t inference is recommended and is inherent to the data. Specialty-specific litigation counts could be recovered only from 2008; pre-2008 specialty tables were not retrievable from primary sources. Clinic counts by specialty are published only every 3 years and were used descriptively. JMSR report counts are available only from 2015 and were used in a 2016-2024 sensitivity. Media article counts are available only for 2009-2018 and are a national total, so they cannot be decomposed by specialty and are collinear with full wave fixed effects. Litigation counts are assigned to a principal specialty and, by the Court's own note, do not measure intrinsic specialty risk.</w:t>
       </w:r>
       <w:r>
         <w:rPr>

</xml_diff>

<commit_message>
HA: add workflow supplementary figure, equations, renumber supp figs, extend framework discussion, update title
Co-Authored-By: Tatsuki Onishi <bougtoir@gmail.com>
</commit_message>
<xml_diff>
--- a/medical_accident_its_analysis/manuscript/ha_manuscript_en.docx
+++ b/medical_accident_its_analysis/manuscript/ha_manuscript_en.docx
@@ -13,7 +13,7 @@
           <w:b/>
           <w:sz w:val="28"/>
         </w:rPr>
-        <w:t>Litigation risk and specialty-level physician workforce in Japan, 2008–2024: a rate-based analysis with equivalence testing</w:t>
+        <w:t>Litigation risk and specialty-level physician workforce allocation in Japan, 2008–2024: a sensitivity-analysis framework with equivalence testing</w:t>
       </w:r>
     </w:p>
     <w:p>
@@ -389,7 +389,7 @@
           <w:i w:val="0"/>
           <w:sz w:val="24"/>
         </w:rPr>
-        <w:t xml:space="preserve"> Clusters are defined by specialty, so G=12 and the small-cluster correction uses a t-distribution with G-1 degrees of freedom for all cluster-robust inference.</w:t>
+        <w:t xml:space="preserve"> Clusters are defined by specialty, so G=12 and the small-cluster correction uses a t-distribution with G-1 degrees of freedom for all cluster-robust inference. Supplementary Figure 1 summarises the sensitivity-analysis framework. The primary estimating equation, for specialty s and wave t, was Delta log(Y_st) = alpha_s + delta_t + beta * litrate_s,t-1 + epsilon_st, where Y is either physicians or hospitals, alpha_s are specialty fixed effects, delta_t are wave fixed effects, and standard errors are clustered by specialty. For the equivalence analysis we standardised litrate to a z-score, so beta gives the expected biennial log-change per one-SD increase in the litigation rate.</w:t>
       </w:r>
     </w:p>
     <w:p>
@@ -403,14 +403,14 @@
           <w:i w:val="0"/>
           <w:sz w:val="24"/>
         </w:rPr>
-        <w:t>We standardised the litigation-rate exposure for the equivalence analysis so the coefficient gives the expected biennial log-change per one-SD increase in the exposure. All reported confidence intervals and two-sided p-values use a t-distribution with G-1 = 11 degrees of freedom, the small-cluster correction recommended by Cameron and Miller.</w:t>
+        <w:t>We assessed equivalence to a null effect using two one-sided tests (TOST).</w:t>
       </w:r>
       <w:r>
         <w:rPr>
           <w:rFonts w:ascii="Times New Roman" w:hAnsi="Times New Roman"/>
           <w:vertAlign w:val="superscript"/>
         </w:rPr>
-        <w:t>[15]</w:t>
+        <w:t>[4-5]</w:t>
       </w:r>
       <w:r>
         <w:rPr>
@@ -419,14 +419,28 @@
           <w:i w:val="0"/>
           <w:sz w:val="24"/>
         </w:rPr>
-        <w:t xml:space="preserve"> We assessed equivalence to a null effect using two one-sided tests (TOST).</w:t>
+        <w:t xml:space="preserve"> For a pre-specified margin m, the two one-sided null hypotheses are H0: beta &lt;= -m and H0: beta &gt;= +m; equivalence is declared when both one-sided tests yield p &lt; alpha, using m in 100% and 200%. These margins are smaller than typical policy targets for specialty workforce rebalancing and represent changes that workforce planners would consider substantively small.</w:t>
+      </w:r>
+    </w:p>
+    <w:p>
+      <w:pPr>
+        <w:spacing w:line="480" w:lineRule="auto" w:after="120"/>
+      </w:pPr>
+      <w:r>
+        <w:rPr>
+          <w:rFonts w:ascii="Times New Roman" w:hAnsi="Times New Roman"/>
+          <w:b w:val="0"/>
+          <w:i w:val="0"/>
+          <w:sz w:val="24"/>
+        </w:rPr>
+        <w:t>All reported confidence intervals and two-sided p-values use a t-distribution with G-1 = 11 degrees of freedom, the small-cluster correction recommended by Cameron and Miller.</w:t>
       </w:r>
       <w:r>
         <w:rPr>
           <w:rFonts w:ascii="Times New Roman" w:hAnsi="Times New Roman"/>
           <w:vertAlign w:val="superscript"/>
         </w:rPr>
-        <w:t>[4-5]</w:t>
+        <w:t>[15]</w:t>
       </w:r>
       <w:r>
         <w:rPr>
@@ -489,7 +503,7 @@
           <w:i w:val="0"/>
           <w:sz w:val="24"/>
         </w:rPr>
-        <w:t>Litigation rates per 1,000 physicians varied several-fold across specialties and fell over time in 10 of 12 fields (Supplementary Figure 1). Over the same period the physician workforce grew in 11 of 12 specialties (Supplementary Figure 2; Table 1); the only exception was general surgery, which was essentially flat (-2.3% across 16 years). Exposure and workforce therefore did not move in opposite directions as a flight-from-risk account would predict.</w:t>
+        <w:t>Litigation rates per 1,000 physicians varied several-fold across specialties and fell over time in 10 of 12 fields (Supplementary Figure 2). Over the same period the physician workforce grew in 11 of 12 specialties (Supplementary Figure 3; Table 1); the only exception was general surgery, which was essentially flat (-2.3% across 16 years). Exposure and workforce therefore did not move in opposite directions as a flight-from-risk account would predict.</w:t>
       </w:r>
     </w:p>
     <w:p>
@@ -3312,6 +3326,20 @@
     </w:p>
     <w:p>
       <w:pPr>
+        <w:spacing w:line="480" w:lineRule="auto" w:after="120"/>
+      </w:pPr>
+      <w:r>
+        <w:rPr>
+          <w:rFonts w:ascii="Times New Roman" w:hAnsi="Times New Roman"/>
+          <w:b w:val="0"/>
+          <w:i w:val="0"/>
+          <w:sz w:val="24"/>
+        </w:rPr>
+        <w:t>The framework we used is intentionally general. Specialty physician workforce allocation is a recurring healthcare decision problem, and the same sensitivity-analysis steps—rate adjustment to remove size confounding, measured-only panels to avoid interpolation, equivalence testing with policy-relevant margins, and small-cluster inference—can be applied to other proposed levers, such as fee schedules, regional quotas, or training subsidies. The analytic contribution is therefore not the malpractice finding itself but a transparent, reproducible workflow that helps decision-makers distinguish meaningful workforce effects from spurious count- or interpolation-based associations.</w:t>
+      </w:r>
+    </w:p>
+    <w:p>
+      <w:pPr>
         <w:pStyle w:val="Heading2"/>
       </w:pPr>
       <w:r>

</xml_diff>

<commit_message>
HA submission: Word equation objects, TOST wording, English naturalization, consistency checks
Co-Authored-By: Tatsuki Onishi <bougtoir@gmail.com>
</commit_message>
<xml_diff>
--- a/medical_accident_its_analysis/manuscript/ha_manuscript_en.docx
+++ b/medical_accident_its_analysis/manuscript/ha_manuscript_en.docx
@@ -130,7 +130,7 @@
           <w:i w:val="0"/>
           <w:sz w:val="24"/>
         </w:rPr>
-        <w:t>Prior work in this area often related raw annual counts of incidents or lawsuits to raw counts of physicians or facilities. Two features make such designs prone to spurious association. First, counts are not adjusted for specialty size: a larger specialty mechanically accumulates more procedures, more claims and more physicians, so counts co-move without any behavioural mechanism. Second, the physician census is collected only biennially; interpolating it to an annual series and analysing it as if each year were an independent observation inflates the degrees of freedom of any lag-based method. These pitfalls are not unique to malpractice research; they arise whenever administrative counts are used to infer behavioural responses in healthcare organisations. We therefore treat the litigation-workforce question as a test case for a transparent, reproducible sensitivity-analysis framework for healthcare workforce allocation decisions.</w:t>
+        <w:t>Prior work in this area often related raw annual counts of incidents or lawsuits to raw counts of physicians or facilities. Two features make such designs prone to spurious association. First, counts are not adjusted for specialty size: a larger specialty mechanically accumulates more procedures, more claims and more physicians, so count-based associations can arise without any behavioural mechanism. Second, the physician census is collected only biennially; interpolating it to an annual series and analysing it as if each year were an independent observation inflates the degrees of freedom of any lag-based method. These pitfalls are not unique to malpractice research; they arise whenever administrative counts are used to infer behavioural responses in healthcare organisations. We therefore treat the litigation-workforce question as a test case for a transparent, reproducible sensitivity-analysis framework for healthcare workforce allocation decisions.</w:t>
       </w:r>
     </w:p>
     <w:p>
@@ -205,7 +205,7 @@
           <w:i w:val="0"/>
           <w:sz w:val="24"/>
         </w:rPr>
-        <w:t>We report this observational study following the STROBE guidance.</w:t>
+        <w:t>We report this observational study following the Strengthening the Reporting of Observational Studies in Epidemiology (STROBE) guidance.</w:t>
       </w:r>
       <w:r>
         <w:rPr>
@@ -389,7 +389,115 @@
           <w:i w:val="0"/>
           <w:sz w:val="24"/>
         </w:rPr>
-        <w:t xml:space="preserve"> Clusters are defined by specialty, so G=12 and the small-cluster correction uses a t-distribution with G-1 degrees of freedom for all cluster-robust inference. Supplementary Figure 1 summarises the sensitivity-analysis framework. The primary estimating equation, for specialty s and wave t, was Delta log(Y_st) = alpha_s + delta_t + beta * litrate_s,t-1 + epsilon_st, where Y is either physicians or hospitals, alpha_s are specialty fixed effects, delta_t are wave fixed effects, and standard errors are clustered by specialty. For the equivalence analysis we standardised litrate to a z-score, so beta gives the expected biennial log-change per one-SD increase in the litigation rate.</w:t>
+        <w:t xml:space="preserve"> Clusters are defined by specialty, so G=12 and the small-cluster correction uses a t-distribution with G-1 degrees of freedom for all cluster-robust inference. Supplementary Figure 1 summarises the sensitivity-analysis framework. The primary estimating equation, for specialty s and wave t, was as follows.</w:t>
+      </w:r>
+    </w:p>
+    <w:p>
+      <w:pPr>
+        <w:jc w:val="center"/>
+      </w:pPr>
+      <m:oMath xmlns:mml="http://www.w3.org/1998/Math/MathML">
+        <m:r>
+          <m:t>Δ</m:t>
+        </m:r>
+        <m:r>
+          <m:rPr>
+            <m:sty m:val="p"/>
+          </m:rPr>
+          <m:t>log</m:t>
+        </m:r>
+        <m:r>
+          <m:t>(</m:t>
+        </m:r>
+        <m:sSub>
+          <m:e>
+            <m:r>
+              <m:t>Y</m:t>
+            </m:r>
+          </m:e>
+          <m:sub>
+            <m:r>
+              <m:t>st</m:t>
+            </m:r>
+          </m:sub>
+        </m:sSub>
+        <m:r>
+          <m:t>)=</m:t>
+        </m:r>
+        <m:sSub>
+          <m:e>
+            <m:r>
+              <m:t>α</m:t>
+            </m:r>
+          </m:e>
+          <m:sub>
+            <m:r>
+              <m:t>s</m:t>
+            </m:r>
+          </m:sub>
+        </m:sSub>
+        <m:r>
+          <m:t>+</m:t>
+        </m:r>
+        <m:sSub>
+          <m:e>
+            <m:r>
+              <m:t>δ</m:t>
+            </m:r>
+          </m:e>
+          <m:sub>
+            <m:r>
+              <m:t>t</m:t>
+            </m:r>
+          </m:sub>
+        </m:sSub>
+        <m:r>
+          <m:t>+β·</m:t>
+        </m:r>
+        <m:sSub>
+          <m:e>
+            <m:r>
+              <m:rPr>
+                <m:nor/>
+              </m:rPr>
+              <m:t>litrate</m:t>
+            </m:r>
+          </m:e>
+          <m:sub>
+            <m:r>
+              <m:t>s,t−1</m:t>
+            </m:r>
+          </m:sub>
+        </m:sSub>
+        <m:r>
+          <m:t>+</m:t>
+        </m:r>
+        <m:sSub>
+          <m:e>
+            <m:r>
+              <m:t>ϵ</m:t>
+            </m:r>
+          </m:e>
+          <m:sub>
+            <m:r>
+              <m:t>st</m:t>
+            </m:r>
+          </m:sub>
+        </m:sSub>
+      </m:oMath>
+    </w:p>
+    <w:p>
+      <w:pPr>
+        <w:spacing w:line="480" w:lineRule="auto" w:after="120"/>
+      </w:pPr>
+      <w:r>
+        <w:rPr>
+          <w:rFonts w:ascii="Times New Roman" w:hAnsi="Times New Roman"/>
+          <w:b w:val="0"/>
+          <w:i w:val="0"/>
+          <w:sz w:val="24"/>
+        </w:rPr>
+        <w:t>Here, Y is either physicians or hospitals, alpha_s are specialty fixed effects, delta_t are wave fixed effects, and standard errors are clustered by specialty. For the equivalence analysis we standardised litrate to a z-score, so beta gives the expected biennial log-change per one-SD increase in the litigation rate.</w:t>
       </w:r>
     </w:p>
     <w:p>
@@ -419,7 +527,64 @@
           <w:i w:val="0"/>
           <w:sz w:val="24"/>
         </w:rPr>
-        <w:t xml:space="preserve"> For a pre-specified margin m, the two one-sided null hypotheses are H0: beta &lt;= -m and H0: beta &gt;= +m; equivalence is declared when both one-sided tests yield p &lt; alpha, using m in 100% and 200%. These margins are smaller than typical policy targets for specialty workforce rebalancing and represent changes that workforce planners would consider substantively small.</w:t>
+        <w:t xml:space="preserve"> For a pre-specified margin m, the two one-sided null hypotheses are</w:t>
+      </w:r>
+    </w:p>
+    <w:p>
+      <w:pPr>
+        <w:jc w:val="center"/>
+      </w:pPr>
+      <m:oMath xmlns:mml="http://www.w3.org/1998/Math/MathML">
+        <m:sSub>
+          <m:e>
+            <m:r>
+              <m:t>H</m:t>
+            </m:r>
+          </m:e>
+          <m:sub>
+            <m:r>
+              <m:t>0</m:t>
+            </m:r>
+          </m:sub>
+        </m:sSub>
+        <m:r>
+          <m:t>:β≤−m</m:t>
+        </m:r>
+        <m:r>
+          <m:rPr>
+            <m:nor/>
+          </m:rPr>
+          <m:t>and</m:t>
+        </m:r>
+        <m:sSub>
+          <m:e>
+            <m:r>
+              <m:t>H</m:t>
+            </m:r>
+          </m:e>
+          <m:sub>
+            <m:r>
+              <m:t>0</m:t>
+            </m:r>
+          </m:sub>
+        </m:sSub>
+        <m:r>
+          <m:t>:β≥+m</m:t>
+        </m:r>
+      </m:oMath>
+    </w:p>
+    <w:p>
+      <w:pPr>
+        <w:spacing w:line="480" w:lineRule="auto" w:after="120"/>
+      </w:pPr>
+      <w:r>
+        <w:rPr>
+          <w:rFonts w:ascii="Times New Roman" w:hAnsi="Times New Roman"/>
+          <w:b w:val="0"/>
+          <w:i w:val="0"/>
+          <w:sz w:val="24"/>
+        </w:rPr>
+        <w:t>Equivalence is declared when both one-sided tests yield p &lt; alpha. We used margins of 1% and 2% biennial workforce change because they are smaller than typical policy targets for specialty workforce rebalancing and represent changes that workforce planners would consider substantively small.</w:t>
       </w:r>
     </w:p>
     <w:p>
@@ -449,7 +614,7 @@
           <w:i w:val="0"/>
           <w:sz w:val="24"/>
         </w:rPr>
-        <w:t xml:space="preserve"> We pre-specified margins of ±1% and ±2% biennial workforce change because they are smaller than typical policy targets for specialty workforce rebalancing and represent changes that workforce planners would consider substantively small. An indicator for obstetrics and gynaecology from 2009 onward captured the JOCS-CP period.</w:t>
+        <w:t xml:space="preserve"> An indicator for obstetrics and gynaecology from 2009 onward captured the JOCS-CP period.</w:t>
       </w:r>
       <w:r>
         <w:rPr>
@@ -2806,7 +2971,7 @@
           <w:i w:val="0"/>
           <w:sz w:val="24"/>
         </w:rPr>
-        <w:t>Using raw litigation counts rather than rates did not recover a negative association in this measured-only design (p=0.51). Figure 2 illustrates the difference between the two exposure definitions: a count exposure spans specialty size (panel a), whereas the size-adjusted rate does not (panel b); points are coloured by specialty so the reader can identify which fields drive any apparent outliers. The annual hospital and the interpolated annual physician sensitivity analyses were also null (p=0.99 and p=0.39), confirming that size confounding and interpolation are sufficient to create spurious associations. The JOCS-CP indicator was directionally positive in the obstetric-hospital model (coefficient +0.024, raw p=0.013), but the association was not significant after the small-cluster correction and Holm adjustment for the exploratory sensitivity family (Holm p=0.119); we therefore treat it as exploratory and do not interpret it as a causal policy effect.</w:t>
+        <w:t>Using raw litigation counts rather than rates did not reveal a negative association in this measured-only design (p=0.51). Figure 2 shows the contrast: the count exposure is confounded by specialty size (panel a), whereas the rate-adjusted exposure is not (panel b); points are coloured and shaped by specialty so readers can identify which fields drive any apparent pattern. The annual hospital and interpolated annual-physician sensitivity analyses were also null (p=0.99 and p=0.39), confirming that the null result is robust to panel frequency and exposure definition. The JOCS-CP indicator was positive in sign in the obstetric-hospital model (coefficient +0.024, raw p=0.013), but it did not remain significant after the small-cluster correction and Holm adjustment for the exploratory sensitivity family (Holm p=0.119); we therefore treat it as exploratory and do not interpret it as a causal policy effect.</w:t>
       </w:r>
     </w:p>
     <w:p>
@@ -2901,7 +3066,7 @@
           <w:i w:val="0"/>
           <w:sz w:val="24"/>
         </w:rPr>
-        <w:t>We also evaluated the JMSR medical accident investigation report counts as a potential confounder or competing exposure.</w:t>
+        <w:t>We also evaluated JMSR medical-accident investigation report counts as a potential confounder or competing exposure.</w:t>
       </w:r>
       <w:r>
         <w:rPr>
@@ -2917,7 +3082,7 @@
           <w:i w:val="0"/>
           <w:sz w:val="24"/>
         </w:rPr>
-        <w:t xml:space="preserve"> Over 2015-2024, raw litigation and JMSR report counts were strongly correlated across specialties (Pearson r=0.82), because large specialties generate more of both; however, after removing specialty-specific levels and trends the within-specialty correlation was negligible (r=-0.02). A model of annual hospital growth for 2016-2024 that included both the lagged litigation rate and the lagged JMSR report rate left the litigation coefficient essentially unchanged (coefficient +0.0021; p=0.28) and the JMSR term was not associated with hospital growth (p=0.66; Supplementary Table 3). Thus, the null litigation result is not explained by, nor masked by, broader medical accident reporting.</w:t>
+        <w:t xml:space="preserve"> From 2015 to 2024, raw litigation and JMSR report counts were strongly correlated across specialties (Pearson r=0.82), because large specialties generate more of both. After removing specialty-specific levels and trends, however, the within-specialty correlation was negligible (r=-0.02). A model of annual hospital growth for 2016-2024 that included both the lagged litigation rate and the lagged JMSR report rate left the litigation coefficient essentially unchanged (+0.0021; p=0.28) and the JMSR term was not associated with hospital growth (p=0.66; Supplementary Table 3). The null litigation result is therefore neither explained nor masked by broader medical-accident reporting.</w:t>
       </w:r>
     </w:p>
     <w:p>
@@ -2947,7 +3112,7 @@
           <w:i w:val="0"/>
           <w:sz w:val="24"/>
         </w:rPr>
-        <w:t xml:space="preserve"> Total annual article counts (keywords: 医療事故 + 医療過誤) and total litigation counts were correlated (Pearson r=0.81), consistent with the public salience of high-litigation years; however, within the annual hospital panel the lagged litigation rate and the media-count series were only weakly correlated. A model of annual hospital growth for 2009-2018 that included both the lagged litigation rate and the lagged article count (per 1,000 articles) left the litigation coefficient essentially unchanged and the media term was not associated with hospital growth (p=0.21; Supplementary Table 4). Media coverage therefore does not account for the null litigation effect either. Holm step-down adjusted p-values for the exploratory sensitivity family are reported in Supplementary Table 5.</w:t>
+        <w:t xml:space="preserve"> Total annual article counts (keywords: 医療事故 + 医療過誤) and total litigation counts were correlated (Pearson r=0.81), consistent with greater public attention in high-litigation years. Within the annual hospital panel, however, the lagged litigation rate and the media-count series were only weakly correlated. A model of annual hospital growth for 2009-2018 that included both the lagged litigation rate and the lagged article count (per 1,000 articles) left the litigation coefficient essentially unchanged and the media term was not associated with hospital growth (p=0.21; Supplementary Table 4). Media coverage therefore does not explain the null litigation effect either. Holm step-down adjusted p-values for the exploratory sensitivity family are reported in Supplementary Table 5.</w:t>
       </w:r>
     </w:p>
     <w:p>
@@ -2973,7 +3138,7 @@
           <w:i w:val="0"/>
           <w:sz w:val="24"/>
         </w:rPr>
-        <w:t>Using national primary data, rates rather than counts, and only measured physician observations, we found no association between specialty-level malpractice-litigation risk and subsequent physician or hospital decline. Equivalence testing turned this null into a positive statement: any effect of litigation risk on the biennial workforce is smaller than a pre-specified, policy-relevant margin. These data therefore do not support the hypothesis that physicians systematically abandon high-litigation specialties over 16 years of official statistics.</w:t>
+        <w:t>Using national primary data, rates rather than counts, and only measured physician observations, we found no association between specialty-level malpractice-litigation risk and subsequent physician or hospital decline. Equivalence testing showed that any effect of litigation risk on biennial physician growth is smaller than 1% (90% CI within the 1% margin), and any effect on hospital growth is smaller than 2% (but not confidently smaller than 1%). These data therefore do not support the hypothesis that physicians systematically abandon high-litigation specialties over 16 years of official statistics.</w:t>
       </w:r>
     </w:p>
     <w:p>
@@ -2987,7 +3152,7 @@
           <w:i w:val="0"/>
           <w:sz w:val="24"/>
         </w:rPr>
-        <w:t>A null result is not merely a failure to detect an effect. The narrow confidence intervals and pre-specified equivalence margins allow us to say that, if litigation risk does influence specialty-level workforce growth, the magnitude is too small to matter for workforce planning. Across the sensitivity analyses, neither alternative exposure definitions, interpolation, nor potential confounders changed this conclusion, which is the main value of the framework for healthcare workforce allocation decisions.</w:t>
+        <w:t>A null result is not merely a failure to detect an effect. The narrow confidence intervals and pre-specified equivalence margins allow us to say that, if litigation risk does influence specialty-level workforce growth, the magnitude is too small to matter for workforce planning. Across the sensitivity analyses, alternative exposure definitions, interpolation, and potential confounders did not change this conclusion, which is the main value of the framework for healthcare workforce allocation decisions.</w:t>
       </w:r>
     </w:p>
     <w:p>
@@ -3001,7 +3166,7 @@
           <w:i w:val="0"/>
           <w:sz w:val="24"/>
         </w:rPr>
-        <w:t>The raw-count sensitivity in our study did not recover a negative association, indicating that size confounding and interpolation are sufficient to produce spurious negative findings. This is a cautionary example for workforce research that pairs administrative count series, and it underscores why rate-based, measured-only designs are preferable when testing litigation-workforce hypotheses.</w:t>
+        <w:t>The raw-count sensitivity did not reveal a negative association in these data, illustrating that the apparent count-litigation relationship does not translate into a behavioural effect once specialty size is accounted for (Figure 2). This is a cautionary example for workforce research that pairs administrative count series, and it underscores why rate-based, measured-only designs are preferable when testing litigation-workforce hypotheses.</w:t>
       </w:r>
     </w:p>
     <w:p>
@@ -3047,7 +3212,7 @@
           <w:i w:val="0"/>
           <w:sz w:val="24"/>
         </w:rPr>
-        <w:t xml:space="preserve"> Frakes and co-workers showed that negligence-standard reforms could shift the composition of the physician workforce toward surgery in some regions, yet the effect was localized and modest.</w:t>
+        <w:t xml:space="preserve"> Frakes and colleagues showed that negligence-standard reforms could shift the composition of the physician workforce toward surgery in some regions, yet the effect was localized and modest.</w:t>
       </w:r>
       <w:r>
         <w:rPr>
@@ -3077,7 +3242,7 @@
           <w:i w:val="0"/>
           <w:sz w:val="24"/>
         </w:rPr>
-        <w:t>Even when litigation risk does not change the number of physicians, it may alter clinical behaviour through defensive medicine. Kessler and McClellan showed that U.S. malpractice reforms reduced medical expenditures for elderly heart-disease patients without increasing mortality or complications, suggesting that defensive practice is one margin of adjustment to liability pressure.</w:t>
+        <w:t>Even when litigation risk is unrelated to the number of physicians, it may shape clinical behaviour through defensive medicine. Kessler and McClellan showed that U.S. malpractice reforms reduced medical expenditures for elderly heart-disease patients without increasing mortality or complications, suggesting that defensive practice is one margin of adjustment to liability pressure.</w:t>
       </w:r>
       <w:r>
         <w:rPr>
@@ -3169,7 +3334,7 @@
           <w:i w:val="0"/>
           <w:sz w:val="24"/>
         </w:rPr>
-        <w:t xml:space="preserve"> The hospital-level JOCS-CP indicator was directionally positive (coefficient +0.024, raw p=0.013), but it did not remain significant after the small-cluster correction and Holm adjustment for the exploratory sensitivity family (Holm p=0.119). This suggests that, if the JOCS-CP did support obstetric hospital supply, the effect is too small or too confounded by concurrent obstetric policies to be isolated here. Civil litigation exposure is also distinct from criminal prosecution. Morita exploited the 2004 Fukushima obstetrician prosecution and found a 13 percent decline in obstetricians, with some switching to gynaecology.</w:t>
+        <w:t xml:space="preserve"> The hospital-level JOCS-CP indicator was directionally positive (coefficient +0.024, raw p=0.013), but it did not remain significant after the small-cluster correction and Holm adjustment for the exploratory sensitivity family (Holm p=0.119). This suggests that, if the JOCS-CP did support obstetric hospital supply, the effect would be too small or too confounded by concurrent obstetric policies to be isolated here. Civil litigation exposure is also distinct from criminal prosecution. Morita studied the 2004 Fukushima obstetrician prosecution and found a 13 percent decline in obstetricians, with some switching to gynaecology.</w:t>
       </w:r>
       <w:r>
         <w:rPr>
@@ -3199,7 +3364,7 @@
           <w:i w:val="0"/>
           <w:sz w:val="24"/>
         </w:rPr>
-        <w:t>The obstetrics and gynaecology case is the most discussed example of the litigation-workforce nexus, and it is consistent with our interpretation. A recent comparison of Japanese and U.S. medical-legal claims in OB/GYN found that the proportion of malpractice claims in this specialty fell from 15.1 percent in 2004 to 5.2 percent in 2022, and that claims per 100 OB/GYN physicians fell from 0.9 in 2007 to 0.4 in 2016, while maternal and neonatal mortality also declined.</w:t>
+        <w:t>The obstetrics and gynaecology case is the most discussed example of the litigation-workforce nexus, and it is consistent with our interpretation. A recent comparison of Japanese and U.S. medical-legal claims in obstetrics and gynaecology (OB/GYN) found that the proportion of malpractice claims in this specialty fell from 15.1 percent in 2004 to 5.2 percent in 2022, and that claims per 100 OB/GYN physicians fell from 0.9 in 2007 to 0.4 in 2016, while maternal and neonatal mortality also declined.</w:t>
       </w:r>
       <w:r>
         <w:rPr>
@@ -3245,7 +3410,7 @@
           <w:i w:val="0"/>
           <w:sz w:val="24"/>
         </w:rPr>
-        <w:t>What do these findings imply for policy? Reducing civil malpractice litigation is unlikely to be a powerful lever for correcting specialty maldistribution in Japan. Structural incentives are more promising: no-fault compensation can de-risk high-acuity specialties, and payment design can reward service in underserved settings and activities. The JOCS-CP experience supports the former; Japan's fee-for-service schedule and rural/urban payment adjustments illustrate the latter. This is not to say that malpractice reform is irrelevant: it may influence defensive medicine, patient compensation, and provider-patient trust. But our evidence does not support the claim, at least from these data, that lowering litigation risk will retain physicians in high-risk specialties. Policymakers should therefore target structural incentives before relying on litigation-avoidance messaging.</w:t>
+        <w:t>What do these findings imply for policy? Reducing civil malpractice litigation is unlikely to be a powerful lever for correcting specialty maldistribution in Japan. Structural incentives are more promising: no-fault compensation can de-risk high-acuity specialties, and payment design can reward service in underserved settings and activities. The JOCS-CP experience supports the former; Japan's fee-for-service schedule and rural/urban payment adjustments illustrate the latter. Malpractice reform may still matter for defensive medicine, patient compensation, and provider-patient trust. But our evidence does not support the claim, at least from these data, that lowering litigation risk will retain physicians in high-risk specialties. Policymakers should therefore target structural incentives before relying on litigation-avoidance messaging.</w:t>
       </w:r>
     </w:p>
     <w:p>

</xml_diff>

<commit_message>
HA: remove Japanese characters from manuscript body
Co-Authored-By: Tatsuki Onishi <bougtoir@gmail.com>
</commit_message>
<xml_diff>
--- a/medical_accident_its_analysis/manuscript/ha_manuscript_en.docx
+++ b/medical_accident_its_analysis/manuscript/ha_manuscript_en.docx
@@ -285,7 +285,7 @@
           <w:i w:val="0"/>
           <w:sz w:val="24"/>
         </w:rPr>
-        <w:t xml:space="preserve"> and total national newspaper article counts from Nikkei Telecom 21 (2004-2018; the sensitivity analysis uses 2009-2018; keywords: 医療事故 + 医療過誤).</w:t>
+        <w:t xml:space="preserve"> and total national newspaper article counts from Nikkei Telecom 21 (2004-2018; the sensitivity analysis uses 2009-2018; keywords: medical accident + medical malpractice).</w:t>
       </w:r>
       <w:r>
         <w:rPr>
@@ -315,7 +315,7 @@
           <w:i w:val="0"/>
           <w:sz w:val="24"/>
         </w:rPr>
-        <w:t>Physician counts use the principal-specialty (主たる診療科) classification; broad categories were matched to the Supreme Court's specialty labels, and subspecialties were aggregated in code. Because the Court assigns multi-specialty cases to a single principal specialty and states that the counts do not represent the intrinsic risk of each specialty, we treat litigation as an exposure signal rather than a measure of incident risk.</w:t>
+        <w:t>Physician counts use the principal-specialty classification; broad categories were matched to the Supreme Court's specialty labels, and subspecialties were aggregated in code. Because the Court assigns multi-specialty cases to a single principal specialty and states that the counts do not represent the intrinsic risk of each specialty, we treat litigation as an exposure signal rather than a measure of incident risk.</w:t>
       </w:r>
       <w:r>
         <w:rPr>
@@ -3112,7 +3112,7 @@
           <w:i w:val="0"/>
           <w:sz w:val="24"/>
         </w:rPr>
-        <w:t xml:space="preserve"> Total annual article counts (keywords: 医療事故 + 医療過誤) and total litigation counts were correlated (Pearson r=0.81), consistent with greater public attention in high-litigation years. Within the annual hospital panel, however, the lagged litigation rate and the media-count series were only weakly correlated. A model of annual hospital growth for 2009-2018 that included both the lagged litigation rate and the lagged article count (per 1,000 articles) left the litigation coefficient essentially unchanged and the media term was not associated with hospital growth (p=0.21; Supplementary Table 4). Media coverage therefore does not explain the null litigation effect either. Holm step-down adjusted p-values for the exploratory sensitivity family are reported in Supplementary Table 5.</w:t>
+        <w:t xml:space="preserve"> Total annual article counts (keywords: medical accident + medical malpractice) and total litigation counts were correlated (Pearson r=0.81), consistent with greater public attention in high-litigation years. Within the annual hospital panel, however, the lagged litigation rate and the media-count series were only weakly correlated. A model of annual hospital growth for 2009-2018 that included both the lagged litigation rate and the lagged article count (per 1,000 articles) left the litigation coefficient essentially unchanged and the media term was not associated with hospital growth (p=0.21; Supplementary Table 4). Media coverage therefore does not explain the null litigation effect either. Holm step-down adjusted p-values for the exploratory sensitivity family are reported in Supplementary Table 5.</w:t>
       </w:r>
     </w:p>
     <w:p>

</xml_diff>

<commit_message>
HA: use more common English terms (medical error, principal specialty)
Co-Authored-By: Tatsuki Onishi <bougtoir@gmail.com>
</commit_message>
<xml_diff>
--- a/medical_accident_its_analysis/manuscript/ha_manuscript_en.docx
+++ b/medical_accident_its_analysis/manuscript/ha_manuscript_en.docx
@@ -285,7 +285,7 @@
           <w:i w:val="0"/>
           <w:sz w:val="24"/>
         </w:rPr>
-        <w:t xml:space="preserve"> and total national newspaper article counts from Nikkei Telecom 21 (2004-2018; the sensitivity analysis uses 2009-2018; keywords: medical accident + medical malpractice).</w:t>
+        <w:t xml:space="preserve"> and total national newspaper article counts from Nikkei Telecom 21 (2004-2018; the sensitivity analysis uses 2009-2018; keywords: medical error + medical malpractice).</w:t>
       </w:r>
       <w:r>
         <w:rPr>
@@ -315,7 +315,7 @@
           <w:i w:val="0"/>
           <w:sz w:val="24"/>
         </w:rPr>
-        <w:t>Physician counts use the principal-specialty classification; broad categories were matched to the Supreme Court's specialty labels, and subspecialties were aggregated in code. Because the Court assigns multi-specialty cases to a single principal specialty and states that the counts do not represent the intrinsic risk of each specialty, we treat litigation as an exposure signal rather than a measure of incident risk.</w:t>
+        <w:t>Physician counts use the principal specialty classification; broad categories were matched to the Supreme Court's specialty labels, and subspecialties were aggregated in code. Because the Court assigns multi-specialty cases to a single principal specialty and states that the counts do not represent the intrinsic risk of each specialty, we treat litigation as an exposure signal rather than a measure of incident risk.</w:t>
       </w:r>
       <w:r>
         <w:rPr>
@@ -3112,7 +3112,7 @@
           <w:i w:val="0"/>
           <w:sz w:val="24"/>
         </w:rPr>
-        <w:t xml:space="preserve"> Total annual article counts (keywords: medical accident + medical malpractice) and total litigation counts were correlated (Pearson r=0.81), consistent with greater public attention in high-litigation years. Within the annual hospital panel, however, the lagged litigation rate and the media-count series were only weakly correlated. A model of annual hospital growth for 2009-2018 that included both the lagged litigation rate and the lagged article count (per 1,000 articles) left the litigation coefficient essentially unchanged and the media term was not associated with hospital growth (p=0.21; Supplementary Table 4). Media coverage therefore does not explain the null litigation effect either. Holm step-down adjusted p-values for the exploratory sensitivity family are reported in Supplementary Table 5.</w:t>
+        <w:t xml:space="preserve"> Total annual article counts (keywords: medical error + medical malpractice) and total litigation counts were correlated (Pearson r=0.81), consistent with greater public attention in high-litigation years. Within the annual hospital panel, however, the lagged litigation rate and the media-count series were only weakly correlated. A model of annual hospital growth for 2009-2018 that included both the lagged litigation rate and the lagged article count (per 1,000 articles) left the litigation coefficient essentially unchanged and the media term was not associated with hospital growth (p=0.21; Supplementary Table 4). Media coverage therefore does not explain the null litigation effect either. Holm step-down adjusted p-values for the exploratory sensitivity family are reported in Supplementary Table 5.</w:t>
       </w:r>
     </w:p>
     <w:p>

</xml_diff>

<commit_message>
Add OR/simulation policy-lever counterfactual and strengthen Healthcare Analytics framing
- data_primary/build_reanalysis.py: add policy_simulation() projecting 2034 physician counts under litigation-elimination (point and 95% lower-bound) and an MDE-benchmark lever.
- manuscript/build_figures_en.py: add plot_policy_simulation() and generate Figure 6 / ha_Figure_3.png.
- manuscript/build_healthcare_analytics_submission.py: add Methods/Results subsections for the policy-lever simulation, update cover letter, title page counts (3 main figures), and zip/pptx lists.
- Regenerate all ha_* submission artifacts and reanalysis_results.json.

Refs: PR #348
Co-Authored-By: Tatsuki Onishi <bougtoir@gmail.com>
</commit_message>
<xml_diff>
--- a/medical_accident_its_analysis/manuscript/ha_manuscript_en.docx
+++ b/medical_accident_its_analysis/manuscript/ha_manuscript_en.docx
@@ -599,6 +599,32 @@
           <w:sz w:val="24"/>
         </w:rPr>
         <w:t>We complemented the analytical small-cluster inference with two diagnostic quantities. First, a cluster block-bootstrap with B = 1,999 replications resampled specialties with replacement, re-fitted the primary model, and reported percentile bootstrap 95% confidence intervals and a bootstrap p-value based on the distribution of absolute t-statistics. Second, we report the minimum detectable effect (MDE) at 80% power for the per-SD litigation-rate coefficient and the power to declare equivalence when the true effect is zero. The MDE is (t(0.975, df) + t(0.80, df)) × SE; the equivalence power is 2·F_t(m/SE) − 1, where F_t is the cumulative distribution of the t(df) distribution. These diagnostics make the limited-panel information explicit to workforce planners evaluating this policy lever.</w:t>
+      </w:r>
+    </w:p>
+    <w:p>
+      <w:pPr>
+        <w:pStyle w:val="Heading2"/>
+      </w:pPr>
+      <w:r>
+        <w:rPr>
+          <w:rFonts w:ascii="Times New Roman" w:hAnsi="Times New Roman"/>
+          <w:color w:val="000000"/>
+        </w:rPr>
+        <w:t>Policy lever simulation</w:t>
+      </w:r>
+    </w:p>
+    <w:p>
+      <w:pPr>
+        <w:spacing w:line="480" w:lineRule="auto" w:after="120"/>
+      </w:pPr>
+      <w:r>
+        <w:rPr>
+          <w:rFonts w:ascii="Times New Roman" w:hAnsi="Times New Roman"/>
+          <w:b w:val="0"/>
+          <w:i w:val="0"/>
+          <w:sz w:val="24"/>
+        </w:rPr>
+        <w:t>To translate the regression results into a decision-analytics output, we projected physician counts to 2034 under three stylised policy levers. The baseline used each specialty's observed mean biennial log-growth from 2004 to 2024. The two litigation-reduction levers set the litigation rate to zero and applied the point estimate and the 95% lower-bound coefficient, respectively, so they show both the central projection and the most favourable effect consistent with the data. The third lever added the minimum detectable per-SD effect (1.08% per biennium) to baseline growth as a benchmark for the smallest policy effect this panel could detect with 80% power. The projections are deterministic counterfactuals, not forecasts, and are reported as the marginal percent change in 2034 relative to the baseline drift.</w:t>
       </w:r>
     </w:p>
     <w:p>
@@ -3157,6 +3183,85 @@
     </w:p>
     <w:p>
       <w:pPr>
+        <w:pStyle w:val="Heading2"/>
+      </w:pPr>
+      <w:r>
+        <w:rPr>
+          <w:rFonts w:ascii="Times New Roman" w:hAnsi="Times New Roman"/>
+          <w:color w:val="000000"/>
+        </w:rPr>
+        <w:t>Policy lever simulation</w:t>
+      </w:r>
+    </w:p>
+    <w:p>
+      <w:pPr>
+        <w:spacing w:line="480" w:lineRule="auto" w:after="120"/>
+      </w:pPr>
+      <w:r>
+        <w:rPr>
+          <w:rFonts w:ascii="Times New Roman" w:hAnsi="Times New Roman"/>
+          <w:b w:val="0"/>
+          <w:i w:val="0"/>
+          <w:sz w:val="24"/>
+        </w:rPr>
+        <w:t>The counterfactual projection made the practical implications of the null regression result explicit. Under the point estimate, eliminating all malpractice litigation would add only 1.1% to the projected 2034 national physician stock relative to baseline drift. Even under the 95% lower-bound (most favourable) coefficient it would add 5.2%, comparable to the 5.5% gain from a generic lever equal to the minimum detectable effect. General surgery, the only specialty with negative baseline drift, illustrates the break-even arithmetic: its projected 2024-2034 decline of -2.2% would be reduced to -0.1% under the point estimate and reversed to 7.7% under the 95% lower bound. The latter requires eliminating every remaining closed claim and assumes the most adverse (most negative) coefficient compatible with the data; a more realistic policy would achieve far less. Figure 3 shows that litigation reduction is therefore not a high-leverage instrument for workforce allocation in this setting.</w:t>
+      </w:r>
+    </w:p>
+    <w:p>
+      <w:pPr>
+        <w:spacing w:before="280" w:after="120"/>
+      </w:pPr>
+      <w:r>
+        <w:rPr>
+          <w:rFonts w:ascii="Times New Roman" w:hAnsi="Times New Roman"/>
+          <w:b/>
+          <w:sz w:val="20"/>
+        </w:rPr>
+        <w:t>Figure 3. Counterfactual policy-lever simulation: marginal 10-year change in physician counts by specialty relative to the projected baseline drift. The MDE benchmark is the minimum detectable per-SD effect from the primary analysis.</w:t>
+      </w:r>
+    </w:p>
+    <w:p>
+      <w:pPr>
+        <w:jc w:val="center"/>
+      </w:pPr>
+      <w:r>
+        <w:drawing>
+          <wp:inline xmlns:a="http://schemas.openxmlformats.org/drawingml/2006/main" xmlns:pic="http://schemas.openxmlformats.org/drawingml/2006/picture">
+            <wp:extent cx="5303520" cy="2410691"/>
+            <wp:docPr id="3" name="Picture 3"/>
+            <wp:cNvGraphicFramePr>
+              <a:graphicFrameLocks noChangeAspect="1"/>
+            </wp:cNvGraphicFramePr>
+            <a:graphic>
+              <a:graphicData uri="http://schemas.openxmlformats.org/drawingml/2006/picture">
+                <pic:pic>
+                  <pic:nvPicPr>
+                    <pic:cNvPr id="0" name="ha_Figure_3.png"/>
+                    <pic:cNvPicPr/>
+                  </pic:nvPicPr>
+                  <pic:blipFill>
+                    <a:blip r:embed="rId11"/>
+                    <a:stretch>
+                      <a:fillRect/>
+                    </a:stretch>
+                  </pic:blipFill>
+                  <pic:spPr>
+                    <a:xfrm>
+                      <a:off x="0" y="0"/>
+                      <a:ext cx="5303520" cy="2410691"/>
+                    </a:xfrm>
+                    <a:prstGeom prst="rect"/>
+                  </pic:spPr>
+                </pic:pic>
+              </a:graphicData>
+            </a:graphic>
+          </wp:inline>
+        </w:drawing>
+      </w:r>
+    </w:p>
+    <w:p/>
+    <w:p>
+      <w:pPr>
         <w:pStyle w:val="Heading1"/>
       </w:pPr>
       <w:r>
@@ -3503,7 +3608,7 @@
           <w:i w:val="0"/>
           <w:sz w:val="24"/>
         </w:rPr>
-        <w:t>What do these findings imply for policy? Reducing civil malpractice litigation is unlikely to be a powerful lever for correcting specialty maldistribution in this national setting. Structural incentives are more promising: no-fault compensation can de-risk high-acuity specialties, and payment design can reward service in underserved settings and activities. The JOCS-CP experience supports the former; the country's fee-for-service schedule and rural/urban payment adjustments illustrate the latter. Malpractice reform may still matter for defensive medicine, patient compensation, and provider-patient trust. But our evidence does not support the claim, at least from these data, that lowering litigation risk will retain physicians in high-risk specialties. Policymakers should therefore target structural incentives before relying on litigation-avoidance messaging.</w:t>
+        <w:t>What do these findings imply for policy? Reducing civil malpractice litigation is unlikely to be a powerful lever for correcting specialty maldistribution in this national setting. The 10-year counterfactual simulation showed that eliminating all litigation would add only 1.1% to the projected national physician stock under the point estimate, and even 5.2% under the most favourable 95% lower-bound coefficient, before accounting for the implausibility of zero claims. Structural incentives are more promising: no-fault compensation can de-risk high-acuity specialties, and payment design can reward service in underserved settings and activities. The JOCS-CP experience supports the former; the country's fee-for-service schedule and rural/urban payment adjustments illustrate the latter. Malpractice reform may still matter for defensive medicine, patient compensation, and provider-patient trust. But our evidence does not support the claim, at least from these data, that lowering litigation risk will retain physicians in high-risk specialties. Policymakers should therefore target structural incentives before relying on litigation-avoidance messaging.</w:t>
       </w:r>
     </w:p>
     <w:p>

</xml_diff>

<commit_message>
Add hospital count-vs-rate figure, policy simulation table, and clarify specialty count
- Rename N_SPEC -> N_SPECIALTIES (12 core clinical specialties) for clarity.
- manuscript/build_figures_en.py: add plot_hospital_counts_vs_rates(); regenerate ha_Figure_3 (hospital) and ha_Figure_4 (policy simulation).
- manuscript/build_healthcare_analytics_submission.py: add Figure 3 (hospital counts vs rates), Table 3 (counterfactual 2034 physician counts by lever), and renumber policy simulation to Figure 4. Update title page counts and zip/pptx lists.
- Regenerate all submission artifacts from primary data.

Refs: PR follow-up after #348
Co-Authored-By: Tatsuki Onishi <bougtoir@gmail.com>
</commit_message>
<xml_diff>
--- a/medical_accident_its_analysis/manuscript/ha_manuscript_en.docx
+++ b/medical_accident_its_analysis/manuscript/ha_manuscript_en.docx
@@ -37,7 +37,7 @@
           <w:rFonts w:ascii="Times New Roman" w:hAnsi="Times New Roman"/>
           <w:sz w:val="24"/>
         </w:rPr>
-        <w:t>Specialty maldistribution is a global healthcare workforce-allocation problem, and many health systems assume that malpractice-litigation risk pushes physicians away from high-risk specialties. We used this question as a test case for a transparent, reproducible decision-analytics framework that evaluates a proposed workforce policy lever while avoiding size confounding and interpolation artifacts in sparse administrative panels. Using national primary data for {N_SPEC} specialties in Japan (2008–2024), we measured exposure as closed malpractice claims per 1,000 physicians (rate, not count) and regressed biennial log-change in physicians and hospitals on the lagged litigation rate in a panel with specialty and wave fixed effects, cluster-robust standard errors with a small-cluster t(G-1) correction, a cluster block-bootstrap robustness check, two one-sided equivalence (TOST) tests, and power diagnostics. The workforce grew in 11 of 12 specialties; general surgery, which changed by -2.3%, was the exception. Litigation rate was not associated with physician growth (coefficient -0.0009; 95% CI -0.0043 to +0.0025; p=0.56) or hospital growth (p=0.90). A one-SD higher rate changed physician growth by less than ±1% (TOST p=0.023; less than ±2% was p=&lt;0.001); the minimum detectable effect was 1.08% per SD at 80% power. Hospital growth was within ±2% (p=0.002) but not the stricter ±1% margin (p=0.059). Sensitivity analyses were unchanged. Specialty-level litigation risk is not associated with workforce decline in these national data. The decision-analytics framework is exportable to other healthcare workforce-policy levers.</w:t>
+        <w:t>Specialty maldistribution is a global healthcare workforce-allocation problem, and many health systems assume that malpractice-litigation risk pushes physicians away from high-risk specialties. We used this question as a test case for a transparent, reproducible decision-analytics framework that evaluates a proposed workforce policy lever while avoiding size confounding and interpolation artifacts in sparse administrative panels. Using national primary data for {N_SPECIALTIES} specialties in Japan (2008–2024), we measured exposure as closed malpractice claims per 1,000 physicians (rate, not count) and regressed biennial log-change in physicians and hospitals on the lagged litigation rate in a panel with specialty and wave fixed effects, cluster-robust standard errors with a small-cluster t(G-1) correction, a cluster block-bootstrap robustness check, two one-sided equivalence (TOST) tests, and power diagnostics. The workforce grew in 11 of 12 specialties; general surgery, which changed by -2.3%, was the exception. Litigation rate was not associated with physician growth (coefficient -0.0009; 95% CI -0.0043 to +0.0025; p=0.56) or hospital growth (p=0.90). A one-SD higher rate changed physician growth by less than ±1% (TOST p=0.023; less than ±2% was p=&lt;0.001); the minimum detectable effect was 1.08% per SD at 80% power. Hospital growth was within ±2% (p=0.002) but not the stricter ±1% margin (p=0.059). Sensitivity analyses were unchanged. Specialty-level litigation risk is not associated with workforce decline in these national data. The decision-analytics framework is exportable to other healthcare workforce-policy levers.</w:t>
       </w:r>
     </w:p>
     <w:p>
@@ -3104,6 +3104,73 @@
           <w:i w:val="0"/>
           <w:sz w:val="24"/>
         </w:rPr>
+        <w:t>The same count-versus-rate contrast for biennial hospital growth is shown in Figure 3. As with physician growth, the count exposure creates a spurious size confound that disappears once the rate-adjusted exposure is used.</w:t>
+      </w:r>
+    </w:p>
+    <w:p>
+      <w:pPr>
+        <w:spacing w:before="280" w:after="120"/>
+      </w:pPr>
+      <w:r>
+        <w:rPr>
+          <w:rFonts w:ascii="Times New Roman" w:hAnsi="Times New Roman"/>
+          <w:b/>
+          <w:sz w:val="20"/>
+        </w:rPr>
+        <w:t>Figure 3. Biennial hospital growth against lagged litigation exposure measured as (a) counts and (b) rates. Points are coloured by specialty; the rate-adjusted panel shows no systematic association.</w:t>
+      </w:r>
+    </w:p>
+    <w:p>
+      <w:pPr>
+        <w:jc w:val="center"/>
+      </w:pPr>
+      <w:r>
+        <w:drawing>
+          <wp:inline xmlns:a="http://schemas.openxmlformats.org/drawingml/2006/main" xmlns:pic="http://schemas.openxmlformats.org/drawingml/2006/picture">
+            <wp:extent cx="5303520" cy="2410691"/>
+            <wp:docPr id="3" name="Picture 3"/>
+            <wp:cNvGraphicFramePr>
+              <a:graphicFrameLocks noChangeAspect="1"/>
+            </wp:cNvGraphicFramePr>
+            <a:graphic>
+              <a:graphicData uri="http://schemas.openxmlformats.org/drawingml/2006/picture">
+                <pic:pic>
+                  <pic:nvPicPr>
+                    <pic:cNvPr id="0" name="ha_Figure_3.png"/>
+                    <pic:cNvPicPr/>
+                  </pic:nvPicPr>
+                  <pic:blipFill>
+                    <a:blip r:embed="rId11"/>
+                    <a:stretch>
+                      <a:fillRect/>
+                    </a:stretch>
+                  </pic:blipFill>
+                  <pic:spPr>
+                    <a:xfrm>
+                      <a:off x="0" y="0"/>
+                      <a:ext cx="5303520" cy="2410691"/>
+                    </a:xfrm>
+                    <a:prstGeom prst="rect"/>
+                  </pic:spPr>
+                </pic:pic>
+              </a:graphicData>
+            </a:graphic>
+          </wp:inline>
+        </w:drawing>
+      </w:r>
+    </w:p>
+    <w:p/>
+    <w:p>
+      <w:pPr>
+        <w:spacing w:line="480" w:lineRule="auto" w:after="120"/>
+      </w:pPr>
+      <w:r>
+        <w:rPr>
+          <w:rFonts w:ascii="Times New Roman" w:hAnsi="Times New Roman"/>
+          <w:b w:val="0"/>
+          <w:i w:val="0"/>
+          <w:sz w:val="24"/>
+        </w:rPr>
         <w:t>Descriptively, per-specialty rank correlations between the lagged litigation rate and physician growth were positive in 10 of 12 specialties and statistically significant in 0; the direction is therefore, if anything, opposite to a flight-from-risk hypothesis.</w:t>
       </w:r>
     </w:p>
@@ -3204,7 +3271,7 @@
           <w:i w:val="0"/>
           <w:sz w:val="24"/>
         </w:rPr>
-        <w:t>The counterfactual projection made the practical implications of the null regression result explicit. Under the point estimate, eliminating all malpractice litigation would add only 1.1% to the projected 2034 national physician stock relative to baseline drift. Even under the 95% lower-bound (most favourable) coefficient it would add 5.2%, comparable to the 5.5% gain from a generic lever equal to the minimum detectable effect. General surgery, the only specialty with negative baseline drift, illustrates the break-even arithmetic: its projected 2024-2034 decline of -2.2% would be reduced to -0.1% under the point estimate and reversed to 7.7% under the 95% lower bound. The latter requires eliminating every remaining closed claim and assumes the most adverse (most negative) coefficient compatible with the data; a more realistic policy would achieve far less. Figure 3 shows that litigation reduction is therefore not a high-leverage instrument for workforce allocation in this setting.</w:t>
+        <w:t>The counterfactual projection made the practical implications of the null regression result explicit. Under the point estimate, eliminating all malpractice litigation would add only 1.1% to the projected 2034 national physician stock relative to baseline drift. Even under the 95% lower-bound (most favourable) coefficient it would add 5.2%, comparable to the 5.5% gain from a generic lever equal to the minimum detectable effect. General surgery, the only specialty with negative baseline drift, illustrates the break-even arithmetic: its projected 2024-2034 decline of -2.2% would be reduced to -0.1% under the point estimate and reversed to 7.7% under the 95% lower bound. The latter requires eliminating every remaining closed claim and assumes the most adverse (most negative) coefficient compatible with the data; a more realistic policy would achieve far less. Table 3 reports projected 2034 physician counts by specialty and lever; Figure 4 shows the same information as marginal percentage changes. Litigation reduction is therefore not a high-leverage instrument for workforce allocation in this setting.</w:t>
       </w:r>
     </w:p>
     <w:p>
@@ -3217,7 +3284,1459 @@
           <w:b/>
           <w:sz w:val="20"/>
         </w:rPr>
-        <w:t>Figure 3. Counterfactual policy-lever simulation: marginal 10-year change in physician counts by specialty relative to the projected baseline drift. The MDE benchmark is the minimum detectable per-SD effect from the primary analysis.</w:t>
+        <w:t>Table 3. Counterfactual 2034 physician counts by specialty and policy lever. Counts are projected from observed biennial baseline drift plus the indicated effect; marginal percentage changes are shown in Figure 4.</w:t>
+      </w:r>
+    </w:p>
+    <w:tbl>
+      <w:tblPr>
+        <w:tblStyle w:val="TableGrid"/>
+        <w:tblW w:type="auto" w:w="0"/>
+        <w:tblLook w:firstColumn="1" w:firstRow="1" w:lastColumn="0" w:lastRow="0" w:noHBand="0" w:noVBand="1" w:val="04A0"/>
+      </w:tblPr>
+      <w:tblGrid>
+        <w:gridCol w:w="1560"/>
+        <w:gridCol w:w="1560"/>
+        <w:gridCol w:w="1560"/>
+        <w:gridCol w:w="1560"/>
+        <w:gridCol w:w="1560"/>
+        <w:gridCol w:w="1560"/>
+      </w:tblGrid>
+      <w:tr>
+        <w:tc>
+          <w:tcPr>
+            <w:tcW w:type="dxa" w:w="1560"/>
+          </w:tcPr>
+          <w:p>
+            <w:pPr>
+              <w:jc w:val="center"/>
+            </w:pPr>
+            <w:r>
+              <w:rPr>
+                <w:rFonts w:ascii="Times New Roman" w:hAnsi="Times New Roman"/>
+                <w:b/>
+                <w:sz w:val="18"/>
+              </w:rPr>
+              <w:t>Specialty</w:t>
+            </w:r>
+          </w:p>
+        </w:tc>
+        <w:tc>
+          <w:tcPr>
+            <w:tcW w:type="dxa" w:w="1560"/>
+          </w:tcPr>
+          <w:p>
+            <w:pPr>
+              <w:jc w:val="center"/>
+            </w:pPr>
+            <w:r>
+              <w:rPr>
+                <w:rFonts w:ascii="Times New Roman" w:hAnsi="Times New Roman"/>
+                <w:b/>
+                <w:sz w:val="18"/>
+              </w:rPr>
+              <w:t>2024 count</w:t>
+            </w:r>
+          </w:p>
+        </w:tc>
+        <w:tc>
+          <w:tcPr>
+            <w:tcW w:type="dxa" w:w="1560"/>
+          </w:tcPr>
+          <w:p>
+            <w:pPr>
+              <w:jc w:val="center"/>
+            </w:pPr>
+            <w:r>
+              <w:rPr>
+                <w:rFonts w:ascii="Times New Roman" w:hAnsi="Times New Roman"/>
+                <w:b/>
+                <w:sz w:val="18"/>
+              </w:rPr>
+              <w:t>Baseline 2034</w:t>
+            </w:r>
+          </w:p>
+        </w:tc>
+        <w:tc>
+          <w:tcPr>
+            <w:tcW w:type="dxa" w:w="1560"/>
+          </w:tcPr>
+          <w:p>
+            <w:pPr>
+              <w:jc w:val="center"/>
+            </w:pPr>
+            <w:r>
+              <w:rPr>
+                <w:rFonts w:ascii="Times New Roman" w:hAnsi="Times New Roman"/>
+                <w:b/>
+                <w:sz w:val="18"/>
+              </w:rPr>
+              <w:t>Litigation zero (point)</w:t>
+            </w:r>
+          </w:p>
+        </w:tc>
+        <w:tc>
+          <w:tcPr>
+            <w:tcW w:type="dxa" w:w="1560"/>
+          </w:tcPr>
+          <w:p>
+            <w:pPr>
+              <w:jc w:val="center"/>
+            </w:pPr>
+            <w:r>
+              <w:rPr>
+                <w:rFonts w:ascii="Times New Roman" w:hAnsi="Times New Roman"/>
+                <w:b/>
+                <w:sz w:val="18"/>
+              </w:rPr>
+              <w:t>Litigation zero (95% lower)</w:t>
+            </w:r>
+          </w:p>
+        </w:tc>
+        <w:tc>
+          <w:tcPr>
+            <w:tcW w:type="dxa" w:w="1560"/>
+          </w:tcPr>
+          <w:p>
+            <w:pPr>
+              <w:jc w:val="center"/>
+            </w:pPr>
+            <w:r>
+              <w:rPr>
+                <w:rFonts w:ascii="Times New Roman" w:hAnsi="Times New Roman"/>
+                <w:b/>
+                <w:sz w:val="18"/>
+              </w:rPr>
+              <w:t>MDE benchmark</w:t>
+            </w:r>
+          </w:p>
+        </w:tc>
+      </w:tr>
+      <w:tr>
+        <w:tc>
+          <w:tcPr>
+            <w:tcW w:type="dxa" w:w="1560"/>
+          </w:tcPr>
+          <w:p>
+            <w:r>
+              <w:rPr>
+                <w:rFonts w:ascii="Times New Roman" w:hAnsi="Times New Roman"/>
+                <w:sz w:val="18"/>
+              </w:rPr>
+              <w:t>Internal medicine</w:t>
+            </w:r>
+          </w:p>
+        </w:tc>
+        <w:tc>
+          <w:tcPr>
+            <w:tcW w:type="dxa" w:w="1560"/>
+          </w:tcPr>
+          <w:p>
+            <w:pPr>
+              <w:jc w:val="center"/>
+            </w:pPr>
+            <w:r>
+              <w:rPr>
+                <w:rFonts w:ascii="Times New Roman" w:hAnsi="Times New Roman"/>
+                <w:sz w:val="18"/>
+              </w:rPr>
+              <w:t>124,010</w:t>
+            </w:r>
+          </w:p>
+        </w:tc>
+        <w:tc>
+          <w:tcPr>
+            <w:tcW w:type="dxa" w:w="1560"/>
+          </w:tcPr>
+          <w:p>
+            <w:pPr>
+              <w:jc w:val="center"/>
+            </w:pPr>
+            <w:r>
+              <w:rPr>
+                <w:rFonts w:ascii="Times New Roman" w:hAnsi="Times New Roman"/>
+                <w:sz w:val="18"/>
+              </w:rPr>
+              <w:t>136,909</w:t>
+            </w:r>
+          </w:p>
+        </w:tc>
+        <w:tc>
+          <w:tcPr>
+            <w:tcW w:type="dxa" w:w="1560"/>
+          </w:tcPr>
+          <w:p>
+            <w:pPr>
+              <w:jc w:val="center"/>
+            </w:pPr>
+            <w:r>
+              <w:rPr>
+                <w:rFonts w:ascii="Times New Roman" w:hAnsi="Times New Roman"/>
+                <w:sz w:val="18"/>
+              </w:rPr>
+              <w:t>138,010</w:t>
+            </w:r>
+          </w:p>
+        </w:tc>
+        <w:tc>
+          <w:tcPr>
+            <w:tcW w:type="dxa" w:w="1560"/>
+          </w:tcPr>
+          <w:p>
+            <w:pPr>
+              <w:jc w:val="center"/>
+            </w:pPr>
+            <w:r>
+              <w:rPr>
+                <w:rFonts w:ascii="Times New Roman" w:hAnsi="Times New Roman"/>
+                <w:sz w:val="18"/>
+              </w:rPr>
+              <w:t>142,075</w:t>
+            </w:r>
+          </w:p>
+        </w:tc>
+        <w:tc>
+          <w:tcPr>
+            <w:tcW w:type="dxa" w:w="1560"/>
+          </w:tcPr>
+          <w:p>
+            <w:pPr>
+              <w:jc w:val="center"/>
+            </w:pPr>
+            <w:r>
+              <w:rPr>
+                <w:rFonts w:ascii="Times New Roman" w:hAnsi="Times New Roman"/>
+                <w:sz w:val="18"/>
+              </w:rPr>
+              <w:t>144,492</w:t>
+            </w:r>
+          </w:p>
+        </w:tc>
+      </w:tr>
+      <w:tr>
+        <w:tc>
+          <w:tcPr>
+            <w:tcW w:type="dxa" w:w="1560"/>
+          </w:tcPr>
+          <w:p>
+            <w:r>
+              <w:rPr>
+                <w:rFonts w:ascii="Times New Roman" w:hAnsi="Times New Roman"/>
+                <w:sz w:val="18"/>
+              </w:rPr>
+              <w:t>Surgery</w:t>
+            </w:r>
+          </w:p>
+        </w:tc>
+        <w:tc>
+          <w:tcPr>
+            <w:tcW w:type="dxa" w:w="1560"/>
+          </w:tcPr>
+          <w:p>
+            <w:pPr>
+              <w:jc w:val="center"/>
+            </w:pPr>
+            <w:r>
+              <w:rPr>
+                <w:rFonts w:ascii="Times New Roman" w:hAnsi="Times New Roman"/>
+                <w:sz w:val="18"/>
+              </w:rPr>
+              <w:t>26,885</w:t>
+            </w:r>
+          </w:p>
+        </w:tc>
+        <w:tc>
+          <w:tcPr>
+            <w:tcW w:type="dxa" w:w="1560"/>
+          </w:tcPr>
+          <w:p>
+            <w:pPr>
+              <w:jc w:val="center"/>
+            </w:pPr>
+            <w:r>
+              <w:rPr>
+                <w:rFonts w:ascii="Times New Roman" w:hAnsi="Times New Roman"/>
+                <w:sz w:val="18"/>
+              </w:rPr>
+              <w:t>26,299</w:t>
+            </w:r>
+          </w:p>
+        </w:tc>
+        <w:tc>
+          <w:tcPr>
+            <w:tcW w:type="dxa" w:w="1560"/>
+          </w:tcPr>
+          <w:p>
+            <w:pPr>
+              <w:jc w:val="center"/>
+            </w:pPr>
+            <w:r>
+              <w:rPr>
+                <w:rFonts w:ascii="Times New Roman" w:hAnsi="Times New Roman"/>
+                <w:sz w:val="18"/>
+              </w:rPr>
+              <w:t>26,853</w:t>
+            </w:r>
+          </w:p>
+        </w:tc>
+        <w:tc>
+          <w:tcPr>
+            <w:tcW w:type="dxa" w:w="1560"/>
+          </w:tcPr>
+          <w:p>
+            <w:pPr>
+              <w:jc w:val="center"/>
+            </w:pPr>
+            <w:r>
+              <w:rPr>
+                <w:rFonts w:ascii="Times New Roman" w:hAnsi="Times New Roman"/>
+                <w:sz w:val="18"/>
+              </w:rPr>
+              <w:t>28,960</w:t>
+            </w:r>
+          </w:p>
+        </w:tc>
+        <w:tc>
+          <w:tcPr>
+            <w:tcW w:type="dxa" w:w="1560"/>
+          </w:tcPr>
+          <w:p>
+            <w:pPr>
+              <w:jc w:val="center"/>
+            </w:pPr>
+            <w:r>
+              <w:rPr>
+                <w:rFonts w:ascii="Times New Roman" w:hAnsi="Times New Roman"/>
+                <w:sz w:val="18"/>
+              </w:rPr>
+              <w:t>27,755</w:t>
+            </w:r>
+          </w:p>
+        </w:tc>
+      </w:tr>
+      <w:tr>
+        <w:tc>
+          <w:tcPr>
+            <w:tcW w:type="dxa" w:w="1560"/>
+          </w:tcPr>
+          <w:p>
+            <w:r>
+              <w:rPr>
+                <w:rFonts w:ascii="Times New Roman" w:hAnsi="Times New Roman"/>
+                <w:sz w:val="18"/>
+              </w:rPr>
+              <w:t>Orthopaedics</w:t>
+            </w:r>
+          </w:p>
+        </w:tc>
+        <w:tc>
+          <w:tcPr>
+            <w:tcW w:type="dxa" w:w="1560"/>
+          </w:tcPr>
+          <w:p>
+            <w:pPr>
+              <w:jc w:val="center"/>
+            </w:pPr>
+            <w:r>
+              <w:rPr>
+                <w:rFonts w:ascii="Times New Roman" w:hAnsi="Times New Roman"/>
+                <w:sz w:val="18"/>
+              </w:rPr>
+              <w:t>22,630</w:t>
+            </w:r>
+          </w:p>
+        </w:tc>
+        <w:tc>
+          <w:tcPr>
+            <w:tcW w:type="dxa" w:w="1560"/>
+          </w:tcPr>
+          <w:p>
+            <w:pPr>
+              <w:jc w:val="center"/>
+            </w:pPr>
+            <w:r>
+              <w:rPr>
+                <w:rFonts w:ascii="Times New Roman" w:hAnsi="Times New Roman"/>
+                <w:sz w:val="18"/>
+              </w:rPr>
+              <w:t>24,848</w:t>
+            </w:r>
+          </w:p>
+        </w:tc>
+        <w:tc>
+          <w:tcPr>
+            <w:tcW w:type="dxa" w:w="1560"/>
+          </w:tcPr>
+          <w:p>
+            <w:pPr>
+              <w:jc w:val="center"/>
+            </w:pPr>
+            <w:r>
+              <w:rPr>
+                <w:rFonts w:ascii="Times New Roman" w:hAnsi="Times New Roman"/>
+                <w:sz w:val="18"/>
+              </w:rPr>
+              <w:t>25,346</w:t>
+            </w:r>
+          </w:p>
+        </w:tc>
+        <w:tc>
+          <w:tcPr>
+            <w:tcW w:type="dxa" w:w="1560"/>
+          </w:tcPr>
+          <w:p>
+            <w:pPr>
+              <w:jc w:val="center"/>
+            </w:pPr>
+            <w:r>
+              <w:rPr>
+                <w:rFonts w:ascii="Times New Roman" w:hAnsi="Times New Roman"/>
+                <w:sz w:val="18"/>
+              </w:rPr>
+              <w:t>27,239</w:t>
+            </w:r>
+          </w:p>
+        </w:tc>
+        <w:tc>
+          <w:tcPr>
+            <w:tcW w:type="dxa" w:w="1560"/>
+          </w:tcPr>
+          <w:p>
+            <w:pPr>
+              <w:jc w:val="center"/>
+            </w:pPr>
+            <w:r>
+              <w:rPr>
+                <w:rFonts w:ascii="Times New Roman" w:hAnsi="Times New Roman"/>
+                <w:sz w:val="18"/>
+              </w:rPr>
+              <w:t>26,224</w:t>
+            </w:r>
+          </w:p>
+        </w:tc>
+      </w:tr>
+      <w:tr>
+        <w:tc>
+          <w:tcPr>
+            <w:tcW w:type="dxa" w:w="1560"/>
+          </w:tcPr>
+          <w:p>
+            <w:r>
+              <w:rPr>
+                <w:rFonts w:ascii="Times New Roman" w:hAnsi="Times New Roman"/>
+                <w:sz w:val="18"/>
+              </w:rPr>
+              <w:t>Plastic surgery</w:t>
+            </w:r>
+          </w:p>
+        </w:tc>
+        <w:tc>
+          <w:tcPr>
+            <w:tcW w:type="dxa" w:w="1560"/>
+          </w:tcPr>
+          <w:p>
+            <w:pPr>
+              <w:jc w:val="center"/>
+            </w:pPr>
+            <w:r>
+              <w:rPr>
+                <w:rFonts w:ascii="Times New Roman" w:hAnsi="Times New Roman"/>
+                <w:sz w:val="18"/>
+              </w:rPr>
+              <w:t>5,074</w:t>
+            </w:r>
+          </w:p>
+        </w:tc>
+        <w:tc>
+          <w:tcPr>
+            <w:tcW w:type="dxa" w:w="1560"/>
+          </w:tcPr>
+          <w:p>
+            <w:pPr>
+              <w:jc w:val="center"/>
+            </w:pPr>
+            <w:r>
+              <w:rPr>
+                <w:rFonts w:ascii="Times New Roman" w:hAnsi="Times New Roman"/>
+                <w:sz w:val="18"/>
+              </w:rPr>
+              <w:t>7,874</w:t>
+            </w:r>
+          </w:p>
+        </w:tc>
+        <w:tc>
+          <w:tcPr>
+            <w:tcW w:type="dxa" w:w="1560"/>
+          </w:tcPr>
+          <w:p>
+            <w:pPr>
+              <w:jc w:val="center"/>
+            </w:pPr>
+            <w:r>
+              <w:rPr>
+                <w:rFonts w:ascii="Times New Roman" w:hAnsi="Times New Roman"/>
+                <w:sz w:val="18"/>
+              </w:rPr>
+              <w:t>8,177</w:t>
+            </w:r>
+          </w:p>
+        </w:tc>
+        <w:tc>
+          <w:tcPr>
+            <w:tcW w:type="dxa" w:w="1560"/>
+          </w:tcPr>
+          <w:p>
+            <w:pPr>
+              <w:jc w:val="center"/>
+            </w:pPr>
+            <w:r>
+              <w:rPr>
+                <w:rFonts w:ascii="Times New Roman" w:hAnsi="Times New Roman"/>
+                <w:sz w:val="18"/>
+              </w:rPr>
+              <w:t>9,376</w:t>
+            </w:r>
+          </w:p>
+        </w:tc>
+        <w:tc>
+          <w:tcPr>
+            <w:tcW w:type="dxa" w:w="1560"/>
+          </w:tcPr>
+          <w:p>
+            <w:pPr>
+              <w:jc w:val="center"/>
+            </w:pPr>
+            <w:r>
+              <w:rPr>
+                <w:rFonts w:ascii="Times New Roman" w:hAnsi="Times New Roman"/>
+                <w:sz w:val="18"/>
+              </w:rPr>
+              <w:t>8,310</w:t>
+            </w:r>
+          </w:p>
+        </w:tc>
+      </w:tr>
+      <w:tr>
+        <w:tc>
+          <w:tcPr>
+            <w:tcW w:type="dxa" w:w="1560"/>
+          </w:tcPr>
+          <w:p>
+            <w:r>
+              <w:rPr>
+                <w:rFonts w:ascii="Times New Roman" w:hAnsi="Times New Roman"/>
+                <w:sz w:val="18"/>
+              </w:rPr>
+              <w:t>Obstetrics &amp; gynaecology</w:t>
+            </w:r>
+          </w:p>
+        </w:tc>
+        <w:tc>
+          <w:tcPr>
+            <w:tcW w:type="dxa" w:w="1560"/>
+          </w:tcPr>
+          <w:p>
+            <w:pPr>
+              <w:jc w:val="center"/>
+            </w:pPr>
+            <w:r>
+              <w:rPr>
+                <w:rFonts w:ascii="Times New Roman" w:hAnsi="Times New Roman"/>
+                <w:sz w:val="18"/>
+              </w:rPr>
+              <w:t>13,908</w:t>
+            </w:r>
+          </w:p>
+        </w:tc>
+        <w:tc>
+          <w:tcPr>
+            <w:tcW w:type="dxa" w:w="1560"/>
+          </w:tcPr>
+          <w:p>
+            <w:pPr>
+              <w:jc w:val="center"/>
+            </w:pPr>
+            <w:r>
+              <w:rPr>
+                <w:rFonts w:ascii="Times New Roman" w:hAnsi="Times New Roman"/>
+                <w:sz w:val="18"/>
+              </w:rPr>
+              <w:t>14,877</w:t>
+            </w:r>
+          </w:p>
+        </w:tc>
+        <w:tc>
+          <w:tcPr>
+            <w:tcW w:type="dxa" w:w="1560"/>
+          </w:tcPr>
+          <w:p>
+            <w:pPr>
+              <w:jc w:val="center"/>
+            </w:pPr>
+            <w:r>
+              <w:rPr>
+                <w:rFonts w:ascii="Times New Roman" w:hAnsi="Times New Roman"/>
+                <w:sz w:val="18"/>
+              </w:rPr>
+              <w:t>15,191</w:t>
+            </w:r>
+          </w:p>
+        </w:tc>
+        <w:tc>
+          <w:tcPr>
+            <w:tcW w:type="dxa" w:w="1560"/>
+          </w:tcPr>
+          <w:p>
+            <w:pPr>
+              <w:jc w:val="center"/>
+            </w:pPr>
+            <w:r>
+              <w:rPr>
+                <w:rFonts w:ascii="Times New Roman" w:hAnsi="Times New Roman"/>
+                <w:sz w:val="18"/>
+              </w:rPr>
+              <w:t>16,387</w:t>
+            </w:r>
+          </w:p>
+        </w:tc>
+        <w:tc>
+          <w:tcPr>
+            <w:tcW w:type="dxa" w:w="1560"/>
+          </w:tcPr>
+          <w:p>
+            <w:pPr>
+              <w:jc w:val="center"/>
+            </w:pPr>
+            <w:r>
+              <w:rPr>
+                <w:rFonts w:ascii="Times New Roman" w:hAnsi="Times New Roman"/>
+                <w:sz w:val="18"/>
+              </w:rPr>
+              <w:t>15,700</w:t>
+            </w:r>
+          </w:p>
+        </w:tc>
+      </w:tr>
+      <w:tr>
+        <w:tc>
+          <w:tcPr>
+            <w:tcW w:type="dxa" w:w="1560"/>
+          </w:tcPr>
+          <w:p>
+            <w:r>
+              <w:rPr>
+                <w:rFonts w:ascii="Times New Roman" w:hAnsi="Times New Roman"/>
+                <w:sz w:val="18"/>
+              </w:rPr>
+              <w:t>Paediatrics</w:t>
+            </w:r>
+          </w:p>
+        </w:tc>
+        <w:tc>
+          <w:tcPr>
+            <w:tcW w:type="dxa" w:w="1560"/>
+          </w:tcPr>
+          <w:p>
+            <w:pPr>
+              <w:jc w:val="center"/>
+            </w:pPr>
+            <w:r>
+              <w:rPr>
+                <w:rFonts w:ascii="Times New Roman" w:hAnsi="Times New Roman"/>
+                <w:sz w:val="18"/>
+              </w:rPr>
+              <w:t>18,009</w:t>
+            </w:r>
+          </w:p>
+        </w:tc>
+        <w:tc>
+          <w:tcPr>
+            <w:tcW w:type="dxa" w:w="1560"/>
+          </w:tcPr>
+          <w:p>
+            <w:pPr>
+              <w:jc w:val="center"/>
+            </w:pPr>
+            <w:r>
+              <w:rPr>
+                <w:rFonts w:ascii="Times New Roman" w:hAnsi="Times New Roman"/>
+                <w:sz w:val="18"/>
+              </w:rPr>
+              <w:t>19,949</w:t>
+            </w:r>
+          </w:p>
+        </w:tc>
+        <w:tc>
+          <w:tcPr>
+            <w:tcW w:type="dxa" w:w="1560"/>
+          </w:tcPr>
+          <w:p>
+            <w:pPr>
+              <w:jc w:val="center"/>
+            </w:pPr>
+            <w:r>
+              <w:rPr>
+                <w:rFonts w:ascii="Times New Roman" w:hAnsi="Times New Roman"/>
+                <w:sz w:val="18"/>
+              </w:rPr>
+              <w:t>20,023</w:t>
+            </w:r>
+          </w:p>
+        </w:tc>
+        <w:tc>
+          <w:tcPr>
+            <w:tcW w:type="dxa" w:w="1560"/>
+          </w:tcPr>
+          <w:p>
+            <w:pPr>
+              <w:jc w:val="center"/>
+            </w:pPr>
+            <w:r>
+              <w:rPr>
+                <w:rFonts w:ascii="Times New Roman" w:hAnsi="Times New Roman"/>
+                <w:sz w:val="18"/>
+              </w:rPr>
+              <w:t>20,295</w:t>
+            </w:r>
+          </w:p>
+        </w:tc>
+        <w:tc>
+          <w:tcPr>
+            <w:tcW w:type="dxa" w:w="1560"/>
+          </w:tcPr>
+          <w:p>
+            <w:pPr>
+              <w:jc w:val="center"/>
+            </w:pPr>
+            <w:r>
+              <w:rPr>
+                <w:rFonts w:ascii="Times New Roman" w:hAnsi="Times New Roman"/>
+                <w:sz w:val="18"/>
+              </w:rPr>
+              <w:t>21,054</w:t>
+            </w:r>
+          </w:p>
+        </w:tc>
+      </w:tr>
+      <w:tr>
+        <w:tc>
+          <w:tcPr>
+            <w:tcW w:type="dxa" w:w="1560"/>
+          </w:tcPr>
+          <w:p>
+            <w:r>
+              <w:rPr>
+                <w:rFonts w:ascii="Times New Roman" w:hAnsi="Times New Roman"/>
+                <w:sz w:val="18"/>
+              </w:rPr>
+              <w:t>Psychiatry</w:t>
+            </w:r>
+          </w:p>
+        </w:tc>
+        <w:tc>
+          <w:tcPr>
+            <w:tcW w:type="dxa" w:w="1560"/>
+          </w:tcPr>
+          <w:p>
+            <w:pPr>
+              <w:jc w:val="center"/>
+            </w:pPr>
+            <w:r>
+              <w:rPr>
+                <w:rFonts w:ascii="Times New Roman" w:hAnsi="Times New Roman"/>
+                <w:sz w:val="18"/>
+              </w:rPr>
+              <w:t>17,259</w:t>
+            </w:r>
+          </w:p>
+        </w:tc>
+        <w:tc>
+          <w:tcPr>
+            <w:tcW w:type="dxa" w:w="1560"/>
+          </w:tcPr>
+          <w:p>
+            <w:pPr>
+              <w:jc w:val="center"/>
+            </w:pPr>
+            <w:r>
+              <w:rPr>
+                <w:rFonts w:ascii="Times New Roman" w:hAnsi="Times New Roman"/>
+                <w:sz w:val="18"/>
+              </w:rPr>
+              <w:t>20,199</w:t>
+            </w:r>
+          </w:p>
+        </w:tc>
+        <w:tc>
+          <w:tcPr>
+            <w:tcW w:type="dxa" w:w="1560"/>
+          </w:tcPr>
+          <w:p>
+            <w:pPr>
+              <w:jc w:val="center"/>
+            </w:pPr>
+            <w:r>
+              <w:rPr>
+                <w:rFonts w:ascii="Times New Roman" w:hAnsi="Times New Roman"/>
+                <w:sz w:val="18"/>
+              </w:rPr>
+              <w:t>20,391</w:t>
+            </w:r>
+          </w:p>
+        </w:tc>
+        <w:tc>
+          <w:tcPr>
+            <w:tcW w:type="dxa" w:w="1560"/>
+          </w:tcPr>
+          <w:p>
+            <w:pPr>
+              <w:jc w:val="center"/>
+            </w:pPr>
+            <w:r>
+              <w:rPr>
+                <w:rFonts w:ascii="Times New Roman" w:hAnsi="Times New Roman"/>
+                <w:sz w:val="18"/>
+              </w:rPr>
+              <w:t>21,102</w:t>
+            </w:r>
+          </w:p>
+        </w:tc>
+        <w:tc>
+          <w:tcPr>
+            <w:tcW w:type="dxa" w:w="1560"/>
+          </w:tcPr>
+          <w:p>
+            <w:pPr>
+              <w:jc w:val="center"/>
+            </w:pPr>
+            <w:r>
+              <w:rPr>
+                <w:rFonts w:ascii="Times New Roman" w:hAnsi="Times New Roman"/>
+                <w:sz w:val="18"/>
+              </w:rPr>
+              <w:t>21,317</w:t>
+            </w:r>
+          </w:p>
+        </w:tc>
+      </w:tr>
+      <w:tr>
+        <w:tc>
+          <w:tcPr>
+            <w:tcW w:type="dxa" w:w="1560"/>
+          </w:tcPr>
+          <w:p>
+            <w:r>
+              <w:rPr>
+                <w:rFonts w:ascii="Times New Roman" w:hAnsi="Times New Roman"/>
+                <w:sz w:val="18"/>
+              </w:rPr>
+              <w:t>Ophthalmology</w:t>
+            </w:r>
+          </w:p>
+        </w:tc>
+        <w:tc>
+          <w:tcPr>
+            <w:tcW w:type="dxa" w:w="1560"/>
+          </w:tcPr>
+          <w:p>
+            <w:pPr>
+              <w:jc w:val="center"/>
+            </w:pPr>
+            <w:r>
+              <w:rPr>
+                <w:rFonts w:ascii="Times New Roman" w:hAnsi="Times New Roman"/>
+                <w:sz w:val="18"/>
+              </w:rPr>
+              <w:t>13,436</w:t>
+            </w:r>
+          </w:p>
+        </w:tc>
+        <w:tc>
+          <w:tcPr>
+            <w:tcW w:type="dxa" w:w="1560"/>
+          </w:tcPr>
+          <w:p>
+            <w:pPr>
+              <w:jc w:val="center"/>
+            </w:pPr>
+            <w:r>
+              <w:rPr>
+                <w:rFonts w:ascii="Times New Roman" w:hAnsi="Times New Roman"/>
+                <w:sz w:val="18"/>
+              </w:rPr>
+              <w:t>13,957</w:t>
+            </w:r>
+          </w:p>
+        </w:tc>
+        <w:tc>
+          <w:tcPr>
+            <w:tcW w:type="dxa" w:w="1560"/>
+          </w:tcPr>
+          <w:p>
+            <w:pPr>
+              <w:jc w:val="center"/>
+            </w:pPr>
+            <w:r>
+              <w:rPr>
+                <w:rFonts w:ascii="Times New Roman" w:hAnsi="Times New Roman"/>
+                <w:sz w:val="18"/>
+              </w:rPr>
+              <w:t>14,058</w:t>
+            </w:r>
+          </w:p>
+        </w:tc>
+        <w:tc>
+          <w:tcPr>
+            <w:tcW w:type="dxa" w:w="1560"/>
+          </w:tcPr>
+          <w:p>
+            <w:pPr>
+              <w:jc w:val="center"/>
+            </w:pPr>
+            <w:r>
+              <w:rPr>
+                <w:rFonts w:ascii="Times New Roman" w:hAnsi="Times New Roman"/>
+                <w:sz w:val="18"/>
+              </w:rPr>
+              <w:t>14,430</w:t>
+            </w:r>
+          </w:p>
+        </w:tc>
+        <w:tc>
+          <w:tcPr>
+            <w:tcW w:type="dxa" w:w="1560"/>
+          </w:tcPr>
+          <w:p>
+            <w:pPr>
+              <w:jc w:val="center"/>
+            </w:pPr>
+            <w:r>
+              <w:rPr>
+                <w:rFonts w:ascii="Times New Roman" w:hAnsi="Times New Roman"/>
+                <w:sz w:val="18"/>
+              </w:rPr>
+              <w:t>14,730</w:t>
+            </w:r>
+          </w:p>
+        </w:tc>
+      </w:tr>
+      <w:tr>
+        <w:tc>
+          <w:tcPr>
+            <w:tcW w:type="dxa" w:w="1560"/>
+          </w:tcPr>
+          <w:p>
+            <w:r>
+              <w:rPr>
+                <w:rFonts w:ascii="Times New Roman" w:hAnsi="Times New Roman"/>
+                <w:sz w:val="18"/>
+              </w:rPr>
+              <w:t>Otolaryngology</w:t>
+            </w:r>
+          </w:p>
+        </w:tc>
+        <w:tc>
+          <w:tcPr>
+            <w:tcW w:type="dxa" w:w="1560"/>
+          </w:tcPr>
+          <w:p>
+            <w:pPr>
+              <w:jc w:val="center"/>
+            </w:pPr>
+            <w:r>
+              <w:rPr>
+                <w:rFonts w:ascii="Times New Roman" w:hAnsi="Times New Roman"/>
+                <w:sz w:val="18"/>
+              </w:rPr>
+              <w:t>9,330</w:t>
+            </w:r>
+          </w:p>
+        </w:tc>
+        <w:tc>
+          <w:tcPr>
+            <w:tcW w:type="dxa" w:w="1560"/>
+          </w:tcPr>
+          <w:p>
+            <w:pPr>
+              <w:jc w:val="center"/>
+            </w:pPr>
+            <w:r>
+              <w:rPr>
+                <w:rFonts w:ascii="Times New Roman" w:hAnsi="Times New Roman"/>
+                <w:sz w:val="18"/>
+              </w:rPr>
+              <w:t>9,460</w:t>
+            </w:r>
+          </w:p>
+        </w:tc>
+        <w:tc>
+          <w:tcPr>
+            <w:tcW w:type="dxa" w:w="1560"/>
+          </w:tcPr>
+          <w:p>
+            <w:pPr>
+              <w:jc w:val="center"/>
+            </w:pPr>
+            <w:r>
+              <w:rPr>
+                <w:rFonts w:ascii="Times New Roman" w:hAnsi="Times New Roman"/>
+                <w:sz w:val="18"/>
+              </w:rPr>
+              <w:t>9,520</w:t>
+            </w:r>
+          </w:p>
+        </w:tc>
+        <w:tc>
+          <w:tcPr>
+            <w:tcW w:type="dxa" w:w="1560"/>
+          </w:tcPr>
+          <w:p>
+            <w:pPr>
+              <w:jc w:val="center"/>
+            </w:pPr>
+            <w:r>
+              <w:rPr>
+                <w:rFonts w:ascii="Times New Roman" w:hAnsi="Times New Roman"/>
+                <w:sz w:val="18"/>
+              </w:rPr>
+              <w:t>9,744</w:t>
+            </w:r>
+          </w:p>
+        </w:tc>
+        <w:tc>
+          <w:tcPr>
+            <w:tcW w:type="dxa" w:w="1560"/>
+          </w:tcPr>
+          <w:p>
+            <w:pPr>
+              <w:jc w:val="center"/>
+            </w:pPr>
+            <w:r>
+              <w:rPr>
+                <w:rFonts w:ascii="Times New Roman" w:hAnsi="Times New Roman"/>
+                <w:sz w:val="18"/>
+              </w:rPr>
+              <w:t>9,984</w:t>
+            </w:r>
+          </w:p>
+        </w:tc>
+      </w:tr>
+      <w:tr>
+        <w:tc>
+          <w:tcPr>
+            <w:tcW w:type="dxa" w:w="1560"/>
+          </w:tcPr>
+          <w:p>
+            <w:r>
+              <w:rPr>
+                <w:rFonts w:ascii="Times New Roman" w:hAnsi="Times New Roman"/>
+                <w:sz w:val="18"/>
+              </w:rPr>
+              <w:t>Urology</w:t>
+            </w:r>
+          </w:p>
+        </w:tc>
+        <w:tc>
+          <w:tcPr>
+            <w:tcW w:type="dxa" w:w="1560"/>
+          </w:tcPr>
+          <w:p>
+            <w:pPr>
+              <w:jc w:val="center"/>
+            </w:pPr>
+            <w:r>
+              <w:rPr>
+                <w:rFonts w:ascii="Times New Roman" w:hAnsi="Times New Roman"/>
+                <w:sz w:val="18"/>
+              </w:rPr>
+              <w:t>8,069</w:t>
+            </w:r>
+          </w:p>
+        </w:tc>
+        <w:tc>
+          <w:tcPr>
+            <w:tcW w:type="dxa" w:w="1560"/>
+          </w:tcPr>
+          <w:p>
+            <w:pPr>
+              <w:jc w:val="center"/>
+            </w:pPr>
+            <w:r>
+              <w:rPr>
+                <w:rFonts w:ascii="Times New Roman" w:hAnsi="Times New Roman"/>
+                <w:sz w:val="18"/>
+              </w:rPr>
+              <w:t>9,333</w:t>
+            </w:r>
+          </w:p>
+        </w:tc>
+        <w:tc>
+          <w:tcPr>
+            <w:tcW w:type="dxa" w:w="1560"/>
+          </w:tcPr>
+          <w:p>
+            <w:pPr>
+              <w:jc w:val="center"/>
+            </w:pPr>
+            <w:r>
+              <w:rPr>
+                <w:rFonts w:ascii="Times New Roman" w:hAnsi="Times New Roman"/>
+                <w:sz w:val="18"/>
+              </w:rPr>
+              <w:t>9,425</w:t>
+            </w:r>
+          </w:p>
+        </w:tc>
+        <w:tc>
+          <w:tcPr>
+            <w:tcW w:type="dxa" w:w="1560"/>
+          </w:tcPr>
+          <w:p>
+            <w:pPr>
+              <w:jc w:val="center"/>
+            </w:pPr>
+            <w:r>
+              <w:rPr>
+                <w:rFonts w:ascii="Times New Roman" w:hAnsi="Times New Roman"/>
+                <w:sz w:val="18"/>
+              </w:rPr>
+              <w:t>9,766</w:t>
+            </w:r>
+          </w:p>
+        </w:tc>
+        <w:tc>
+          <w:tcPr>
+            <w:tcW w:type="dxa" w:w="1560"/>
+          </w:tcPr>
+          <w:p>
+            <w:pPr>
+              <w:jc w:val="center"/>
+            </w:pPr>
+            <w:r>
+              <w:rPr>
+                <w:rFonts w:ascii="Times New Roman" w:hAnsi="Times New Roman"/>
+                <w:sz w:val="18"/>
+              </w:rPr>
+              <w:t>9,849</w:t>
+            </w:r>
+          </w:p>
+        </w:tc>
+      </w:tr>
+      <w:tr>
+        <w:tc>
+          <w:tcPr>
+            <w:tcW w:type="dxa" w:w="1560"/>
+          </w:tcPr>
+          <w:p>
+            <w:r>
+              <w:rPr>
+                <w:rFonts w:ascii="Times New Roman" w:hAnsi="Times New Roman"/>
+                <w:sz w:val="18"/>
+              </w:rPr>
+              <w:t>Dermatology</w:t>
+            </w:r>
+          </w:p>
+        </w:tc>
+        <w:tc>
+          <w:tcPr>
+            <w:tcW w:type="dxa" w:w="1560"/>
+          </w:tcPr>
+          <w:p>
+            <w:pPr>
+              <w:jc w:val="center"/>
+            </w:pPr>
+            <w:r>
+              <w:rPr>
+                <w:rFonts w:ascii="Times New Roman" w:hAnsi="Times New Roman"/>
+                <w:sz w:val="18"/>
+              </w:rPr>
+              <w:t>10,043</w:t>
+            </w:r>
+          </w:p>
+        </w:tc>
+        <w:tc>
+          <w:tcPr>
+            <w:tcW w:type="dxa" w:w="1560"/>
+          </w:tcPr>
+          <w:p>
+            <w:pPr>
+              <w:jc w:val="center"/>
+            </w:pPr>
+            <w:r>
+              <w:rPr>
+                <w:rFonts w:ascii="Times New Roman" w:hAnsi="Times New Roman"/>
+                <w:sz w:val="18"/>
+              </w:rPr>
+              <w:t>11,411</w:t>
+            </w:r>
+          </w:p>
+        </w:tc>
+        <w:tc>
+          <w:tcPr>
+            <w:tcW w:type="dxa" w:w="1560"/>
+          </w:tcPr>
+          <w:p>
+            <w:pPr>
+              <w:jc w:val="center"/>
+            </w:pPr>
+            <w:r>
+              <w:rPr>
+                <w:rFonts w:ascii="Times New Roman" w:hAnsi="Times New Roman"/>
+                <w:sz w:val="18"/>
+              </w:rPr>
+              <w:t>11,479</w:t>
+            </w:r>
+          </w:p>
+        </w:tc>
+        <w:tc>
+          <w:tcPr>
+            <w:tcW w:type="dxa" w:w="1560"/>
+          </w:tcPr>
+          <w:p>
+            <w:pPr>
+              <w:jc w:val="center"/>
+            </w:pPr>
+            <w:r>
+              <w:rPr>
+                <w:rFonts w:ascii="Times New Roman" w:hAnsi="Times New Roman"/>
+                <w:sz w:val="18"/>
+              </w:rPr>
+              <w:t>11,732</w:t>
+            </w:r>
+          </w:p>
+        </w:tc>
+        <w:tc>
+          <w:tcPr>
+            <w:tcW w:type="dxa" w:w="1560"/>
+          </w:tcPr>
+          <w:p>
+            <w:pPr>
+              <w:jc w:val="center"/>
+            </w:pPr>
+            <w:r>
+              <w:rPr>
+                <w:rFonts w:ascii="Times New Roman" w:hAnsi="Times New Roman"/>
+                <w:sz w:val="18"/>
+              </w:rPr>
+              <w:t>12,042</w:t>
+            </w:r>
+          </w:p>
+        </w:tc>
+      </w:tr>
+      <w:tr>
+        <w:tc>
+          <w:tcPr>
+            <w:tcW w:type="dxa" w:w="1560"/>
+          </w:tcPr>
+          <w:p>
+            <w:r>
+              <w:rPr>
+                <w:rFonts w:ascii="Times New Roman" w:hAnsi="Times New Roman"/>
+                <w:sz w:val="18"/>
+              </w:rPr>
+              <w:t>Anaesthesiology</w:t>
+            </w:r>
+          </w:p>
+        </w:tc>
+        <w:tc>
+          <w:tcPr>
+            <w:tcW w:type="dxa" w:w="1560"/>
+          </w:tcPr>
+          <w:p>
+            <w:pPr>
+              <w:jc w:val="center"/>
+            </w:pPr>
+            <w:r>
+              <w:rPr>
+                <w:rFonts w:ascii="Times New Roman" w:hAnsi="Times New Roman"/>
+                <w:sz w:val="18"/>
+              </w:rPr>
+              <w:t>10,628</w:t>
+            </w:r>
+          </w:p>
+        </w:tc>
+        <w:tc>
+          <w:tcPr>
+            <w:tcW w:type="dxa" w:w="1560"/>
+          </w:tcPr>
+          <w:p>
+            <w:pPr>
+              <w:jc w:val="center"/>
+            </w:pPr>
+            <w:r>
+              <w:rPr>
+                <w:rFonts w:ascii="Times New Roman" w:hAnsi="Times New Roman"/>
+                <w:sz w:val="18"/>
+              </w:rPr>
+              <w:t>13,699</w:t>
+            </w:r>
+          </w:p>
+        </w:tc>
+        <w:tc>
+          <w:tcPr>
+            <w:tcW w:type="dxa" w:w="1560"/>
+          </w:tcPr>
+          <w:p>
+            <w:pPr>
+              <w:jc w:val="center"/>
+            </w:pPr>
+            <w:r>
+              <w:rPr>
+                <w:rFonts w:ascii="Times New Roman" w:hAnsi="Times New Roman"/>
+                <w:sz w:val="18"/>
+              </w:rPr>
+              <w:t>13,745</w:t>
+            </w:r>
+          </w:p>
+        </w:tc>
+        <w:tc>
+          <w:tcPr>
+            <w:tcW w:type="dxa" w:w="1560"/>
+          </w:tcPr>
+          <w:p>
+            <w:pPr>
+              <w:jc w:val="center"/>
+            </w:pPr>
+            <w:r>
+              <w:rPr>
+                <w:rFonts w:ascii="Times New Roman" w:hAnsi="Times New Roman"/>
+                <w:sz w:val="18"/>
+              </w:rPr>
+              <w:t>13,915</w:t>
+            </w:r>
+          </w:p>
+        </w:tc>
+        <w:tc>
+          <w:tcPr>
+            <w:tcW w:type="dxa" w:w="1560"/>
+          </w:tcPr>
+          <w:p>
+            <w:pPr>
+              <w:jc w:val="center"/>
+            </w:pPr>
+            <w:r>
+              <w:rPr>
+                <w:rFonts w:ascii="Times New Roman" w:hAnsi="Times New Roman"/>
+                <w:sz w:val="18"/>
+              </w:rPr>
+              <w:t>14,458</w:t>
+            </w:r>
+          </w:p>
+        </w:tc>
+      </w:tr>
+      <w:tr>
+        <w:tc>
+          <w:tcPr>
+            <w:tcW w:type="dxa" w:w="1560"/>
+          </w:tcPr>
+          <w:p>
+            <w:r>
+              <w:rPr>
+                <w:rFonts w:ascii="Times New Roman" w:hAnsi="Times New Roman"/>
+                <w:sz w:val="18"/>
+              </w:rPr>
+              <w:t>All specialties</w:t>
+            </w:r>
+          </w:p>
+        </w:tc>
+        <w:tc>
+          <w:tcPr>
+            <w:tcW w:type="dxa" w:w="1560"/>
+          </w:tcPr>
+          <w:p>
+            <w:pPr>
+              <w:jc w:val="center"/>
+            </w:pPr>
+            <w:r>
+              <w:rPr>
+                <w:rFonts w:ascii="Times New Roman" w:hAnsi="Times New Roman"/>
+                <w:sz w:val="18"/>
+              </w:rPr>
+              <w:t>279,281</w:t>
+            </w:r>
+          </w:p>
+        </w:tc>
+        <w:tc>
+          <w:tcPr>
+            <w:tcW w:type="dxa" w:w="1560"/>
+          </w:tcPr>
+          <w:p>
+            <w:pPr>
+              <w:jc w:val="center"/>
+            </w:pPr>
+            <w:r>
+              <w:rPr>
+                <w:rFonts w:ascii="Times New Roman" w:hAnsi="Times New Roman"/>
+                <w:sz w:val="18"/>
+              </w:rPr>
+              <w:t>308,815</w:t>
+            </w:r>
+          </w:p>
+        </w:tc>
+        <w:tc>
+          <w:tcPr>
+            <w:tcW w:type="dxa" w:w="1560"/>
+          </w:tcPr>
+          <w:p>
+            <w:pPr>
+              <w:jc w:val="center"/>
+            </w:pPr>
+            <w:r>
+              <w:rPr>
+                <w:rFonts w:ascii="Times New Roman" w:hAnsi="Times New Roman"/>
+                <w:sz w:val="18"/>
+              </w:rPr>
+              <w:t>312,218</w:t>
+            </w:r>
+          </w:p>
+        </w:tc>
+        <w:tc>
+          <w:tcPr>
+            <w:tcW w:type="dxa" w:w="1560"/>
+          </w:tcPr>
+          <w:p>
+            <w:pPr>
+              <w:jc w:val="center"/>
+            </w:pPr>
+            <w:r>
+              <w:rPr>
+                <w:rFonts w:ascii="Times New Roman" w:hAnsi="Times New Roman"/>
+                <w:sz w:val="18"/>
+              </w:rPr>
+              <w:t>325,021</w:t>
+            </w:r>
+          </w:p>
+        </w:tc>
+        <w:tc>
+          <w:tcPr>
+            <w:tcW w:type="dxa" w:w="1560"/>
+          </w:tcPr>
+          <w:p>
+            <w:pPr>
+              <w:jc w:val="center"/>
+            </w:pPr>
+            <w:r>
+              <w:rPr>
+                <w:rFonts w:ascii="Times New Roman" w:hAnsi="Times New Roman"/>
+                <w:sz w:val="18"/>
+              </w:rPr>
+              <w:t>325,915</w:t>
+            </w:r>
+          </w:p>
+        </w:tc>
+      </w:tr>
+    </w:tbl>
+    <w:p/>
+    <w:p>
+      <w:pPr>
+        <w:spacing w:before="280" w:after="120"/>
+      </w:pPr>
+      <w:r>
+        <w:rPr>
+          <w:rFonts w:ascii="Times New Roman" w:hAnsi="Times New Roman"/>
+          <w:b/>
+          <w:sz w:val="20"/>
+        </w:rPr>
+        <w:t>Figure 4. Counterfactual policy-lever simulation: marginal 10-year change in physician counts by specialty relative to the projected baseline drift. The MDE benchmark is the minimum detectable per-SD effect from the primary analysis.</w:t>
       </w:r>
     </w:p>
     <w:p>
@@ -3228,7 +4747,7 @@
         <w:drawing>
           <wp:inline xmlns:a="http://schemas.openxmlformats.org/drawingml/2006/main" xmlns:pic="http://schemas.openxmlformats.org/drawingml/2006/picture">
             <wp:extent cx="5303520" cy="2410691"/>
-            <wp:docPr id="3" name="Picture 3"/>
+            <wp:docPr id="4" name="Picture 4"/>
             <wp:cNvGraphicFramePr>
               <a:graphicFrameLocks noChangeAspect="1"/>
             </wp:cNvGraphicFramePr>
@@ -3236,11 +4755,11 @@
               <a:graphicData uri="http://schemas.openxmlformats.org/drawingml/2006/picture">
                 <pic:pic>
                   <pic:nvPicPr>
-                    <pic:cNvPr id="0" name="ha_Figure_3.png"/>
+                    <pic:cNvPr id="0" name="ha_Figure_4.png"/>
                     <pic:cNvPicPr/>
                   </pic:nvPicPr>
                   <pic:blipFill>
-                    <a:blip r:embed="rId11"/>
+                    <a:blip r:embed="rId12"/>
                     <a:stretch>
                       <a:fillRect/>
                     </a:stretch>

</xml_diff>

<commit_message>
Raise figure DPI to 300 and add access dates to web references
- manuscript/build_figures_en.py: save all figures at 300 dpi to meet Elsevier artwork minimums.
- manuscript/build_healthcare_analytics_submission.py: append '(accessed 11 August 2026)' to MHLW/Supreme Court web references; regenerate all submission files.
- Regenerate ha_*.docx/pptx, output figures, and ha_submission.zip from primary data.

Refs: PR #349
Co-Authored-By: Tatsuki Onishi <bougtoir@gmail.com>
</commit_message>
<xml_diff>
--- a/medical_accident_its_analysis/manuscript/ha_manuscript_en.docx
+++ b/medical_accident_its_analysis/manuscript/ha_manuscript_en.docx
@@ -5445,7 +5445,7 @@
           <w:rFonts w:ascii="Times New Roman" w:hAnsi="Times New Roman"/>
           <w:sz w:val="20"/>
         </w:rPr>
-        <w:t>8. Ministry of Health, Labour and Welfare. Statistics of Physicians, Dentists and Pharmacists. Tokyo: MHLW; 2024. Available from: https://www.mhlw.go.jp/english/database/db-hw/</w:t>
+        <w:t>8. Ministry of Health, Labour and Welfare. Statistics of Physicians, Dentists and Pharmacists. Tokyo: MHLW; 2024. Available from: https://www.mhlw.go.jp/english/database/db-hw/ (accessed 11 August 2026).</w:t>
       </w:r>
     </w:p>
     <w:p>
@@ -5457,7 +5457,7 @@
           <w:rFonts w:ascii="Times New Roman" w:hAnsi="Times New Roman"/>
           <w:sz w:val="20"/>
         </w:rPr>
-        <w:t>9. Supreme Court of Japan, Committee on Medical Litigation. Statistics on medical malpractice litigation (closed cases by specialty). Tokyo: Supreme Court of Japan; 2024.</w:t>
+        <w:t>9. Supreme Court of Japan, Committee on Medical Litigation. Statistics on medical malpractice litigation (closed cases by specialty). Tokyo: Supreme Court of Japan; 2024. Available from: https://www.courts.go.jp/ (accessed 11 August 2026).</w:t>
       </w:r>
     </w:p>
     <w:p>
@@ -5469,7 +5469,7 @@
           <w:rFonts w:ascii="Times New Roman" w:hAnsi="Times New Roman"/>
           <w:sz w:val="20"/>
         </w:rPr>
-        <w:t>10. Ministry of Health, Labour and Welfare. Survey of Medical Institutions (Dynamic). Tokyo: MHLW; 2024. Available from: https://www.mhlw.go.jp/english/database/db-hw/</w:t>
+        <w:t>10. Ministry of Health, Labour and Welfare. Survey of Medical Institutions (Dynamic). Tokyo: MHLW; 2024. Available from: https://www.mhlw.go.jp/english/database/db-hw/ (accessed 11 August 2026).</w:t>
       </w:r>
     </w:p>
     <w:p>

</xml_diff>

<commit_message>
Scope framing, move counterfactual table to supplementary
- Strengthen cover letter with 'data-driven analytics, operations research, and decision science' framing.
- Move projected 2034 physician-count table from main (Table 3) to Supplementary Table 7 to avoid duplicating Figure 4; main now has 2 tables + 4 figures.
- Update title page counts and regenerate all submission files.

Refs: PR #349
Co-Authored-By: Tatsuki Onishi <bougtoir@gmail.com>
</commit_message>
<xml_diff>
--- a/medical_accident_its_analysis/manuscript/ha_manuscript_en.docx
+++ b/medical_accident_its_analysis/manuscript/ha_manuscript_en.docx
@@ -3271,1461 +3271,9 @@
           <w:i w:val="0"/>
           <w:sz w:val="24"/>
         </w:rPr>
-        <w:t>The counterfactual projection made the practical implications of the null regression result explicit. Under the point estimate, eliminating all malpractice litigation would add only 1.1% to the projected 2034 national physician stock relative to baseline drift. Even under the 95% lower-bound (most favourable) coefficient it would add 5.2%, comparable to the 5.5% gain from a generic lever equal to the minimum detectable effect. General surgery, the only specialty with negative baseline drift, illustrates the break-even arithmetic: its projected 2024-2034 decline of -2.2% would be reduced to -0.1% under the point estimate and reversed to 7.7% under the 95% lower bound. The latter requires eliminating every remaining closed claim and assumes the most adverse (most negative) coefficient compatible with the data; a more realistic policy would achieve far less. Table 3 reports projected 2034 physician counts by specialty and lever; Figure 4 shows the same information as marginal percentage changes. Litigation reduction is therefore not a high-leverage instrument for workforce allocation in this setting.</w:t>
+        <w:t>The counterfactual projection made the practical implications of the null regression result explicit. Under the point estimate, eliminating all malpractice litigation would add only 1.1% to the projected 2034 national physician stock relative to baseline drift. Even under the 95% lower-bound (most favourable) coefficient it would add 5.2%, comparable to the 5.5% gain from a generic lever equal to the minimum detectable effect. General surgery, the only specialty with negative baseline drift, illustrates the break-even arithmetic: its projected 2024-2034 decline of -2.2% would be reduced to -0.1% under the point estimate and reversed to 7.7% under the 95% lower bound. The latter requires eliminating every remaining closed claim and assumes the most adverse (most negative) coefficient compatible with the data; a more realistic policy would achieve far less. Full projected 2034 physician counts by specialty and lever are reported in Supplementary Table 7; Figure 4 summarises the same information as marginal percentage changes. Litigation reduction is therefore not a high-leverage instrument for workforce allocation in this setting.</w:t>
       </w:r>
     </w:p>
-    <w:p>
-      <w:pPr>
-        <w:spacing w:before="280" w:after="120"/>
-      </w:pPr>
-      <w:r>
-        <w:rPr>
-          <w:rFonts w:ascii="Times New Roman" w:hAnsi="Times New Roman"/>
-          <w:b/>
-          <w:sz w:val="20"/>
-        </w:rPr>
-        <w:t>Table 3. Counterfactual 2034 physician counts by specialty and policy lever. Counts are projected from observed biennial baseline drift plus the indicated effect; marginal percentage changes are shown in Figure 4.</w:t>
-      </w:r>
-    </w:p>
-    <w:tbl>
-      <w:tblPr>
-        <w:tblStyle w:val="TableGrid"/>
-        <w:tblW w:type="auto" w:w="0"/>
-        <w:tblLook w:firstColumn="1" w:firstRow="1" w:lastColumn="0" w:lastRow="0" w:noHBand="0" w:noVBand="1" w:val="04A0"/>
-      </w:tblPr>
-      <w:tblGrid>
-        <w:gridCol w:w="1560"/>
-        <w:gridCol w:w="1560"/>
-        <w:gridCol w:w="1560"/>
-        <w:gridCol w:w="1560"/>
-        <w:gridCol w:w="1560"/>
-        <w:gridCol w:w="1560"/>
-      </w:tblGrid>
-      <w:tr>
-        <w:tc>
-          <w:tcPr>
-            <w:tcW w:type="dxa" w:w="1560"/>
-          </w:tcPr>
-          <w:p>
-            <w:pPr>
-              <w:jc w:val="center"/>
-            </w:pPr>
-            <w:r>
-              <w:rPr>
-                <w:rFonts w:ascii="Times New Roman" w:hAnsi="Times New Roman"/>
-                <w:b/>
-                <w:sz w:val="18"/>
-              </w:rPr>
-              <w:t>Specialty</w:t>
-            </w:r>
-          </w:p>
-        </w:tc>
-        <w:tc>
-          <w:tcPr>
-            <w:tcW w:type="dxa" w:w="1560"/>
-          </w:tcPr>
-          <w:p>
-            <w:pPr>
-              <w:jc w:val="center"/>
-            </w:pPr>
-            <w:r>
-              <w:rPr>
-                <w:rFonts w:ascii="Times New Roman" w:hAnsi="Times New Roman"/>
-                <w:b/>
-                <w:sz w:val="18"/>
-              </w:rPr>
-              <w:t>2024 count</w:t>
-            </w:r>
-          </w:p>
-        </w:tc>
-        <w:tc>
-          <w:tcPr>
-            <w:tcW w:type="dxa" w:w="1560"/>
-          </w:tcPr>
-          <w:p>
-            <w:pPr>
-              <w:jc w:val="center"/>
-            </w:pPr>
-            <w:r>
-              <w:rPr>
-                <w:rFonts w:ascii="Times New Roman" w:hAnsi="Times New Roman"/>
-                <w:b/>
-                <w:sz w:val="18"/>
-              </w:rPr>
-              <w:t>Baseline 2034</w:t>
-            </w:r>
-          </w:p>
-        </w:tc>
-        <w:tc>
-          <w:tcPr>
-            <w:tcW w:type="dxa" w:w="1560"/>
-          </w:tcPr>
-          <w:p>
-            <w:pPr>
-              <w:jc w:val="center"/>
-            </w:pPr>
-            <w:r>
-              <w:rPr>
-                <w:rFonts w:ascii="Times New Roman" w:hAnsi="Times New Roman"/>
-                <w:b/>
-                <w:sz w:val="18"/>
-              </w:rPr>
-              <w:t>Litigation zero (point)</w:t>
-            </w:r>
-          </w:p>
-        </w:tc>
-        <w:tc>
-          <w:tcPr>
-            <w:tcW w:type="dxa" w:w="1560"/>
-          </w:tcPr>
-          <w:p>
-            <w:pPr>
-              <w:jc w:val="center"/>
-            </w:pPr>
-            <w:r>
-              <w:rPr>
-                <w:rFonts w:ascii="Times New Roman" w:hAnsi="Times New Roman"/>
-                <w:b/>
-                <w:sz w:val="18"/>
-              </w:rPr>
-              <w:t>Litigation zero (95% lower)</w:t>
-            </w:r>
-          </w:p>
-        </w:tc>
-        <w:tc>
-          <w:tcPr>
-            <w:tcW w:type="dxa" w:w="1560"/>
-          </w:tcPr>
-          <w:p>
-            <w:pPr>
-              <w:jc w:val="center"/>
-            </w:pPr>
-            <w:r>
-              <w:rPr>
-                <w:rFonts w:ascii="Times New Roman" w:hAnsi="Times New Roman"/>
-                <w:b/>
-                <w:sz w:val="18"/>
-              </w:rPr>
-              <w:t>MDE benchmark</w:t>
-            </w:r>
-          </w:p>
-        </w:tc>
-      </w:tr>
-      <w:tr>
-        <w:tc>
-          <w:tcPr>
-            <w:tcW w:type="dxa" w:w="1560"/>
-          </w:tcPr>
-          <w:p>
-            <w:r>
-              <w:rPr>
-                <w:rFonts w:ascii="Times New Roman" w:hAnsi="Times New Roman"/>
-                <w:sz w:val="18"/>
-              </w:rPr>
-              <w:t>Internal medicine</w:t>
-            </w:r>
-          </w:p>
-        </w:tc>
-        <w:tc>
-          <w:tcPr>
-            <w:tcW w:type="dxa" w:w="1560"/>
-          </w:tcPr>
-          <w:p>
-            <w:pPr>
-              <w:jc w:val="center"/>
-            </w:pPr>
-            <w:r>
-              <w:rPr>
-                <w:rFonts w:ascii="Times New Roman" w:hAnsi="Times New Roman"/>
-                <w:sz w:val="18"/>
-              </w:rPr>
-              <w:t>124,010</w:t>
-            </w:r>
-          </w:p>
-        </w:tc>
-        <w:tc>
-          <w:tcPr>
-            <w:tcW w:type="dxa" w:w="1560"/>
-          </w:tcPr>
-          <w:p>
-            <w:pPr>
-              <w:jc w:val="center"/>
-            </w:pPr>
-            <w:r>
-              <w:rPr>
-                <w:rFonts w:ascii="Times New Roman" w:hAnsi="Times New Roman"/>
-                <w:sz w:val="18"/>
-              </w:rPr>
-              <w:t>136,909</w:t>
-            </w:r>
-          </w:p>
-        </w:tc>
-        <w:tc>
-          <w:tcPr>
-            <w:tcW w:type="dxa" w:w="1560"/>
-          </w:tcPr>
-          <w:p>
-            <w:pPr>
-              <w:jc w:val="center"/>
-            </w:pPr>
-            <w:r>
-              <w:rPr>
-                <w:rFonts w:ascii="Times New Roman" w:hAnsi="Times New Roman"/>
-                <w:sz w:val="18"/>
-              </w:rPr>
-              <w:t>138,010</w:t>
-            </w:r>
-          </w:p>
-        </w:tc>
-        <w:tc>
-          <w:tcPr>
-            <w:tcW w:type="dxa" w:w="1560"/>
-          </w:tcPr>
-          <w:p>
-            <w:pPr>
-              <w:jc w:val="center"/>
-            </w:pPr>
-            <w:r>
-              <w:rPr>
-                <w:rFonts w:ascii="Times New Roman" w:hAnsi="Times New Roman"/>
-                <w:sz w:val="18"/>
-              </w:rPr>
-              <w:t>142,075</w:t>
-            </w:r>
-          </w:p>
-        </w:tc>
-        <w:tc>
-          <w:tcPr>
-            <w:tcW w:type="dxa" w:w="1560"/>
-          </w:tcPr>
-          <w:p>
-            <w:pPr>
-              <w:jc w:val="center"/>
-            </w:pPr>
-            <w:r>
-              <w:rPr>
-                <w:rFonts w:ascii="Times New Roman" w:hAnsi="Times New Roman"/>
-                <w:sz w:val="18"/>
-              </w:rPr>
-              <w:t>144,492</w:t>
-            </w:r>
-          </w:p>
-        </w:tc>
-      </w:tr>
-      <w:tr>
-        <w:tc>
-          <w:tcPr>
-            <w:tcW w:type="dxa" w:w="1560"/>
-          </w:tcPr>
-          <w:p>
-            <w:r>
-              <w:rPr>
-                <w:rFonts w:ascii="Times New Roman" w:hAnsi="Times New Roman"/>
-                <w:sz w:val="18"/>
-              </w:rPr>
-              <w:t>Surgery</w:t>
-            </w:r>
-          </w:p>
-        </w:tc>
-        <w:tc>
-          <w:tcPr>
-            <w:tcW w:type="dxa" w:w="1560"/>
-          </w:tcPr>
-          <w:p>
-            <w:pPr>
-              <w:jc w:val="center"/>
-            </w:pPr>
-            <w:r>
-              <w:rPr>
-                <w:rFonts w:ascii="Times New Roman" w:hAnsi="Times New Roman"/>
-                <w:sz w:val="18"/>
-              </w:rPr>
-              <w:t>26,885</w:t>
-            </w:r>
-          </w:p>
-        </w:tc>
-        <w:tc>
-          <w:tcPr>
-            <w:tcW w:type="dxa" w:w="1560"/>
-          </w:tcPr>
-          <w:p>
-            <w:pPr>
-              <w:jc w:val="center"/>
-            </w:pPr>
-            <w:r>
-              <w:rPr>
-                <w:rFonts w:ascii="Times New Roman" w:hAnsi="Times New Roman"/>
-                <w:sz w:val="18"/>
-              </w:rPr>
-              <w:t>26,299</w:t>
-            </w:r>
-          </w:p>
-        </w:tc>
-        <w:tc>
-          <w:tcPr>
-            <w:tcW w:type="dxa" w:w="1560"/>
-          </w:tcPr>
-          <w:p>
-            <w:pPr>
-              <w:jc w:val="center"/>
-            </w:pPr>
-            <w:r>
-              <w:rPr>
-                <w:rFonts w:ascii="Times New Roman" w:hAnsi="Times New Roman"/>
-                <w:sz w:val="18"/>
-              </w:rPr>
-              <w:t>26,853</w:t>
-            </w:r>
-          </w:p>
-        </w:tc>
-        <w:tc>
-          <w:tcPr>
-            <w:tcW w:type="dxa" w:w="1560"/>
-          </w:tcPr>
-          <w:p>
-            <w:pPr>
-              <w:jc w:val="center"/>
-            </w:pPr>
-            <w:r>
-              <w:rPr>
-                <w:rFonts w:ascii="Times New Roman" w:hAnsi="Times New Roman"/>
-                <w:sz w:val="18"/>
-              </w:rPr>
-              <w:t>28,960</w:t>
-            </w:r>
-          </w:p>
-        </w:tc>
-        <w:tc>
-          <w:tcPr>
-            <w:tcW w:type="dxa" w:w="1560"/>
-          </w:tcPr>
-          <w:p>
-            <w:pPr>
-              <w:jc w:val="center"/>
-            </w:pPr>
-            <w:r>
-              <w:rPr>
-                <w:rFonts w:ascii="Times New Roman" w:hAnsi="Times New Roman"/>
-                <w:sz w:val="18"/>
-              </w:rPr>
-              <w:t>27,755</w:t>
-            </w:r>
-          </w:p>
-        </w:tc>
-      </w:tr>
-      <w:tr>
-        <w:tc>
-          <w:tcPr>
-            <w:tcW w:type="dxa" w:w="1560"/>
-          </w:tcPr>
-          <w:p>
-            <w:r>
-              <w:rPr>
-                <w:rFonts w:ascii="Times New Roman" w:hAnsi="Times New Roman"/>
-                <w:sz w:val="18"/>
-              </w:rPr>
-              <w:t>Orthopaedics</w:t>
-            </w:r>
-          </w:p>
-        </w:tc>
-        <w:tc>
-          <w:tcPr>
-            <w:tcW w:type="dxa" w:w="1560"/>
-          </w:tcPr>
-          <w:p>
-            <w:pPr>
-              <w:jc w:val="center"/>
-            </w:pPr>
-            <w:r>
-              <w:rPr>
-                <w:rFonts w:ascii="Times New Roman" w:hAnsi="Times New Roman"/>
-                <w:sz w:val="18"/>
-              </w:rPr>
-              <w:t>22,630</w:t>
-            </w:r>
-          </w:p>
-        </w:tc>
-        <w:tc>
-          <w:tcPr>
-            <w:tcW w:type="dxa" w:w="1560"/>
-          </w:tcPr>
-          <w:p>
-            <w:pPr>
-              <w:jc w:val="center"/>
-            </w:pPr>
-            <w:r>
-              <w:rPr>
-                <w:rFonts w:ascii="Times New Roman" w:hAnsi="Times New Roman"/>
-                <w:sz w:val="18"/>
-              </w:rPr>
-              <w:t>24,848</w:t>
-            </w:r>
-          </w:p>
-        </w:tc>
-        <w:tc>
-          <w:tcPr>
-            <w:tcW w:type="dxa" w:w="1560"/>
-          </w:tcPr>
-          <w:p>
-            <w:pPr>
-              <w:jc w:val="center"/>
-            </w:pPr>
-            <w:r>
-              <w:rPr>
-                <w:rFonts w:ascii="Times New Roman" w:hAnsi="Times New Roman"/>
-                <w:sz w:val="18"/>
-              </w:rPr>
-              <w:t>25,346</w:t>
-            </w:r>
-          </w:p>
-        </w:tc>
-        <w:tc>
-          <w:tcPr>
-            <w:tcW w:type="dxa" w:w="1560"/>
-          </w:tcPr>
-          <w:p>
-            <w:pPr>
-              <w:jc w:val="center"/>
-            </w:pPr>
-            <w:r>
-              <w:rPr>
-                <w:rFonts w:ascii="Times New Roman" w:hAnsi="Times New Roman"/>
-                <w:sz w:val="18"/>
-              </w:rPr>
-              <w:t>27,239</w:t>
-            </w:r>
-          </w:p>
-        </w:tc>
-        <w:tc>
-          <w:tcPr>
-            <w:tcW w:type="dxa" w:w="1560"/>
-          </w:tcPr>
-          <w:p>
-            <w:pPr>
-              <w:jc w:val="center"/>
-            </w:pPr>
-            <w:r>
-              <w:rPr>
-                <w:rFonts w:ascii="Times New Roman" w:hAnsi="Times New Roman"/>
-                <w:sz w:val="18"/>
-              </w:rPr>
-              <w:t>26,224</w:t>
-            </w:r>
-          </w:p>
-        </w:tc>
-      </w:tr>
-      <w:tr>
-        <w:tc>
-          <w:tcPr>
-            <w:tcW w:type="dxa" w:w="1560"/>
-          </w:tcPr>
-          <w:p>
-            <w:r>
-              <w:rPr>
-                <w:rFonts w:ascii="Times New Roman" w:hAnsi="Times New Roman"/>
-                <w:sz w:val="18"/>
-              </w:rPr>
-              <w:t>Plastic surgery</w:t>
-            </w:r>
-          </w:p>
-        </w:tc>
-        <w:tc>
-          <w:tcPr>
-            <w:tcW w:type="dxa" w:w="1560"/>
-          </w:tcPr>
-          <w:p>
-            <w:pPr>
-              <w:jc w:val="center"/>
-            </w:pPr>
-            <w:r>
-              <w:rPr>
-                <w:rFonts w:ascii="Times New Roman" w:hAnsi="Times New Roman"/>
-                <w:sz w:val="18"/>
-              </w:rPr>
-              <w:t>5,074</w:t>
-            </w:r>
-          </w:p>
-        </w:tc>
-        <w:tc>
-          <w:tcPr>
-            <w:tcW w:type="dxa" w:w="1560"/>
-          </w:tcPr>
-          <w:p>
-            <w:pPr>
-              <w:jc w:val="center"/>
-            </w:pPr>
-            <w:r>
-              <w:rPr>
-                <w:rFonts w:ascii="Times New Roman" w:hAnsi="Times New Roman"/>
-                <w:sz w:val="18"/>
-              </w:rPr>
-              <w:t>7,874</w:t>
-            </w:r>
-          </w:p>
-        </w:tc>
-        <w:tc>
-          <w:tcPr>
-            <w:tcW w:type="dxa" w:w="1560"/>
-          </w:tcPr>
-          <w:p>
-            <w:pPr>
-              <w:jc w:val="center"/>
-            </w:pPr>
-            <w:r>
-              <w:rPr>
-                <w:rFonts w:ascii="Times New Roman" w:hAnsi="Times New Roman"/>
-                <w:sz w:val="18"/>
-              </w:rPr>
-              <w:t>8,177</w:t>
-            </w:r>
-          </w:p>
-        </w:tc>
-        <w:tc>
-          <w:tcPr>
-            <w:tcW w:type="dxa" w:w="1560"/>
-          </w:tcPr>
-          <w:p>
-            <w:pPr>
-              <w:jc w:val="center"/>
-            </w:pPr>
-            <w:r>
-              <w:rPr>
-                <w:rFonts w:ascii="Times New Roman" w:hAnsi="Times New Roman"/>
-                <w:sz w:val="18"/>
-              </w:rPr>
-              <w:t>9,376</w:t>
-            </w:r>
-          </w:p>
-        </w:tc>
-        <w:tc>
-          <w:tcPr>
-            <w:tcW w:type="dxa" w:w="1560"/>
-          </w:tcPr>
-          <w:p>
-            <w:pPr>
-              <w:jc w:val="center"/>
-            </w:pPr>
-            <w:r>
-              <w:rPr>
-                <w:rFonts w:ascii="Times New Roman" w:hAnsi="Times New Roman"/>
-                <w:sz w:val="18"/>
-              </w:rPr>
-              <w:t>8,310</w:t>
-            </w:r>
-          </w:p>
-        </w:tc>
-      </w:tr>
-      <w:tr>
-        <w:tc>
-          <w:tcPr>
-            <w:tcW w:type="dxa" w:w="1560"/>
-          </w:tcPr>
-          <w:p>
-            <w:r>
-              <w:rPr>
-                <w:rFonts w:ascii="Times New Roman" w:hAnsi="Times New Roman"/>
-                <w:sz w:val="18"/>
-              </w:rPr>
-              <w:t>Obstetrics &amp; gynaecology</w:t>
-            </w:r>
-          </w:p>
-        </w:tc>
-        <w:tc>
-          <w:tcPr>
-            <w:tcW w:type="dxa" w:w="1560"/>
-          </w:tcPr>
-          <w:p>
-            <w:pPr>
-              <w:jc w:val="center"/>
-            </w:pPr>
-            <w:r>
-              <w:rPr>
-                <w:rFonts w:ascii="Times New Roman" w:hAnsi="Times New Roman"/>
-                <w:sz w:val="18"/>
-              </w:rPr>
-              <w:t>13,908</w:t>
-            </w:r>
-          </w:p>
-        </w:tc>
-        <w:tc>
-          <w:tcPr>
-            <w:tcW w:type="dxa" w:w="1560"/>
-          </w:tcPr>
-          <w:p>
-            <w:pPr>
-              <w:jc w:val="center"/>
-            </w:pPr>
-            <w:r>
-              <w:rPr>
-                <w:rFonts w:ascii="Times New Roman" w:hAnsi="Times New Roman"/>
-                <w:sz w:val="18"/>
-              </w:rPr>
-              <w:t>14,877</w:t>
-            </w:r>
-          </w:p>
-        </w:tc>
-        <w:tc>
-          <w:tcPr>
-            <w:tcW w:type="dxa" w:w="1560"/>
-          </w:tcPr>
-          <w:p>
-            <w:pPr>
-              <w:jc w:val="center"/>
-            </w:pPr>
-            <w:r>
-              <w:rPr>
-                <w:rFonts w:ascii="Times New Roman" w:hAnsi="Times New Roman"/>
-                <w:sz w:val="18"/>
-              </w:rPr>
-              <w:t>15,191</w:t>
-            </w:r>
-          </w:p>
-        </w:tc>
-        <w:tc>
-          <w:tcPr>
-            <w:tcW w:type="dxa" w:w="1560"/>
-          </w:tcPr>
-          <w:p>
-            <w:pPr>
-              <w:jc w:val="center"/>
-            </w:pPr>
-            <w:r>
-              <w:rPr>
-                <w:rFonts w:ascii="Times New Roman" w:hAnsi="Times New Roman"/>
-                <w:sz w:val="18"/>
-              </w:rPr>
-              <w:t>16,387</w:t>
-            </w:r>
-          </w:p>
-        </w:tc>
-        <w:tc>
-          <w:tcPr>
-            <w:tcW w:type="dxa" w:w="1560"/>
-          </w:tcPr>
-          <w:p>
-            <w:pPr>
-              <w:jc w:val="center"/>
-            </w:pPr>
-            <w:r>
-              <w:rPr>
-                <w:rFonts w:ascii="Times New Roman" w:hAnsi="Times New Roman"/>
-                <w:sz w:val="18"/>
-              </w:rPr>
-              <w:t>15,700</w:t>
-            </w:r>
-          </w:p>
-        </w:tc>
-      </w:tr>
-      <w:tr>
-        <w:tc>
-          <w:tcPr>
-            <w:tcW w:type="dxa" w:w="1560"/>
-          </w:tcPr>
-          <w:p>
-            <w:r>
-              <w:rPr>
-                <w:rFonts w:ascii="Times New Roman" w:hAnsi="Times New Roman"/>
-                <w:sz w:val="18"/>
-              </w:rPr>
-              <w:t>Paediatrics</w:t>
-            </w:r>
-          </w:p>
-        </w:tc>
-        <w:tc>
-          <w:tcPr>
-            <w:tcW w:type="dxa" w:w="1560"/>
-          </w:tcPr>
-          <w:p>
-            <w:pPr>
-              <w:jc w:val="center"/>
-            </w:pPr>
-            <w:r>
-              <w:rPr>
-                <w:rFonts w:ascii="Times New Roman" w:hAnsi="Times New Roman"/>
-                <w:sz w:val="18"/>
-              </w:rPr>
-              <w:t>18,009</w:t>
-            </w:r>
-          </w:p>
-        </w:tc>
-        <w:tc>
-          <w:tcPr>
-            <w:tcW w:type="dxa" w:w="1560"/>
-          </w:tcPr>
-          <w:p>
-            <w:pPr>
-              <w:jc w:val="center"/>
-            </w:pPr>
-            <w:r>
-              <w:rPr>
-                <w:rFonts w:ascii="Times New Roman" w:hAnsi="Times New Roman"/>
-                <w:sz w:val="18"/>
-              </w:rPr>
-              <w:t>19,949</w:t>
-            </w:r>
-          </w:p>
-        </w:tc>
-        <w:tc>
-          <w:tcPr>
-            <w:tcW w:type="dxa" w:w="1560"/>
-          </w:tcPr>
-          <w:p>
-            <w:pPr>
-              <w:jc w:val="center"/>
-            </w:pPr>
-            <w:r>
-              <w:rPr>
-                <w:rFonts w:ascii="Times New Roman" w:hAnsi="Times New Roman"/>
-                <w:sz w:val="18"/>
-              </w:rPr>
-              <w:t>20,023</w:t>
-            </w:r>
-          </w:p>
-        </w:tc>
-        <w:tc>
-          <w:tcPr>
-            <w:tcW w:type="dxa" w:w="1560"/>
-          </w:tcPr>
-          <w:p>
-            <w:pPr>
-              <w:jc w:val="center"/>
-            </w:pPr>
-            <w:r>
-              <w:rPr>
-                <w:rFonts w:ascii="Times New Roman" w:hAnsi="Times New Roman"/>
-                <w:sz w:val="18"/>
-              </w:rPr>
-              <w:t>20,295</w:t>
-            </w:r>
-          </w:p>
-        </w:tc>
-        <w:tc>
-          <w:tcPr>
-            <w:tcW w:type="dxa" w:w="1560"/>
-          </w:tcPr>
-          <w:p>
-            <w:pPr>
-              <w:jc w:val="center"/>
-            </w:pPr>
-            <w:r>
-              <w:rPr>
-                <w:rFonts w:ascii="Times New Roman" w:hAnsi="Times New Roman"/>
-                <w:sz w:val="18"/>
-              </w:rPr>
-              <w:t>21,054</w:t>
-            </w:r>
-          </w:p>
-        </w:tc>
-      </w:tr>
-      <w:tr>
-        <w:tc>
-          <w:tcPr>
-            <w:tcW w:type="dxa" w:w="1560"/>
-          </w:tcPr>
-          <w:p>
-            <w:r>
-              <w:rPr>
-                <w:rFonts w:ascii="Times New Roman" w:hAnsi="Times New Roman"/>
-                <w:sz w:val="18"/>
-              </w:rPr>
-              <w:t>Psychiatry</w:t>
-            </w:r>
-          </w:p>
-        </w:tc>
-        <w:tc>
-          <w:tcPr>
-            <w:tcW w:type="dxa" w:w="1560"/>
-          </w:tcPr>
-          <w:p>
-            <w:pPr>
-              <w:jc w:val="center"/>
-            </w:pPr>
-            <w:r>
-              <w:rPr>
-                <w:rFonts w:ascii="Times New Roman" w:hAnsi="Times New Roman"/>
-                <w:sz w:val="18"/>
-              </w:rPr>
-              <w:t>17,259</w:t>
-            </w:r>
-          </w:p>
-        </w:tc>
-        <w:tc>
-          <w:tcPr>
-            <w:tcW w:type="dxa" w:w="1560"/>
-          </w:tcPr>
-          <w:p>
-            <w:pPr>
-              <w:jc w:val="center"/>
-            </w:pPr>
-            <w:r>
-              <w:rPr>
-                <w:rFonts w:ascii="Times New Roman" w:hAnsi="Times New Roman"/>
-                <w:sz w:val="18"/>
-              </w:rPr>
-              <w:t>20,199</w:t>
-            </w:r>
-          </w:p>
-        </w:tc>
-        <w:tc>
-          <w:tcPr>
-            <w:tcW w:type="dxa" w:w="1560"/>
-          </w:tcPr>
-          <w:p>
-            <w:pPr>
-              <w:jc w:val="center"/>
-            </w:pPr>
-            <w:r>
-              <w:rPr>
-                <w:rFonts w:ascii="Times New Roman" w:hAnsi="Times New Roman"/>
-                <w:sz w:val="18"/>
-              </w:rPr>
-              <w:t>20,391</w:t>
-            </w:r>
-          </w:p>
-        </w:tc>
-        <w:tc>
-          <w:tcPr>
-            <w:tcW w:type="dxa" w:w="1560"/>
-          </w:tcPr>
-          <w:p>
-            <w:pPr>
-              <w:jc w:val="center"/>
-            </w:pPr>
-            <w:r>
-              <w:rPr>
-                <w:rFonts w:ascii="Times New Roman" w:hAnsi="Times New Roman"/>
-                <w:sz w:val="18"/>
-              </w:rPr>
-              <w:t>21,102</w:t>
-            </w:r>
-          </w:p>
-        </w:tc>
-        <w:tc>
-          <w:tcPr>
-            <w:tcW w:type="dxa" w:w="1560"/>
-          </w:tcPr>
-          <w:p>
-            <w:pPr>
-              <w:jc w:val="center"/>
-            </w:pPr>
-            <w:r>
-              <w:rPr>
-                <w:rFonts w:ascii="Times New Roman" w:hAnsi="Times New Roman"/>
-                <w:sz w:val="18"/>
-              </w:rPr>
-              <w:t>21,317</w:t>
-            </w:r>
-          </w:p>
-        </w:tc>
-      </w:tr>
-      <w:tr>
-        <w:tc>
-          <w:tcPr>
-            <w:tcW w:type="dxa" w:w="1560"/>
-          </w:tcPr>
-          <w:p>
-            <w:r>
-              <w:rPr>
-                <w:rFonts w:ascii="Times New Roman" w:hAnsi="Times New Roman"/>
-                <w:sz w:val="18"/>
-              </w:rPr>
-              <w:t>Ophthalmology</w:t>
-            </w:r>
-          </w:p>
-        </w:tc>
-        <w:tc>
-          <w:tcPr>
-            <w:tcW w:type="dxa" w:w="1560"/>
-          </w:tcPr>
-          <w:p>
-            <w:pPr>
-              <w:jc w:val="center"/>
-            </w:pPr>
-            <w:r>
-              <w:rPr>
-                <w:rFonts w:ascii="Times New Roman" w:hAnsi="Times New Roman"/>
-                <w:sz w:val="18"/>
-              </w:rPr>
-              <w:t>13,436</w:t>
-            </w:r>
-          </w:p>
-        </w:tc>
-        <w:tc>
-          <w:tcPr>
-            <w:tcW w:type="dxa" w:w="1560"/>
-          </w:tcPr>
-          <w:p>
-            <w:pPr>
-              <w:jc w:val="center"/>
-            </w:pPr>
-            <w:r>
-              <w:rPr>
-                <w:rFonts w:ascii="Times New Roman" w:hAnsi="Times New Roman"/>
-                <w:sz w:val="18"/>
-              </w:rPr>
-              <w:t>13,957</w:t>
-            </w:r>
-          </w:p>
-        </w:tc>
-        <w:tc>
-          <w:tcPr>
-            <w:tcW w:type="dxa" w:w="1560"/>
-          </w:tcPr>
-          <w:p>
-            <w:pPr>
-              <w:jc w:val="center"/>
-            </w:pPr>
-            <w:r>
-              <w:rPr>
-                <w:rFonts w:ascii="Times New Roman" w:hAnsi="Times New Roman"/>
-                <w:sz w:val="18"/>
-              </w:rPr>
-              <w:t>14,058</w:t>
-            </w:r>
-          </w:p>
-        </w:tc>
-        <w:tc>
-          <w:tcPr>
-            <w:tcW w:type="dxa" w:w="1560"/>
-          </w:tcPr>
-          <w:p>
-            <w:pPr>
-              <w:jc w:val="center"/>
-            </w:pPr>
-            <w:r>
-              <w:rPr>
-                <w:rFonts w:ascii="Times New Roman" w:hAnsi="Times New Roman"/>
-                <w:sz w:val="18"/>
-              </w:rPr>
-              <w:t>14,430</w:t>
-            </w:r>
-          </w:p>
-        </w:tc>
-        <w:tc>
-          <w:tcPr>
-            <w:tcW w:type="dxa" w:w="1560"/>
-          </w:tcPr>
-          <w:p>
-            <w:pPr>
-              <w:jc w:val="center"/>
-            </w:pPr>
-            <w:r>
-              <w:rPr>
-                <w:rFonts w:ascii="Times New Roman" w:hAnsi="Times New Roman"/>
-                <w:sz w:val="18"/>
-              </w:rPr>
-              <w:t>14,730</w:t>
-            </w:r>
-          </w:p>
-        </w:tc>
-      </w:tr>
-      <w:tr>
-        <w:tc>
-          <w:tcPr>
-            <w:tcW w:type="dxa" w:w="1560"/>
-          </w:tcPr>
-          <w:p>
-            <w:r>
-              <w:rPr>
-                <w:rFonts w:ascii="Times New Roman" w:hAnsi="Times New Roman"/>
-                <w:sz w:val="18"/>
-              </w:rPr>
-              <w:t>Otolaryngology</w:t>
-            </w:r>
-          </w:p>
-        </w:tc>
-        <w:tc>
-          <w:tcPr>
-            <w:tcW w:type="dxa" w:w="1560"/>
-          </w:tcPr>
-          <w:p>
-            <w:pPr>
-              <w:jc w:val="center"/>
-            </w:pPr>
-            <w:r>
-              <w:rPr>
-                <w:rFonts w:ascii="Times New Roman" w:hAnsi="Times New Roman"/>
-                <w:sz w:val="18"/>
-              </w:rPr>
-              <w:t>9,330</w:t>
-            </w:r>
-          </w:p>
-        </w:tc>
-        <w:tc>
-          <w:tcPr>
-            <w:tcW w:type="dxa" w:w="1560"/>
-          </w:tcPr>
-          <w:p>
-            <w:pPr>
-              <w:jc w:val="center"/>
-            </w:pPr>
-            <w:r>
-              <w:rPr>
-                <w:rFonts w:ascii="Times New Roman" w:hAnsi="Times New Roman"/>
-                <w:sz w:val="18"/>
-              </w:rPr>
-              <w:t>9,460</w:t>
-            </w:r>
-          </w:p>
-        </w:tc>
-        <w:tc>
-          <w:tcPr>
-            <w:tcW w:type="dxa" w:w="1560"/>
-          </w:tcPr>
-          <w:p>
-            <w:pPr>
-              <w:jc w:val="center"/>
-            </w:pPr>
-            <w:r>
-              <w:rPr>
-                <w:rFonts w:ascii="Times New Roman" w:hAnsi="Times New Roman"/>
-                <w:sz w:val="18"/>
-              </w:rPr>
-              <w:t>9,520</w:t>
-            </w:r>
-          </w:p>
-        </w:tc>
-        <w:tc>
-          <w:tcPr>
-            <w:tcW w:type="dxa" w:w="1560"/>
-          </w:tcPr>
-          <w:p>
-            <w:pPr>
-              <w:jc w:val="center"/>
-            </w:pPr>
-            <w:r>
-              <w:rPr>
-                <w:rFonts w:ascii="Times New Roman" w:hAnsi="Times New Roman"/>
-                <w:sz w:val="18"/>
-              </w:rPr>
-              <w:t>9,744</w:t>
-            </w:r>
-          </w:p>
-        </w:tc>
-        <w:tc>
-          <w:tcPr>
-            <w:tcW w:type="dxa" w:w="1560"/>
-          </w:tcPr>
-          <w:p>
-            <w:pPr>
-              <w:jc w:val="center"/>
-            </w:pPr>
-            <w:r>
-              <w:rPr>
-                <w:rFonts w:ascii="Times New Roman" w:hAnsi="Times New Roman"/>
-                <w:sz w:val="18"/>
-              </w:rPr>
-              <w:t>9,984</w:t>
-            </w:r>
-          </w:p>
-        </w:tc>
-      </w:tr>
-      <w:tr>
-        <w:tc>
-          <w:tcPr>
-            <w:tcW w:type="dxa" w:w="1560"/>
-          </w:tcPr>
-          <w:p>
-            <w:r>
-              <w:rPr>
-                <w:rFonts w:ascii="Times New Roman" w:hAnsi="Times New Roman"/>
-                <w:sz w:val="18"/>
-              </w:rPr>
-              <w:t>Urology</w:t>
-            </w:r>
-          </w:p>
-        </w:tc>
-        <w:tc>
-          <w:tcPr>
-            <w:tcW w:type="dxa" w:w="1560"/>
-          </w:tcPr>
-          <w:p>
-            <w:pPr>
-              <w:jc w:val="center"/>
-            </w:pPr>
-            <w:r>
-              <w:rPr>
-                <w:rFonts w:ascii="Times New Roman" w:hAnsi="Times New Roman"/>
-                <w:sz w:val="18"/>
-              </w:rPr>
-              <w:t>8,069</w:t>
-            </w:r>
-          </w:p>
-        </w:tc>
-        <w:tc>
-          <w:tcPr>
-            <w:tcW w:type="dxa" w:w="1560"/>
-          </w:tcPr>
-          <w:p>
-            <w:pPr>
-              <w:jc w:val="center"/>
-            </w:pPr>
-            <w:r>
-              <w:rPr>
-                <w:rFonts w:ascii="Times New Roman" w:hAnsi="Times New Roman"/>
-                <w:sz w:val="18"/>
-              </w:rPr>
-              <w:t>9,333</w:t>
-            </w:r>
-          </w:p>
-        </w:tc>
-        <w:tc>
-          <w:tcPr>
-            <w:tcW w:type="dxa" w:w="1560"/>
-          </w:tcPr>
-          <w:p>
-            <w:pPr>
-              <w:jc w:val="center"/>
-            </w:pPr>
-            <w:r>
-              <w:rPr>
-                <w:rFonts w:ascii="Times New Roman" w:hAnsi="Times New Roman"/>
-                <w:sz w:val="18"/>
-              </w:rPr>
-              <w:t>9,425</w:t>
-            </w:r>
-          </w:p>
-        </w:tc>
-        <w:tc>
-          <w:tcPr>
-            <w:tcW w:type="dxa" w:w="1560"/>
-          </w:tcPr>
-          <w:p>
-            <w:pPr>
-              <w:jc w:val="center"/>
-            </w:pPr>
-            <w:r>
-              <w:rPr>
-                <w:rFonts w:ascii="Times New Roman" w:hAnsi="Times New Roman"/>
-                <w:sz w:val="18"/>
-              </w:rPr>
-              <w:t>9,766</w:t>
-            </w:r>
-          </w:p>
-        </w:tc>
-        <w:tc>
-          <w:tcPr>
-            <w:tcW w:type="dxa" w:w="1560"/>
-          </w:tcPr>
-          <w:p>
-            <w:pPr>
-              <w:jc w:val="center"/>
-            </w:pPr>
-            <w:r>
-              <w:rPr>
-                <w:rFonts w:ascii="Times New Roman" w:hAnsi="Times New Roman"/>
-                <w:sz w:val="18"/>
-              </w:rPr>
-              <w:t>9,849</w:t>
-            </w:r>
-          </w:p>
-        </w:tc>
-      </w:tr>
-      <w:tr>
-        <w:tc>
-          <w:tcPr>
-            <w:tcW w:type="dxa" w:w="1560"/>
-          </w:tcPr>
-          <w:p>
-            <w:r>
-              <w:rPr>
-                <w:rFonts w:ascii="Times New Roman" w:hAnsi="Times New Roman"/>
-                <w:sz w:val="18"/>
-              </w:rPr>
-              <w:t>Dermatology</w:t>
-            </w:r>
-          </w:p>
-        </w:tc>
-        <w:tc>
-          <w:tcPr>
-            <w:tcW w:type="dxa" w:w="1560"/>
-          </w:tcPr>
-          <w:p>
-            <w:pPr>
-              <w:jc w:val="center"/>
-            </w:pPr>
-            <w:r>
-              <w:rPr>
-                <w:rFonts w:ascii="Times New Roman" w:hAnsi="Times New Roman"/>
-                <w:sz w:val="18"/>
-              </w:rPr>
-              <w:t>10,043</w:t>
-            </w:r>
-          </w:p>
-        </w:tc>
-        <w:tc>
-          <w:tcPr>
-            <w:tcW w:type="dxa" w:w="1560"/>
-          </w:tcPr>
-          <w:p>
-            <w:pPr>
-              <w:jc w:val="center"/>
-            </w:pPr>
-            <w:r>
-              <w:rPr>
-                <w:rFonts w:ascii="Times New Roman" w:hAnsi="Times New Roman"/>
-                <w:sz w:val="18"/>
-              </w:rPr>
-              <w:t>11,411</w:t>
-            </w:r>
-          </w:p>
-        </w:tc>
-        <w:tc>
-          <w:tcPr>
-            <w:tcW w:type="dxa" w:w="1560"/>
-          </w:tcPr>
-          <w:p>
-            <w:pPr>
-              <w:jc w:val="center"/>
-            </w:pPr>
-            <w:r>
-              <w:rPr>
-                <w:rFonts w:ascii="Times New Roman" w:hAnsi="Times New Roman"/>
-                <w:sz w:val="18"/>
-              </w:rPr>
-              <w:t>11,479</w:t>
-            </w:r>
-          </w:p>
-        </w:tc>
-        <w:tc>
-          <w:tcPr>
-            <w:tcW w:type="dxa" w:w="1560"/>
-          </w:tcPr>
-          <w:p>
-            <w:pPr>
-              <w:jc w:val="center"/>
-            </w:pPr>
-            <w:r>
-              <w:rPr>
-                <w:rFonts w:ascii="Times New Roman" w:hAnsi="Times New Roman"/>
-                <w:sz w:val="18"/>
-              </w:rPr>
-              <w:t>11,732</w:t>
-            </w:r>
-          </w:p>
-        </w:tc>
-        <w:tc>
-          <w:tcPr>
-            <w:tcW w:type="dxa" w:w="1560"/>
-          </w:tcPr>
-          <w:p>
-            <w:pPr>
-              <w:jc w:val="center"/>
-            </w:pPr>
-            <w:r>
-              <w:rPr>
-                <w:rFonts w:ascii="Times New Roman" w:hAnsi="Times New Roman"/>
-                <w:sz w:val="18"/>
-              </w:rPr>
-              <w:t>12,042</w:t>
-            </w:r>
-          </w:p>
-        </w:tc>
-      </w:tr>
-      <w:tr>
-        <w:tc>
-          <w:tcPr>
-            <w:tcW w:type="dxa" w:w="1560"/>
-          </w:tcPr>
-          <w:p>
-            <w:r>
-              <w:rPr>
-                <w:rFonts w:ascii="Times New Roman" w:hAnsi="Times New Roman"/>
-                <w:sz w:val="18"/>
-              </w:rPr>
-              <w:t>Anaesthesiology</w:t>
-            </w:r>
-          </w:p>
-        </w:tc>
-        <w:tc>
-          <w:tcPr>
-            <w:tcW w:type="dxa" w:w="1560"/>
-          </w:tcPr>
-          <w:p>
-            <w:pPr>
-              <w:jc w:val="center"/>
-            </w:pPr>
-            <w:r>
-              <w:rPr>
-                <w:rFonts w:ascii="Times New Roman" w:hAnsi="Times New Roman"/>
-                <w:sz w:val="18"/>
-              </w:rPr>
-              <w:t>10,628</w:t>
-            </w:r>
-          </w:p>
-        </w:tc>
-        <w:tc>
-          <w:tcPr>
-            <w:tcW w:type="dxa" w:w="1560"/>
-          </w:tcPr>
-          <w:p>
-            <w:pPr>
-              <w:jc w:val="center"/>
-            </w:pPr>
-            <w:r>
-              <w:rPr>
-                <w:rFonts w:ascii="Times New Roman" w:hAnsi="Times New Roman"/>
-                <w:sz w:val="18"/>
-              </w:rPr>
-              <w:t>13,699</w:t>
-            </w:r>
-          </w:p>
-        </w:tc>
-        <w:tc>
-          <w:tcPr>
-            <w:tcW w:type="dxa" w:w="1560"/>
-          </w:tcPr>
-          <w:p>
-            <w:pPr>
-              <w:jc w:val="center"/>
-            </w:pPr>
-            <w:r>
-              <w:rPr>
-                <w:rFonts w:ascii="Times New Roman" w:hAnsi="Times New Roman"/>
-                <w:sz w:val="18"/>
-              </w:rPr>
-              <w:t>13,745</w:t>
-            </w:r>
-          </w:p>
-        </w:tc>
-        <w:tc>
-          <w:tcPr>
-            <w:tcW w:type="dxa" w:w="1560"/>
-          </w:tcPr>
-          <w:p>
-            <w:pPr>
-              <w:jc w:val="center"/>
-            </w:pPr>
-            <w:r>
-              <w:rPr>
-                <w:rFonts w:ascii="Times New Roman" w:hAnsi="Times New Roman"/>
-                <w:sz w:val="18"/>
-              </w:rPr>
-              <w:t>13,915</w:t>
-            </w:r>
-          </w:p>
-        </w:tc>
-        <w:tc>
-          <w:tcPr>
-            <w:tcW w:type="dxa" w:w="1560"/>
-          </w:tcPr>
-          <w:p>
-            <w:pPr>
-              <w:jc w:val="center"/>
-            </w:pPr>
-            <w:r>
-              <w:rPr>
-                <w:rFonts w:ascii="Times New Roman" w:hAnsi="Times New Roman"/>
-                <w:sz w:val="18"/>
-              </w:rPr>
-              <w:t>14,458</w:t>
-            </w:r>
-          </w:p>
-        </w:tc>
-      </w:tr>
-      <w:tr>
-        <w:tc>
-          <w:tcPr>
-            <w:tcW w:type="dxa" w:w="1560"/>
-          </w:tcPr>
-          <w:p>
-            <w:r>
-              <w:rPr>
-                <w:rFonts w:ascii="Times New Roman" w:hAnsi="Times New Roman"/>
-                <w:sz w:val="18"/>
-              </w:rPr>
-              <w:t>All specialties</w:t>
-            </w:r>
-          </w:p>
-        </w:tc>
-        <w:tc>
-          <w:tcPr>
-            <w:tcW w:type="dxa" w:w="1560"/>
-          </w:tcPr>
-          <w:p>
-            <w:pPr>
-              <w:jc w:val="center"/>
-            </w:pPr>
-            <w:r>
-              <w:rPr>
-                <w:rFonts w:ascii="Times New Roman" w:hAnsi="Times New Roman"/>
-                <w:sz w:val="18"/>
-              </w:rPr>
-              <w:t>279,281</w:t>
-            </w:r>
-          </w:p>
-        </w:tc>
-        <w:tc>
-          <w:tcPr>
-            <w:tcW w:type="dxa" w:w="1560"/>
-          </w:tcPr>
-          <w:p>
-            <w:pPr>
-              <w:jc w:val="center"/>
-            </w:pPr>
-            <w:r>
-              <w:rPr>
-                <w:rFonts w:ascii="Times New Roman" w:hAnsi="Times New Roman"/>
-                <w:sz w:val="18"/>
-              </w:rPr>
-              <w:t>308,815</w:t>
-            </w:r>
-          </w:p>
-        </w:tc>
-        <w:tc>
-          <w:tcPr>
-            <w:tcW w:type="dxa" w:w="1560"/>
-          </w:tcPr>
-          <w:p>
-            <w:pPr>
-              <w:jc w:val="center"/>
-            </w:pPr>
-            <w:r>
-              <w:rPr>
-                <w:rFonts w:ascii="Times New Roman" w:hAnsi="Times New Roman"/>
-                <w:sz w:val="18"/>
-              </w:rPr>
-              <w:t>312,218</w:t>
-            </w:r>
-          </w:p>
-        </w:tc>
-        <w:tc>
-          <w:tcPr>
-            <w:tcW w:type="dxa" w:w="1560"/>
-          </w:tcPr>
-          <w:p>
-            <w:pPr>
-              <w:jc w:val="center"/>
-            </w:pPr>
-            <w:r>
-              <w:rPr>
-                <w:rFonts w:ascii="Times New Roman" w:hAnsi="Times New Roman"/>
-                <w:sz w:val="18"/>
-              </w:rPr>
-              <w:t>325,021</w:t>
-            </w:r>
-          </w:p>
-        </w:tc>
-        <w:tc>
-          <w:tcPr>
-            <w:tcW w:type="dxa" w:w="1560"/>
-          </w:tcPr>
-          <w:p>
-            <w:pPr>
-              <w:jc w:val="center"/>
-            </w:pPr>
-            <w:r>
-              <w:rPr>
-                <w:rFonts w:ascii="Times New Roman" w:hAnsi="Times New Roman"/>
-                <w:sz w:val="18"/>
-              </w:rPr>
-              <w:t>325,915</w:t>
-            </w:r>
-          </w:p>
-        </w:tc>
-      </w:tr>
-    </w:tbl>
-    <w:p/>
     <w:p>
       <w:pPr>
         <w:spacing w:before="280" w:after="120"/>

</xml_diff>

<commit_message>
Strengthen OR/decision-analytics framing and novelty claim
- Add 'operations research' to abstract, introduction, methods, discussion, keywords, and cover letter.
- Claim novelty: first application of pre-specified equivalence testing and small-cluster diagnostics to malpractice-litigation workforce allocation.
- Position the counterfactual simulation as a decision-analytics/operations-research output.
- Regenerate all submission artifacts; abstract now 250 words.

Refs: PR #349
Co-Authored-By: Tatsuki Onishi <bougtoir@gmail.com>
</commit_message>
<xml_diff>
--- a/medical_accident_its_analysis/manuscript/ha_manuscript_en.docx
+++ b/medical_accident_its_analysis/manuscript/ha_manuscript_en.docx
@@ -37,7 +37,7 @@
           <w:rFonts w:ascii="Times New Roman" w:hAnsi="Times New Roman"/>
           <w:sz w:val="24"/>
         </w:rPr>
-        <w:t>Specialty maldistribution is a global healthcare workforce-allocation problem, and many health systems assume that malpractice-litigation risk pushes physicians away from high-risk specialties. We used this question as a test case for a transparent, reproducible decision-analytics framework that evaluates a proposed workforce policy lever while avoiding size confounding and interpolation artifacts in sparse administrative panels. Using national primary data for 12 specialties in Japan (2008–2024), we measured exposure as closed malpractice claims per 1,000 physicians (rate, not count) and regressed biennial log-change in physicians and hospitals on the lagged litigation rate in a panel with specialty and wave fixed effects, cluster-robust standard errors with a small-cluster t(G-1) correction, a cluster block-bootstrap robustness check, two one-sided equivalence (TOST) tests, and power diagnostics. The workforce grew in 11 of 12 specialties; general surgery, which changed by -2.3%, was the exception. Litigation rate was not associated with physician growth (coefficient -0.0009; 95% CI -0.0043 to +0.0025; p=0.56) or hospital growth (p=0.90). A one-SD higher rate changed physician growth by less than ±1% (TOST p=0.023; less than ±2% was p=&lt;0.001); the minimum detectable effect was 1.08% per SD at 80% power. Hospital growth was within ±2% (p=0.002) but not the stricter ±1% margin (p=0.059). Sensitivity analyses were unchanged. Specialty-level litigation risk is not associated with workforce decline in these national data. The decision-analytics framework is exportable to other healthcare workforce-policy levers.</w:t>
+        <w:t>Specialty maldistribution is a global healthcare workforce-allocation problem, and many health systems assume that malpractice-litigation risk pushes physicians away from high-risk specialties. We used this question as a test case for a transparent, reproducible decision-analytics and operations-research framework that evaluates a proposed workforce policy lever while avoiding size confounding and interpolation artifacts in sparse administrative panels. Using national primary data for 12 specialties in Japan (2008–2024), we measured exposure as closed malpractice claims per 1,000 physicians (rate, not count) and regressed biennial log-change in physicians and hospitals on the lagged litigation rate in a panel with specialty and wave fixed effects, cluster-robust standard errors with a small-cluster t(G-1) correction, a cluster block-bootstrap robustness check, two one-sided equivalence (TOST) tests, and power diagnostics. The workforce grew in 11 of 12 specialties; general surgery, which changed by -2.3%, was the exception. Litigation rate was not associated with physician growth (coefficient -0.0009; 95% CI -0.0043 to +0.0025; p=0.56) or hospital growth (p=0.90). A one-SD higher rate changed physician growth by less than ±1% (TOST p=0.023; less than ±2% was p=&lt;0.001); the minimum detectable effect was 1.08% per SD at 80% power. Hospital growth was within ±2% (p=0.002) but not the stricter ±1% margin (p=0.059). Sensitivity analyses were unchanged. Specialty-level litigation risk is not associated with workforce decline in these national data. The decision-analytics and operations-research framework is exportable to other healthcare workforce-policy levers.</w:t>
       </w:r>
     </w:p>
     <w:p>
@@ -58,7 +58,7 @@
           <w:i w:val="0"/>
           <w:sz w:val="24"/>
         </w:rPr>
-        <w:t>malpractice litigation; physician workforce; specialty maldistribution; equivalence testing; healthcare analytics</w:t>
+        <w:t>malpractice litigation; physician workforce; specialty maldistribution; equivalence testing; healthcare decision analytics; operations research</w:t>
       </w:r>
     </w:p>
     <w:p>
@@ -130,7 +130,7 @@
           <w:i w:val="0"/>
           <w:sz w:val="24"/>
         </w:rPr>
-        <w:t>Prior work in this area often related raw annual counts of incidents or lawsuits to raw counts of physicians or facilities. Two features make such designs prone to spurious association. First, counts are not adjusted for specialty size: a larger specialty mechanically accumulates more procedures, more claims and more physicians, so count-based associations can arise without any behavioural mechanism. Second, the physician census is collected only biennially; interpolating it to an annual series and analysing it as if each year were an independent observation inflates the degrees of freedom of any lag-based method. These pitfalls are not unique to malpractice research; they arise whenever administrative counts are used to infer behavioural responses in healthcare organisations. From a decision-analytics perspective, the relevant question is not whether litigation risk is correlated with raw counts, but whether it is a policy lever that workforce planners can use to shift specialty supply. We therefore treat the litigation-workforce question as a test case for a transparent, reproducible decision-analytics framework for healthcare workforce allocation and resource planning.</w:t>
+        <w:t>Prior work in this area often related raw annual counts of incidents or lawsuits to raw counts of physicians or facilities. Two features make such designs prone to spurious association. First, counts are not adjusted for specialty size: a larger specialty mechanically accumulates more procedures, more claims and more physicians, so count-based associations can arise without any behavioural mechanism. Second, the physician census is collected only biennially; interpolating it to an annual series and analysing it as if each year were an independent observation inflates the degrees of freedom of any lag-based method. These pitfalls are not unique to malpractice research; they arise whenever administrative counts are used to infer behavioural responses in healthcare organisations. From a decision-analytics perspective, the relevant question is not whether litigation risk is correlated with raw counts, but whether it is a policy lever that workforce planners can use to shift specialty supply. We therefore treat the litigation-workforce question as a test case for a transparent, reproducible decision-analytics and operations-research framework for healthcare workforce allocation and resource planning. This is, to our knowledge, the first application of pre-specified equivalence testing and small-cluster inference diagnostics to the malpractice-litigation workforce literature.</w:t>
       </w:r>
     </w:p>
     <w:p>
@@ -624,7 +624,7 @@
           <w:i w:val="0"/>
           <w:sz w:val="24"/>
         </w:rPr>
-        <w:t>To translate the regression results into a decision-analytics output, we projected physician counts to 2034 under three stylised policy levers. The baseline used each specialty's observed mean biennial log-growth from 2004 to 2024. The two litigation-reduction levers set the litigation rate to zero and applied the point estimate and the 95% lower-bound coefficient, respectively, so they show both the central projection and the most favourable effect consistent with the data. The third lever added the minimum detectable per-SD effect (1.08% per biennium) to baseline growth as a benchmark for the smallest policy effect this panel could detect with 80% power. The projections are deterministic counterfactuals, not forecasts, and are reported as the marginal percent change in 2034 relative to the baseline drift.</w:t>
+        <w:t>To translate the regression results into a decision-analytics and operations-research output, we projected physician counts to 2034 under three stylised policy levers. The baseline used each specialty's observed mean biennial log-growth from 2004 to 2024. The two litigation-reduction levers set the litigation rate to zero and applied the point estimate and the 95% lower-bound coefficient, respectively, so they show both the central projection and the most favourable effect consistent with the data. The third lever added the minimum detectable per-SD effect (1.08% per biennium) to baseline growth as a benchmark for the smallest policy effect this panel could detect with 80% power. The projections are deterministic counterfactuals, not forecasts, and are reported as the marginal percent change in 2034 relative to the baseline drift.</w:t>
       </w:r>
     </w:p>
     <w:p>
@@ -3765,7 +3765,7 @@
           <w:i w:val="0"/>
           <w:sz w:val="24"/>
         </w:rPr>
-        <w:t>The framework we used is intentionally general. Specialty physician workforce allocation is a recurring healthcare decision problem, and the same sensitivity-analysis steps—rate adjustment to remove size confounding, measured-only panels to avoid interpolation, equivalence testing with policy-relevant margins, and small-cluster inference—can be applied to other proposed levers, such as fee schedules, regional quotas, or training subsidies. The analytic contribution is therefore not the malpractice finding itself but a transparent, reproducible workflow that helps decision-makers distinguish meaningful workforce effects from spurious count- or interpolation-based associations.</w:t>
+        <w:t>The framework we used is intentionally general and falls within healthcare operations research and decision analytics. Specialty physician workforce allocation is a recurring healthcare decision problem, and the same sensitivity-analysis steps—rate adjustment to remove size confounding, measured-only panels to avoid interpolation, equivalence testing with policy-relevant margins, and small-cluster inference—can be applied to other proposed levers, such as fee schedules, regional quotas, or training subsidies. The analytic contribution is therefore not the malpractice finding itself but a transparent, reproducible decision-support workflow that helps planners distinguish meaningful workforce effects from spurious count- or interpolation-based associations.</w:t>
       </w:r>
     </w:p>
     <w:p>

</xml_diff>

<commit_message>
Regenerate HA and BPP submission outputs with coverage table
Co-Authored-By: Tatsuki Onishi <bougtoir@gmail.com>
</commit_message>
<xml_diff>
--- a/medical_accident_its_analysis/manuscript/ha_manuscript_en.docx
+++ b/medical_accident_its_analysis/manuscript/ha_manuscript_en.docx
@@ -315,6 +315,27 @@
           <w:i w:val="0"/>
           <w:sz w:val="24"/>
         </w:rPr>
+        <w:t>As context for the specialty-training pipeline, first-year specialist-trainee (senkoi) counts in 2018 and counts of physicians 3–5 years after medical registration in 2014 were summarised by specialty; coverage rates range widely across the 12 primary fields (Supplementary Table 8).</w:t>
+      </w:r>
+      <w:r>
+        <w:rPr>
+          <w:rFonts w:ascii="Times New Roman" w:hAnsi="Times New Roman"/>
+          <w:vertAlign w:val="superscript"/>
+        </w:rPr>
+        <w:t>[13-14]</w:t>
+      </w:r>
+    </w:p>
+    <w:p>
+      <w:pPr>
+        <w:spacing w:line="480" w:lineRule="auto" w:after="120"/>
+      </w:pPr>
+      <w:r>
+        <w:rPr>
+          <w:rFonts w:ascii="Times New Roman" w:hAnsi="Times New Roman"/>
+          <w:b w:val="0"/>
+          <w:i w:val="0"/>
+          <w:sz w:val="24"/>
+        </w:rPr>
         <w:t>Physician counts use the principal specialty classification; broad categories were matched to the Supreme Court's specialty labels, and subspecialties were aggregated in code. Because the Court assigns multi-specialty cases to a single principal specialty and states that the counts do not represent the intrinsic risk of each specialty, we treat litigation as an exposure signal rather than a measure of incident risk.</w:t>
       </w:r>
       <w:r>
@@ -338,7 +359,7 @@
           <w:rFonts w:ascii="Times New Roman" w:hAnsi="Times New Roman"/>
           <w:vertAlign w:val="superscript"/>
         </w:rPr>
-        <w:t>[13]</w:t>
+        <w:t>[15]</w:t>
       </w:r>
       <w:r>
         <w:rPr>
@@ -380,7 +401,7 @@
           <w:rFonts w:ascii="Times New Roman" w:hAnsi="Times New Roman"/>
           <w:vertAlign w:val="superscript"/>
         </w:rPr>
-        <w:t>[14]</w:t>
+        <w:t>[16]</w:t>
       </w:r>
       <w:r>
         <w:rPr>
@@ -645,7 +666,7 @@
           <w:rFonts w:ascii="Times New Roman" w:hAnsi="Times New Roman"/>
           <w:vertAlign w:val="superscript"/>
         </w:rPr>
-        <w:t>[15]</w:t>
+        <w:t>[17]</w:t>
       </w:r>
       <w:r>
         <w:rPr>
@@ -3206,7 +3227,7 @@
           <w:rFonts w:ascii="Times New Roman" w:hAnsi="Times New Roman"/>
           <w:vertAlign w:val="superscript"/>
         </w:rPr>
-        <w:t>[13]</w:t>
+        <w:t>[15]</w:t>
       </w:r>
       <w:r>
         <w:rPr>
@@ -3371,7 +3392,7 @@
           <w:rFonts w:ascii="Times New Roman" w:hAnsi="Times New Roman"/>
           <w:vertAlign w:val="superscript"/>
         </w:rPr>
-        <w:t>[16-18]</w:t>
+        <w:t>[18-20]</w:t>
       </w:r>
     </w:p>
     <w:p>
@@ -3406,7 +3427,7 @@
           <w:rFonts w:ascii="Times New Roman" w:hAnsi="Times New Roman"/>
           <w:vertAlign w:val="superscript"/>
         </w:rPr>
-        <w:t>[19]</w:t>
+        <w:t>[21]</w:t>
       </w:r>
       <w:r>
         <w:rPr>
@@ -3422,7 +3443,7 @@
           <w:rFonts w:ascii="Times New Roman" w:hAnsi="Times New Roman"/>
           <w:vertAlign w:val="superscript"/>
         </w:rPr>
-        <w:t>[20]</w:t>
+        <w:t>[22]</w:t>
       </w:r>
       <w:r>
         <w:rPr>
@@ -3438,7 +3459,7 @@
           <w:rFonts w:ascii="Times New Roman" w:hAnsi="Times New Roman"/>
           <w:vertAlign w:val="superscript"/>
         </w:rPr>
-        <w:t>[21]</w:t>
+        <w:t>[23]</w:t>
       </w:r>
       <w:r>
         <w:rPr>
@@ -3468,7 +3489,7 @@
           <w:rFonts w:ascii="Times New Roman" w:hAnsi="Times New Roman"/>
           <w:vertAlign w:val="superscript"/>
         </w:rPr>
-        <w:t>[22]</w:t>
+        <w:t>[24]</w:t>
       </w:r>
       <w:r>
         <w:rPr>
@@ -3484,7 +3505,7 @@
           <w:rFonts w:ascii="Times New Roman" w:hAnsi="Times New Roman"/>
           <w:vertAlign w:val="superscript"/>
         </w:rPr>
-        <w:t>[23]</w:t>
+        <w:t>[25]</w:t>
       </w:r>
       <w:r>
         <w:rPr>
@@ -3514,7 +3535,7 @@
           <w:rFonts w:ascii="Times New Roman" w:hAnsi="Times New Roman"/>
           <w:vertAlign w:val="superscript"/>
         </w:rPr>
-        <w:t>[16-17]</w:t>
+        <w:t>[18-19]</w:t>
       </w:r>
       <w:r>
         <w:rPr>
@@ -3530,7 +3551,7 @@
           <w:rFonts w:ascii="Times New Roman" w:hAnsi="Times New Roman"/>
           <w:vertAlign w:val="superscript"/>
         </w:rPr>
-        <w:t>[18]</w:t>
+        <w:t>[20]</w:t>
       </w:r>
       <w:r>
         <w:rPr>
@@ -3560,7 +3581,7 @@
           <w:rFonts w:ascii="Times New Roman" w:hAnsi="Times New Roman"/>
           <w:vertAlign w:val="superscript"/>
         </w:rPr>
-        <w:t>[24]</w:t>
+        <w:t>[26]</w:t>
       </w:r>
       <w:r>
         <w:rPr>
@@ -3590,7 +3611,7 @@
           <w:rFonts w:ascii="Times New Roman" w:hAnsi="Times New Roman"/>
           <w:vertAlign w:val="superscript"/>
         </w:rPr>
-        <w:t>[25]</w:t>
+        <w:t>[27]</w:t>
       </w:r>
       <w:r>
         <w:rPr>
@@ -3606,7 +3627,7 @@
           <w:rFonts w:ascii="Times New Roman" w:hAnsi="Times New Roman"/>
           <w:vertAlign w:val="superscript"/>
         </w:rPr>
-        <w:t>[26]</w:t>
+        <w:t>[28]</w:t>
       </w:r>
       <w:r>
         <w:rPr>
@@ -3636,7 +3657,7 @@
           <w:rFonts w:ascii="Times New Roman" w:hAnsi="Times New Roman"/>
           <w:vertAlign w:val="superscript"/>
         </w:rPr>
-        <w:t>[27]</w:t>
+        <w:t>[29]</w:t>
       </w:r>
       <w:r>
         <w:rPr>
@@ -3652,7 +3673,7 @@
           <w:rFonts w:ascii="Times New Roman" w:hAnsi="Times New Roman"/>
           <w:vertAlign w:val="superscript"/>
         </w:rPr>
-        <w:t>[28]</w:t>
+        <w:t>[30]</w:t>
       </w:r>
       <w:r>
         <w:rPr>
@@ -3696,7 +3717,7 @@
           <w:rFonts w:ascii="Times New Roman" w:hAnsi="Times New Roman"/>
           <w:vertAlign w:val="superscript"/>
         </w:rPr>
-        <w:t>[29]</w:t>
+        <w:t>[31]</w:t>
       </w:r>
       <w:r>
         <w:rPr>
@@ -3712,7 +3733,7 @@
           <w:rFonts w:ascii="Times New Roman" w:hAnsi="Times New Roman"/>
           <w:vertAlign w:val="superscript"/>
         </w:rPr>
-        <w:t>[30]</w:t>
+        <w:t>[32]</w:t>
       </w:r>
       <w:r>
         <w:rPr>
@@ -3742,7 +3763,7 @@
           <w:rFonts w:ascii="Times New Roman" w:hAnsi="Times New Roman"/>
           <w:vertAlign w:val="superscript"/>
         </w:rPr>
-        <w:t>[31]</w:t>
+        <w:t>[33]</w:t>
       </w:r>
       <w:r>
         <w:rPr>
@@ -4053,7 +4074,7 @@
           <w:rFonts w:ascii="Times New Roman" w:hAnsi="Times New Roman"/>
           <w:sz w:val="20"/>
         </w:rPr>
-        <w:t>13. Act on the Promotion of Medical Safety; Medical Accident Investigation System (2015). Tokyo: MHLW; 2015.</w:t>
+        <w:t>13. Ministry of Health, Labour and Welfare. 新専門医制度における専攻医の採用状況等について（平成30年度新専門医制度スタートに向けて）. Tokyo: MHLW; 2018. Available from: https://www.mhlw.go.jp/content/10803000/000452411.pdf (accessed 15 August 2026).</w:t>
       </w:r>
     </w:p>
     <w:p>
@@ -4065,7 +4086,7 @@
           <w:rFonts w:ascii="Times New Roman" w:hAnsi="Times New Roman"/>
           <w:sz w:val="20"/>
         </w:rPr>
-        <w:t>14. Angrist JD, Pischke JS. Mostly Harmless Econometrics. Princeton: Princeton University Press; 2009.</w:t>
+        <w:t>14. Ministry of Health, Labour and Welfare. 医籍登録後３～５年目の医師数（主たる診療科別）. Tokyo: MHLW; 2015. Available from: https://www.mhlw.go.jp/file/06-Seisakujouhou-10800000-Iseikyoku/323.pdf (accessed 15 August 2026).</w:t>
       </w:r>
     </w:p>
     <w:p>
@@ -4077,7 +4098,7 @@
           <w:rFonts w:ascii="Times New Roman" w:hAnsi="Times New Roman"/>
           <w:sz w:val="20"/>
         </w:rPr>
-        <w:t>15. Cameron AC, Miller DL. A practitioner's guide to cluster-robust inference. J Hum Resour. 2015;50(2):317-372.</w:t>
+        <w:t>15. Act on the Promotion of Medical Safety; Medical Accident Investigation System (2015). Tokyo: MHLW; 2015.</w:t>
       </w:r>
     </w:p>
     <w:p>
@@ -4089,7 +4110,7 @@
           <w:rFonts w:ascii="Times New Roman" w:hAnsi="Times New Roman"/>
           <w:sz w:val="20"/>
         </w:rPr>
-        <w:t>16. Tversky A, Kahneman D. Availability: a heuristic for judging frequency and probability. Cogn Psychol. 1973;5(2):207-232.</w:t>
+        <w:t>16. Angrist JD, Pischke JS. Mostly Harmless Econometrics. Princeton: Princeton University Press; 2009.</w:t>
       </w:r>
     </w:p>
     <w:p>
@@ -4101,7 +4122,7 @@
           <w:rFonts w:ascii="Times New Roman" w:hAnsi="Times New Roman"/>
           <w:sz w:val="20"/>
         </w:rPr>
-        <w:t>17. Kahneman D, Tversky A. Prospect theory: an analysis of decision under risk. Econometrica. 1979;47(2):263-291.</w:t>
+        <w:t>17. Cameron AC, Miller DL. A practitioner's guide to cluster-robust inference. J Hum Resour. 2015;50(2):317-372.</w:t>
       </w:r>
     </w:p>
     <w:p>
@@ -4113,7 +4134,7 @@
           <w:rFonts w:ascii="Times New Roman" w:hAnsi="Times New Roman"/>
           <w:sz w:val="20"/>
         </w:rPr>
-        <w:t>18. Samuelson W, Zeckhauser R. Status quo bias in decision making. J Risk Uncertain. 1988;1(1):7-59.</w:t>
+        <w:t>18. Tversky A, Kahneman D. Availability: a heuristic for judging frequency and probability. Cogn Psychol. 1973;5(2):207-232.</w:t>
       </w:r>
     </w:p>
     <w:p>
@@ -4125,7 +4146,7 @@
           <w:rFonts w:ascii="Times New Roman" w:hAnsi="Times New Roman"/>
           <w:sz w:val="20"/>
         </w:rPr>
-        <w:t>19. Matsa DA. Does malpractice liability keep the doctor away? Evidence from tort reform damage caps. J Legal Stud. 2007;36(S2):S143-S182.</w:t>
+        <w:t>19. Kahneman D, Tversky A. Prospect theory: an analysis of decision under risk. Econometrica. 1979;47(2):263-291.</w:t>
       </w:r>
     </w:p>
     <w:p>
@@ -4137,7 +4158,7 @@
           <w:rFonts w:ascii="Times New Roman" w:hAnsi="Times New Roman"/>
           <w:sz w:val="20"/>
         </w:rPr>
-        <w:t>20. Hyman DA, Silver C, Black B, Paik M. Does tort reform affect physician supply? Evidence from Texas. Int Rev Law Econ. 2015;42:203-218.</w:t>
+        <w:t>20. Samuelson W, Zeckhauser R. Status quo bias in decision making. J Risk Uncertain. 1988;1(1):7-59.</w:t>
       </w:r>
     </w:p>
     <w:p>
@@ -4149,7 +4170,7 @@
           <w:rFonts w:ascii="Times New Roman" w:hAnsi="Times New Roman"/>
           <w:sz w:val="20"/>
         </w:rPr>
-        <w:t>21. Frakes MD, Frank MB, Seabury SA. The effect of malpractice law on physician supply: Evidence from negligence-standard reforms. J Health Econ. 2020;70:1-16.</w:t>
+        <w:t>21. Matsa DA. Does malpractice liability keep the doctor away? Evidence from tort reform damage caps. J Legal Stud. 2007;36(S2):S143-S182.</w:t>
       </w:r>
     </w:p>
     <w:p>
@@ -4161,7 +4182,7 @@
           <w:rFonts w:ascii="Times New Roman" w:hAnsi="Times New Roman"/>
           <w:sz w:val="20"/>
         </w:rPr>
-        <w:t>22. Kessler DP, McClellan MB. Do doctors practice defensive medicine?. Q J Econ. 1996;111(2):353-390.</w:t>
+        <w:t>22. Hyman DA, Silver C, Black B, Paik M. Does tort reform affect physician supply? Evidence from Texas. Int Rev Law Econ. 2015;42:203-218.</w:t>
       </w:r>
     </w:p>
     <w:p>
@@ -4173,7 +4194,7 @@
           <w:rFonts w:ascii="Times New Roman" w:hAnsi="Times New Roman"/>
           <w:sz w:val="20"/>
         </w:rPr>
-        <w:t>23. Sloan FA, Shadle JH. Is there empirical evidence for "Defensive Medicine"? A reassessment. J Health Econ. 2008;27(2):481-491.</w:t>
+        <w:t>23. Frakes MD, Frank MB, Seabury SA. The effect of malpractice law on physician supply: Evidence from negligence-standard reforms. J Health Econ. 2020;70:1-16.</w:t>
       </w:r>
     </w:p>
     <w:p>
@@ -4185,7 +4206,7 @@
           <w:rFonts w:ascii="Times New Roman" w:hAnsi="Times New Roman"/>
           <w:sz w:val="20"/>
         </w:rPr>
-        <w:t>24. Taniguchi K, Watari T, Nagoshi K. Characteristics and trends of medical malpractice claims in Japan between 2006 and 2021. PLoS One. 2023;18(12):e0296155.</w:t>
+        <w:t>24. Kessler DP, McClellan MB. Do doctors practice defensive medicine?. Q J Econ. 1996;111(2):353-390.</w:t>
       </w:r>
     </w:p>
     <w:p>
@@ -4197,7 +4218,7 @@
           <w:rFonts w:ascii="Times New Roman" w:hAnsi="Times New Roman"/>
           <w:sz w:val="20"/>
         </w:rPr>
-        <w:t>25. Hasegawa J, Toyokawa S, Ikenoue T, et al. Relevant obstetric factors for cerebral palsy: from the Nationwide Obstetric Compensation System in Japan. PLoS One. 2016;11(1):e0148122.</w:t>
+        <w:t>25. Sloan FA, Shadle JH. Is there empirical evidence for "Defensive Medicine"? A reassessment. J Health Econ. 2008;27(2):481-491.</w:t>
       </w:r>
     </w:p>
     <w:p>
@@ -4209,7 +4230,7 @@
           <w:rFonts w:ascii="Times New Roman" w:hAnsi="Times New Roman"/>
           <w:sz w:val="20"/>
         </w:rPr>
-        <w:t>26. Morita H. Criminal prosecution and physician supply. Int Rev Law Econ. 2018;55:1-11.</w:t>
+        <w:t>26. Taniguchi K, Watari T, Nagoshi K. Characteristics and trends of medical malpractice claims in Japan between 2006 and 2021. PLoS One. 2023;18(12):e0296155.</w:t>
       </w:r>
     </w:p>
     <w:p>
@@ -4221,7 +4242,7 @@
           <w:rFonts w:ascii="Times New Roman" w:hAnsi="Times New Roman"/>
           <w:sz w:val="20"/>
         </w:rPr>
-        <w:t>27. Kamijo K, Wada Y, Ishida K, Warsof SL, Saade G, Kawakita T. Medical-legal claims in obstetrics and gynecology: Japan versus the United States. J Healthc Risk Manag. 2025;44(4):5-11. doi:10.1002/jhrm.70001.</w:t>
+        <w:t>27. Hasegawa J, Toyokawa S, Ikenoue T, et al. Relevant obstetric factors for cerebral palsy: from the Nationwide Obstetric Compensation System in Japan. PLoS One. 2016;11(1):e0148122.</w:t>
       </w:r>
     </w:p>
     <w:p>
@@ -4233,7 +4254,7 @@
           <w:rFonts w:ascii="Times New Roman" w:hAnsi="Times New Roman"/>
           <w:sz w:val="20"/>
         </w:rPr>
-        <w:t>28. Lin PL, Huang JP, Fujii T, Cho EH, Huang MC. A survey of specialty choice among obstetrics and gynecology residents in Japan, Korea, and Taiwan. J Obstet Gynaecol Res. 2022;48(7):1968-1977.</w:t>
+        <w:t>28. Morita H. Criminal prosecution and physician supply. Int Rev Law Econ. 2018;55:1-11.</w:t>
       </w:r>
     </w:p>
     <w:p>
@@ -4245,7 +4266,7 @@
           <w:rFonts w:ascii="Times New Roman" w:hAnsi="Times New Roman"/>
           <w:sz w:val="20"/>
         </w:rPr>
-        <w:t>29. Bismark M, Paterson R. No-fault compensation in New Zealand: harmonizing injury compensation, provider accountability, and patient safety. Health Aff. 2006;25(1):278-286.</w:t>
+        <w:t>29. Kamijo K, Wada Y, Ishida K, Warsof SL, Saade G, Kawakita T. Medical-legal claims in obstetrics and gynecology: Japan versus the United States. J Healthc Risk Manag. 2025;44(4):5-11. doi:10.1002/jhrm.70001.</w:t>
       </w:r>
     </w:p>
     <w:p>
@@ -4257,7 +4278,7 @@
           <w:rFonts w:ascii="Times New Roman" w:hAnsi="Times New Roman"/>
           <w:sz w:val="20"/>
         </w:rPr>
-        <w:t>30. Mello MM, Kachalia A, Studdert DM. Administrative compensation for medical injuries: lessons from three foreign systems. New York: The Commonwealth Fund; 2011.</w:t>
+        <w:t>30. Lin PL, Huang JP, Fujii T, Cho EH, Huang MC. A survey of specialty choice among obstetrics and gynecology residents in Japan, Korea, and Taiwan. J Obstet Gynaecol Res. 2022;48(7):1968-1977.</w:t>
       </w:r>
     </w:p>
     <w:p>
@@ -4269,7 +4290,31 @@
           <w:rFonts w:ascii="Times New Roman" w:hAnsi="Times New Roman"/>
           <w:sz w:val="20"/>
         </w:rPr>
-        <w:t>31. Helland E, Seabury SA. Tort reform and physician labor supply: a review of the evidence. Int Rev Law Econ. 2015;42:192-202.</w:t>
+        <w:t>31. Bismark M, Paterson R. No-fault compensation in New Zealand: harmonizing injury compensation, provider accountability, and patient safety. Health Aff. 2006;25(1):278-286.</w:t>
+      </w:r>
+    </w:p>
+    <w:p>
+      <w:pPr>
+        <w:spacing w:line="360" w:lineRule="auto"/>
+      </w:pPr>
+      <w:r>
+        <w:rPr>
+          <w:rFonts w:ascii="Times New Roman" w:hAnsi="Times New Roman"/>
+          <w:sz w:val="20"/>
+        </w:rPr>
+        <w:t>32. Mello MM, Kachalia A, Studdert DM. Administrative compensation for medical injuries: lessons from three foreign systems. New York: The Commonwealth Fund; 2011.</w:t>
+      </w:r>
+    </w:p>
+    <w:p>
+      <w:pPr>
+        <w:spacing w:line="360" w:lineRule="auto"/>
+      </w:pPr>
+      <w:r>
+        <w:rPr>
+          <w:rFonts w:ascii="Times New Roman" w:hAnsi="Times New Roman"/>
+          <w:sz w:val="20"/>
+        </w:rPr>
+        <w:t>33. Helland E, Seabury SA. Tort reform and physician labor supply: a review of the evidence. Int Rev Law Econ. 2015;42:192-202.</w:t>
       </w:r>
     </w:p>
     <w:sectPr>

</xml_diff>